<commit_message>
Refresh Unit 12 portfolio submission
</commit_message>
<xml_diff>
--- a/Module 5 Intelligent Agent Unit 12 - Individual e-Portfolio Submission.docx
+++ b/Module 5 Intelligent Agent Unit 12 - Individual e-Portfolio Submission.docx
@@ -8,11 +8,11 @@
         <w:pBdr>
           <w:bottom w:val="nil"/>
         </w:pBdr>
+        <w:spacing w:after="0" w:line="480" w:lineRule="auto"/>
         <w:jc w:val="center"/>
         <w:rPr>
           <w:rFonts w:ascii="Arial" w:hAnsi="Arial" w:cs="Arial"/>
           <w:color w:val="000000" w:themeColor="text1"/>
-          <w:sz w:val="24"/>
           <w:szCs w:val="24"/>
         </w:rPr>
       </w:pPr>
@@ -23,11 +23,11 @@
         <w:pBdr>
           <w:bottom w:val="nil"/>
         </w:pBdr>
+        <w:spacing w:after="0" w:line="480" w:lineRule="auto"/>
         <w:jc w:val="center"/>
         <w:rPr>
           <w:rFonts w:ascii="Arial" w:hAnsi="Arial" w:cs="Arial"/>
           <w:color w:val="000000" w:themeColor="text1"/>
-          <w:sz w:val="24"/>
           <w:szCs w:val="24"/>
         </w:rPr>
       </w:pPr>
@@ -38,11 +38,11 @@
         <w:pBdr>
           <w:bottom w:val="nil"/>
         </w:pBdr>
+        <w:spacing w:after="0" w:line="480" w:lineRule="auto"/>
         <w:jc w:val="center"/>
         <w:rPr>
           <w:rFonts w:ascii="Arial" w:hAnsi="Arial" w:cs="Arial"/>
           <w:color w:val="000000" w:themeColor="text1"/>
-          <w:sz w:val="24"/>
           <w:szCs w:val="24"/>
         </w:rPr>
       </w:pPr>
@@ -53,11 +53,11 @@
         <w:pBdr>
           <w:bottom w:val="nil"/>
         </w:pBdr>
+        <w:spacing w:after="0" w:line="480" w:lineRule="auto"/>
         <w:jc w:val="center"/>
         <w:rPr>
           <w:rFonts w:ascii="Arial" w:hAnsi="Arial" w:cs="Arial"/>
           <w:color w:val="000000" w:themeColor="text1"/>
-          <w:sz w:val="24"/>
           <w:szCs w:val="24"/>
         </w:rPr>
       </w:pPr>
@@ -68,11 +68,11 @@
         <w:pBdr>
           <w:bottom w:val="nil"/>
         </w:pBdr>
+        <w:spacing w:after="0" w:line="480" w:lineRule="auto"/>
         <w:jc w:val="center"/>
         <w:rPr>
           <w:rFonts w:ascii="Arial" w:hAnsi="Arial" w:cs="Arial"/>
           <w:color w:val="000000" w:themeColor="text1"/>
-          <w:sz w:val="24"/>
           <w:szCs w:val="24"/>
         </w:rPr>
       </w:pPr>
@@ -83,11 +83,11 @@
         <w:pBdr>
           <w:bottom w:val="nil"/>
         </w:pBdr>
+        <w:spacing w:after="0" w:line="480" w:lineRule="auto"/>
         <w:jc w:val="center"/>
         <w:rPr>
           <w:rFonts w:ascii="Arial" w:hAnsi="Arial" w:cs="Arial"/>
           <w:color w:val="000000" w:themeColor="text1"/>
-          <w:sz w:val="24"/>
           <w:szCs w:val="24"/>
         </w:rPr>
       </w:pPr>
@@ -98,11 +98,11 @@
         <w:pBdr>
           <w:bottom w:val="nil"/>
         </w:pBdr>
+        <w:spacing w:after="0" w:line="480" w:lineRule="auto"/>
         <w:jc w:val="center"/>
         <w:rPr>
           <w:rFonts w:ascii="Arial" w:hAnsi="Arial" w:cs="Arial"/>
           <w:color w:val="000000" w:themeColor="text1"/>
-          <w:sz w:val="24"/>
           <w:szCs w:val="24"/>
         </w:rPr>
       </w:pPr>
@@ -113,11 +113,11 @@
         <w:pBdr>
           <w:bottom w:val="nil"/>
         </w:pBdr>
+        <w:spacing w:after="0" w:line="480" w:lineRule="auto"/>
         <w:jc w:val="center"/>
         <w:rPr>
           <w:rFonts w:ascii="Arial" w:hAnsi="Arial" w:cs="Arial"/>
           <w:color w:val="000000" w:themeColor="text1"/>
-          <w:sz w:val="24"/>
           <w:szCs w:val="24"/>
         </w:rPr>
       </w:pPr>
@@ -128,12 +128,11 @@
         <w:pBdr>
           <w:bottom w:val="nil"/>
         </w:pBdr>
-        <w:spacing w:line="480" w:lineRule="auto"/>
+        <w:spacing w:after="0" w:line="480" w:lineRule="auto"/>
         <w:jc w:val="center"/>
         <w:rPr>
           <w:rFonts w:ascii="Arial" w:hAnsi="Arial" w:cs="Arial"/>
           <w:color w:val="000000" w:themeColor="text1"/>
-          <w:sz w:val="24"/>
           <w:szCs w:val="24"/>
         </w:rPr>
       </w:pPr>
@@ -144,12 +143,11 @@
         <w:pBdr>
           <w:bottom w:val="nil"/>
         </w:pBdr>
-        <w:spacing w:line="480" w:lineRule="auto"/>
+        <w:spacing w:after="0" w:line="480" w:lineRule="auto"/>
         <w:jc w:val="center"/>
         <w:rPr>
           <w:rFonts w:ascii="Arial" w:hAnsi="Arial" w:cs="Arial"/>
           <w:color w:val="000000" w:themeColor="text1"/>
-          <w:sz w:val="24"/>
           <w:szCs w:val="24"/>
         </w:rPr>
       </w:pPr>
@@ -160,12 +158,11 @@
         <w:pBdr>
           <w:bottom w:val="nil"/>
         </w:pBdr>
-        <w:spacing w:line="480" w:lineRule="auto"/>
+        <w:spacing w:after="0" w:line="480" w:lineRule="auto"/>
         <w:jc w:val="center"/>
         <w:rPr>
           <w:rFonts w:ascii="Arial" w:hAnsi="Arial" w:cs="Arial"/>
           <w:color w:val="000000" w:themeColor="text1"/>
-          <w:sz w:val="24"/>
           <w:szCs w:val="24"/>
         </w:rPr>
       </w:pPr>
@@ -176,38 +173,34 @@
         <w:pBdr>
           <w:bottom w:val="nil"/>
         </w:pBdr>
-        <w:spacing w:line="480" w:lineRule="auto"/>
+        <w:spacing w:after="0" w:line="480" w:lineRule="auto"/>
         <w:jc w:val="center"/>
         <w:rPr>
           <w:rFonts w:ascii="Arial" w:hAnsi="Arial" w:cs="Arial"/>
           <w:color w:val="000000" w:themeColor="text1"/>
-          <w:sz w:val="24"/>
           <w:szCs w:val="24"/>
         </w:rPr>
       </w:pPr>
       <w:r>
         <w:rPr>
-          <w:rFonts w:ascii="Arial" w:hAnsi="Arial" w:cs="Arial"/>
+          <w:rFonts w:ascii="Arial" w:eastAsia="Arial" w:hAnsi="Arial" w:cs="Arial"/>
           <w:color w:val="000000" w:themeColor="text1"/>
-          <w:sz w:val="24"/>
           <w:szCs w:val="24"/>
         </w:rPr>
         <w:t xml:space="preserve">Module 5: </w:t>
       </w:r>
       <w:r>
         <w:rPr>
-          <w:rFonts w:ascii="Arial" w:hAnsi="Arial" w:cs="Arial"/>
+          <w:rFonts w:ascii="Arial" w:eastAsia="Arial" w:hAnsi="Arial" w:cs="Arial"/>
           <w:color w:val="000000" w:themeColor="text1"/>
-          <w:sz w:val="24"/>
           <w:szCs w:val="24"/>
         </w:rPr>
         <w:t>Intelligent Agents</w:t>
       </w:r>
       <w:r>
         <w:rPr>
-          <w:rFonts w:ascii="Arial" w:hAnsi="Arial" w:cs="Arial"/>
+          <w:rFonts w:ascii="Arial" w:eastAsia="Arial" w:hAnsi="Arial" w:cs="Arial"/>
           <w:color w:val="000000" w:themeColor="text1"/>
-          <w:sz w:val="24"/>
           <w:szCs w:val="24"/>
         </w:rPr>
         <w:br/>
@@ -220,20 +213,18 @@
         <w:pBdr>
           <w:bottom w:val="nil"/>
         </w:pBdr>
-        <w:spacing w:line="480" w:lineRule="auto"/>
+        <w:spacing w:after="0" w:line="480" w:lineRule="auto"/>
         <w:jc w:val="center"/>
         <w:rPr>
           <w:rFonts w:ascii="Arial" w:hAnsi="Arial" w:cs="Arial"/>
           <w:color w:val="000000" w:themeColor="text1"/>
-          <w:sz w:val="24"/>
           <w:szCs w:val="24"/>
         </w:rPr>
       </w:pPr>
       <w:r>
         <w:rPr>
-          <w:rFonts w:ascii="Arial" w:hAnsi="Arial" w:cs="Arial"/>
+          <w:rFonts w:ascii="Arial" w:eastAsia="Arial" w:hAnsi="Arial" w:cs="Arial"/>
           <w:color w:val="000000" w:themeColor="text1"/>
-          <w:sz w:val="24"/>
           <w:szCs w:val="24"/>
         </w:rPr>
         <w:t>University of Essex Online</w:t>
@@ -245,30 +236,27 @@
         <w:pBdr>
           <w:bottom w:val="nil"/>
         </w:pBdr>
-        <w:spacing w:line="480" w:lineRule="auto"/>
+        <w:spacing w:after="0" w:line="480" w:lineRule="auto"/>
         <w:jc w:val="center"/>
         <w:rPr>
           <w:rFonts w:ascii="Arial" w:hAnsi="Arial" w:cs="Arial"/>
           <w:color w:val="000000" w:themeColor="text1"/>
-          <w:sz w:val="24"/>
           <w:szCs w:val="24"/>
         </w:rPr>
       </w:pPr>
       <w:r>
         <w:rPr>
-          <w:rFonts w:ascii="Arial" w:hAnsi="Arial" w:cs="Arial"/>
+          <w:rFonts w:ascii="Arial" w:eastAsia="Arial" w:hAnsi="Arial" w:cs="Arial"/>
           <w:b w:val="0"/>
           <w:color w:val="000000" w:themeColor="text1"/>
-          <w:sz w:val="24"/>
           <w:szCs w:val="24"/>
         </w:rPr>
         <w:t xml:space="preserve">Student ID: </w:t>
       </w:r>
       <w:r>
         <w:rPr>
-          <w:rFonts w:ascii="Arial" w:hAnsi="Arial" w:cs="Arial"/>
+          <w:rFonts w:ascii="Arial" w:eastAsia="Arial" w:hAnsi="Arial" w:cs="Arial"/>
           <w:color w:val="000000" w:themeColor="text1"/>
-          <w:sz w:val="24"/>
           <w:szCs w:val="24"/>
         </w:rPr>
         <w:t>36932</w:t>
@@ -280,53 +268,49 @@
         <w:pBdr>
           <w:bottom w:val="nil"/>
         </w:pBdr>
-        <w:spacing w:line="480" w:lineRule="auto"/>
+        <w:spacing w:after="0" w:line="480" w:lineRule="auto"/>
         <w:jc w:val="center"/>
         <w:rPr>
           <w:rFonts w:ascii="Arial" w:hAnsi="Arial" w:cs="Arial"/>
           <w:b w:val="0"/>
           <w:bCs/>
           <w:color w:val="000000" w:themeColor="text1"/>
-          <w:sz w:val="24"/>
           <w:szCs w:val="24"/>
         </w:rPr>
       </w:pPr>
       <w:r>
+        <w:rPr>
+          <w:rFonts w:ascii="Arial" w:eastAsia="Arial" w:hAnsi="Arial" w:cs="Arial"/>
+          <w:b w:val="0"/>
+          <w:bCs/>
+          <w:color w:val="000000" w:themeColor="text1"/>
+          <w:szCs w:val="24"/>
+        </w:rPr>
+        <w:t>Final Module Assignment – Unit 12</w:t>
+      </w:r>
+    </w:p>
+    <w:p>
+      <w:pPr>
+        <w:pStyle w:val="Title"/>
+        <w:pBdr>
+          <w:bottom w:val="nil"/>
+        </w:pBdr>
+        <w:spacing w:after="0" w:line="480" w:lineRule="auto"/>
+        <w:jc w:val="center"/>
         <w:rPr>
           <w:rFonts w:ascii="Arial" w:hAnsi="Arial" w:cs="Arial"/>
           <w:b w:val="0"/>
           <w:bCs/>
           <w:color w:val="000000" w:themeColor="text1"/>
-          <w:sz w:val="24"/>
           <w:szCs w:val="24"/>
         </w:rPr>
-        <w:t>Final Module Assignment – Unit 12</w:t>
-      </w:r>
-    </w:p>
-    <w:p>
-      <w:pPr>
-        <w:pStyle w:val="Title"/>
-        <w:pBdr>
-          <w:bottom w:val="nil"/>
-        </w:pBdr>
-        <w:spacing w:line="480" w:lineRule="auto"/>
-        <w:jc w:val="center"/>
-        <w:rPr>
-          <w:rFonts w:ascii="Arial" w:hAnsi="Arial" w:cs="Arial"/>
+      </w:pPr>
+      <w:r>
+        <w:rPr>
+          <w:rFonts w:ascii="Arial" w:eastAsia="Arial" w:hAnsi="Arial" w:cs="Arial"/>
           <w:b w:val="0"/>
           <w:bCs/>
           <w:color w:val="000000" w:themeColor="text1"/>
-          <w:sz w:val="24"/>
-          <w:szCs w:val="24"/>
-        </w:rPr>
-      </w:pPr>
-      <w:r>
-        <w:rPr>
-          <w:rFonts w:ascii="Arial" w:hAnsi="Arial" w:cs="Arial"/>
-          <w:b w:val="0"/>
-          <w:bCs/>
-          <w:color w:val="000000" w:themeColor="text1"/>
-          <w:sz w:val="24"/>
           <w:szCs w:val="24"/>
         </w:rPr>
         <w:t xml:space="preserve">e-Portfolio URL: </w:t>
@@ -338,40 +322,18 @@
             <w:b w:val="0"/>
             <w:bCs/>
             <w:color w:val="000000" w:themeColor="text1"/>
-            <w:sz w:val="24"/>
             <w:szCs w:val="24"/>
             <w:u w:val="single"/>
           </w:rPr>
-          <w:t>https://ie25073.gith</w:t>
-        </w:r>
-        <w:r>
-          <w:rPr>
-            <w:rFonts w:ascii="Arial" w:hAnsi="Arial" w:cs="Arial"/>
-            <w:b w:val="0"/>
-            <w:bCs/>
-            <w:color w:val="000000" w:themeColor="text1"/>
-            <w:sz w:val="24"/>
-            <w:szCs w:val="24"/>
-            <w:u w:val="single"/>
-          </w:rPr>
-          <w:t>u</w:t>
-        </w:r>
-        <w:r>
-          <w:rPr>
-            <w:rFonts w:ascii="Arial" w:hAnsi="Arial" w:cs="Arial"/>
-            <w:b w:val="0"/>
-            <w:bCs/>
-            <w:color w:val="000000" w:themeColor="text1"/>
-            <w:sz w:val="24"/>
-            <w:szCs w:val="24"/>
-            <w:u w:val="single"/>
-          </w:rPr>
-          <w:t>b.io/</w:t>
+          <w:t>https://ie25073.github.io/</w:t>
         </w:r>
       </w:hyperlink>
       <w:r>
-        <w:rPr>
-          <w:rFonts w:cs="Arial"/>
+        <w:t xml:space="preserve"> </w:t>
+      </w:r>
+      <w:r>
+        <w:rPr>
+          <w:rFonts w:ascii="Arial" w:eastAsia="Arial" w:hAnsi="Arial" w:cs="Arial"/>
           <w:b w:val="0"/>
           <w:bCs/>
           <w:color w:val="000000" w:themeColor="text1"/>
@@ -379,16 +341,6 @@
         </w:rPr>
         <w:t xml:space="preserve"> </w:t>
       </w:r>
-      <w:r>
-        <w:rPr>
-          <w:rFonts w:cs="Arial"/>
-          <w:b w:val="0"/>
-          <w:bCs/>
-          <w:color w:val="000000" w:themeColor="text1"/>
-          <w:szCs w:val="24"/>
-        </w:rPr>
-        <w:t xml:space="preserve">  </w:t>
-      </w:r>
     </w:p>
     <w:p>
       <w:pPr>
@@ -410,19 +362,17 @@
     <w:p>
       <w:pPr>
         <w:pStyle w:val="Heading1"/>
-        <w:spacing w:before="120" w:after="120"/>
+        <w:spacing w:before="0"/>
         <w:rPr>
           <w:rFonts w:ascii="Arial" w:hAnsi="Arial" w:cs="Arial"/>
           <w:color w:val="000000" w:themeColor="text1"/>
-          <w:sz w:val="24"/>
           <w:szCs w:val="24"/>
         </w:rPr>
       </w:pPr>
       <w:r>
         <w:rPr>
-          <w:rFonts w:ascii="Arial" w:hAnsi="Arial" w:cs="Arial"/>
+          <w:rFonts w:ascii="Arial" w:eastAsia="Arial" w:hAnsi="Arial" w:cs="Arial"/>
           <w:color w:val="000000" w:themeColor="text1"/>
-          <w:sz w:val="24"/>
           <w:szCs w:val="24"/>
         </w:rPr>
         <w:lastRenderedPageBreak/>
@@ -432,19 +382,17 @@
     <w:p>
       <w:pPr>
         <w:pStyle w:val="Heading2"/>
-        <w:spacing w:before="120"/>
+        <w:spacing w:before="0"/>
         <w:rPr>
           <w:rFonts w:ascii="Arial" w:hAnsi="Arial" w:cs="Arial"/>
           <w:color w:val="000000" w:themeColor="text1"/>
-          <w:sz w:val="24"/>
           <w:szCs w:val="24"/>
         </w:rPr>
       </w:pPr>
       <w:r>
         <w:rPr>
-          <w:rFonts w:ascii="Arial" w:hAnsi="Arial" w:cs="Arial"/>
+          <w:rFonts w:ascii="Arial" w:eastAsia="Arial" w:hAnsi="Arial" w:cs="Arial"/>
           <w:color w:val="000000" w:themeColor="text1"/>
-          <w:sz w:val="24"/>
           <w:szCs w:val="24"/>
         </w:rPr>
         <w:t>Learning journey and evidence</w:t>
@@ -478,12 +426,40 @@
         </w:rPr>
       </w:pPr>
       <w:r>
+        <w:t>Units 5</w:t>
+      </w:r>
+      <w:r>
+        <w:t xml:space="preserve"> – 7</w:t>
+      </w:r>
+      <w:r>
+        <w:t xml:space="preserve"> moved from agent architecture to communication. My forum work compared KQML with conventional method invocation. KQML can express communicative intent while preserving internal autonomy, whereas a Python or Java call is simpler and faster inside a stable component. The Alice and Bob exercise converted theory into executable Python: KQML performatives represent the dialogue act, KIF represents warehouse facts, and conversation and reply identifiers preserve context. Tests cover valid replies and an unknown-stock failure. The exercise also exposed a limitation: syntactically valid messages do not guarantee shared meaning. My summary therefore argues for ontology versioning, bounded conversations and recoverable failures rather than treating an agent communication language as sufficient for interoperability.</w:t>
+      </w:r>
+    </w:p>
+    <w:p>
+      <w:pPr>
+        <w:jc w:val="both"/>
         <w:rPr>
           <w:rFonts w:cs="Arial"/>
           <w:color w:val="000000" w:themeColor="text1"/>
           <w:szCs w:val="24"/>
         </w:rPr>
-        <w:t>Units 5–7 moved from agent architecture to communication. My forum work compared KQML with conventional method invocation. KQML can express communicative intent while preserving internal autonomy, whereas a Python or Java call is simpler and faster inside a stable component. The Alice and Bob exercise converted theory into executable Python: KQML performatives represent the dialogue act, KIF represents warehouse facts, and conversation and reply identifiers preserve context. Tests cover valid replies and an unknown-stock failure. The exercise also exposed a limitation: syntactically valid messages do not guarantee shared meaning. My summary therefore argues for ontology versioning, bounded conversations and recoverable failures rather than treating an agent communication language as sufficient interoperability.</w:t>
+      </w:pPr>
+      <w:r>
+        <w:rPr>
+          <w:rFonts w:cs="Arial"/>
+          <w:color w:val="000000" w:themeColor="text1"/>
+          <w:szCs w:val="24"/>
+        </w:rPr>
+        <w:t>The Unit 8 constituency exercise strengthened my understanding of representation. Two parse trees for “The man saw the dog with the telescope” encode different prepositional-</w:t>
+      </w:r>
+      <w:r>
+        <w:rPr>
+          <w:rFonts w:cs="Arial"/>
+          <w:color w:val="000000" w:themeColor="text1"/>
+          <w:szCs w:val="24"/>
+        </w:rPr>
+        <w:lastRenderedPageBreak/>
+        <w:t>phrase attachments. An agent selecting one interpretation from syntax alone may act on the wrong meaning; semantic and contextual evidence is required. This small task connects directly to the final project, where a plausible title or abstract is not automatically relevant evidence.</w:t>
       </w:r>
     </w:p>
     <w:p>
@@ -496,48 +472,23 @@
         </w:rPr>
       </w:pPr>
       <w:r>
-        <w:rPr>
-          <w:rFonts w:cs="Arial"/>
-          <w:color w:val="000000" w:themeColor="text1"/>
-          <w:szCs w:val="24"/>
-        </w:rPr>
-        <w:lastRenderedPageBreak/>
-        <w:t>The Unit 8 constituency exercise strengthened my understanding of representation. Two parse trees for “The man saw the dog with the telescope” encode different prepositional-phrase attachments. An agent selecting one interpretation from syntax alone may act on the wrong meaning; semantic and contextual evidence is required. This small task connects directly to the final project, where a plausible title or abstract is not automatically relevant evidence.</w:t>
+        <w:t>Units 9–11 focused on deep learning, ethics and deployment. My discussion traced risks including confabulation, bias, privacy, intellectual property and over-reliance. Peer responses broadened my initial output-focused view into a lifecycle perspective involving representative evaluation, provenance, human review and continuing monitoring (National Institute of Standards and Technology (NIST), 2024). The additional activity applied this directly to fabricated academic citations, defining publication-identity and claim-support checks rather than relying on fluent output.</w:t>
       </w:r>
     </w:p>
     <w:p>
       <w:pPr>
-        <w:jc w:val="both"/>
-        <w:rPr>
-          <w:rFonts w:cs="Arial"/>
+        <w:pStyle w:val="Heading2"/>
+        <w:spacing w:before="0"/>
+        <w:rPr>
+          <w:rFonts w:ascii="Arial" w:hAnsi="Arial" w:cs="Arial"/>
           <w:color w:val="000000" w:themeColor="text1"/>
           <w:szCs w:val="24"/>
         </w:rPr>
       </w:pPr>
       <w:r>
         <w:rPr>
-          <w:rFonts w:cs="Arial"/>
+          <w:rFonts w:ascii="Arial" w:eastAsia="Arial" w:hAnsi="Arial" w:cs="Arial"/>
           <w:color w:val="000000" w:themeColor="text1"/>
-          <w:szCs w:val="24"/>
-        </w:rPr>
-        <w:t>Units 9–11 focused on deep learning, ethics and deployment. My discussion traced risks including confabulation, bias, privacy, intellectual property and over-reliance. Peer responses broadened my initial output-focused view into a lifecycle perspective involving representative evaluation, provenance, human review and continuing monitoring (NIST, 2024). The additional activity applied this directly to fabricated academic citations, defining publication-identity and claim-support checks rather than relying on fluent output.</w:t>
-      </w:r>
-    </w:p>
-    <w:p>
-      <w:pPr>
-        <w:pStyle w:val="Heading2"/>
-        <w:rPr>
-          <w:rFonts w:ascii="Arial" w:hAnsi="Arial" w:cs="Arial"/>
-          <w:color w:val="000000" w:themeColor="text1"/>
-          <w:sz w:val="24"/>
-          <w:szCs w:val="24"/>
-        </w:rPr>
-      </w:pPr>
-      <w:r>
-        <w:rPr>
-          <w:rFonts w:ascii="Arial" w:hAnsi="Arial" w:cs="Arial"/>
-          <w:color w:val="000000" w:themeColor="text1"/>
-          <w:sz w:val="24"/>
           <w:szCs w:val="24"/>
         </w:rPr>
         <w:t>Evidence of collaboration and individual contribution</w:t>
@@ -553,38 +504,27 @@
         </w:rPr>
       </w:pPr>
       <w:r>
-        <w:rPr>
-          <w:rFonts w:cs="Arial"/>
-          <w:color w:val="000000" w:themeColor="text1"/>
-          <w:szCs w:val="24"/>
-        </w:rPr>
-        <w:t xml:space="preserve">My Group C contribution focused on development methodology and the selection of frameworks, APIs and models. I initially proposed Agile prototyping, SQLite and named development tools. Team discussion challenged whether those choices belonged in the architecture and whether they were proportionate to a lightweight academic prototype. I revised my contribution to an architecture-first design, supported replacing SQLite with JSON, removed tooling from the architectural requirements and helped make the LLM layer provider-agnostic. This shows individual contribution through revision rather than ownership of a fixed idea. The supporting team-discussion reflection, peer-evaluation record and methodology/tools contribution in the e-portfolio provide an auditable record </w:t>
+        <w:t xml:space="preserve">My Group C contribution focused on development methodology and the selection of frameworks, APIs and models. I initially proposed Agile prototyping, SQLite and named development tools. Team discussion challenged whether those choices belonged in the architecture and whether they were proportionate to a lightweight academic prototype. I revised my contribution to an architecture-first design, supported replacing SQLite with JSON, removed tooling from the architectural requirements and helped make the LLM layer provider-agnostic. This shows individual contribution through revision rather than ownership of a fixed idea. The supporting team-discussion reflection, peer-evaluation record and methodology/tools contribution in the e-portfolio provide an auditable record of participation. The experience also exposed a weakness in my original approach: I had treated familiar technologies as if they were requirements. The collaborative review forced me to separate the problem, architectural responsibilities and implementation </w:t>
       </w:r>
       <w:r>
-        <w:rPr>
-          <w:rFonts w:cs="Arial"/>
-          <w:color w:val="000000" w:themeColor="text1"/>
-          <w:szCs w:val="24"/>
-        </w:rPr>
         <w:lastRenderedPageBreak/>
-        <w:t>of participation. The experience also exposed a weakness in my original approach: I had treated familiar technologies as if they were requirements. The collaborative review forced me to separate the problem, architectural responsibilities and implementation choices, which made later individual implementation more disciplined and easier to test.</w:t>
+        <w:t>choices, which made later individual implementation more disciplined and easier to test (see Appendix B).</w:t>
       </w:r>
     </w:p>
     <w:p>
       <w:pPr>
         <w:pStyle w:val="Heading2"/>
+        <w:spacing w:before="0"/>
         <w:rPr>
           <w:rFonts w:ascii="Arial" w:hAnsi="Arial" w:cs="Arial"/>
           <w:color w:val="000000" w:themeColor="text1"/>
-          <w:sz w:val="24"/>
           <w:szCs w:val="24"/>
         </w:rPr>
       </w:pPr>
       <w:r>
         <w:rPr>
-          <w:rFonts w:ascii="Arial" w:hAnsi="Arial" w:cs="Arial"/>
+          <w:rFonts w:ascii="Arial" w:eastAsia="Arial" w:hAnsi="Arial" w:cs="Arial"/>
           <w:color w:val="000000" w:themeColor="text1"/>
-          <w:sz w:val="24"/>
           <w:szCs w:val="24"/>
         </w:rPr>
         <w:t>From Week 7 Design to Week 11 Implementation</w:t>
@@ -600,12 +540,47 @@
         </w:rPr>
       </w:pPr>
       <w:r>
+        <w:t>The Week 7 design proposed four specialist responsibilities—planning, retrieval, processing and storage</w:t>
+      </w:r>
+      <w:r>
+        <w:t xml:space="preserve"> </w:t>
+      </w:r>
+      <w:r>
+        <w:t xml:space="preserve">with </w:t>
+      </w:r>
+      <w:proofErr w:type="spellStart"/>
+      <w:r>
+        <w:t>LangGraph</w:t>
+      </w:r>
+      <w:proofErr w:type="spellEnd"/>
+      <w:r>
+        <w:t xml:space="preserve">, </w:t>
+      </w:r>
+      <w:proofErr w:type="spellStart"/>
+      <w:r>
+        <w:t>Pydantic</w:t>
+      </w:r>
+      <w:proofErr w:type="spellEnd"/>
+      <w:r>
+        <w:t>, HTTPX, Tenacity and multiple scholarly APIs as implementation options (Group C, 2026). By Week 11, the implemented artefact preserved those boundaries but deliberately reduced dependencies: typed Python components replaced framework-specific orchestration, OpenAlex became the implemented live provider, and JSON/Markdown remained the persistence formats. Optional Ollama planning was constrained by schema validation and deterministic fallback. The final workflow also added measurable controls: a test run reporting 11 passing tests and eight passing subtests, a three-cycle limit, execution traces, a four-query synthetic ranking evaluation and a planner-resilience benchmark.</w:t>
+      </w:r>
+    </w:p>
+    <w:p>
+      <w:pPr>
+        <w:jc w:val="both"/>
         <w:rPr>
           <w:rFonts w:cs="Arial"/>
           <w:color w:val="000000" w:themeColor="text1"/>
           <w:szCs w:val="24"/>
         </w:rPr>
-        <w:t>The Week 7 design proposed four specialist responsibilities—planning, retrieval, processing and storage—with LangGraph, Pydantic, HTTPX, Tenacity and multiple scholarly APIs as implementation options (Group C, 2026). By Week 11, the implemented artefact preserved those boundaries but deliberately reduced dependencies: typed Python components replaced framework-specific orchestration, OpenAlex became the implemented live provider, and JSON/Markdown remained the persistence formats. Optional Ollama planning was constrained by schema validation and deterministic fallback. The final workflow also added measurable controls: eight automated tests, a three-cycle limit, execution traces, a four-query synthetic ranking evaluation and a planner-resilience benchmark.</w:t>
+      </w:pPr>
+      <w:r>
+        <w:rPr>
+          <w:rFonts w:cs="Arial"/>
+          <w:color w:val="000000" w:themeColor="text1"/>
+          <w:szCs w:val="24"/>
+        </w:rPr>
+        <w:t>This was not a simple implementation of every Week 7 technology. Removing LangGraph, Pydantic, HTTPX and Tenacity reduced installation complexity and made the assessed behaviour easier to reproduce, but it also meant losing richer orchestration, asynchronous networking and built-in retry mechanisms that would matter in a production system. Similarly, implementing only OpenAlex reduced source breadth compared with the proposed arXiv/OpenAlex/CORE design. I therefore regard the Week 11 solution as architecturally faithful but technologically narrower. This comparison changed my view of architectural fidelity: preserving responsibilities, interfaces and evaluable behaviour mattered more than reproducing every proposed tool.</w:t>
       </w:r>
     </w:p>
     <w:p>
@@ -618,56 +593,27 @@
         </w:rPr>
       </w:pPr>
       <w:r>
-        <w:rPr>
-          <w:rFonts w:cs="Arial"/>
-          <w:color w:val="000000" w:themeColor="text1"/>
-          <w:szCs w:val="24"/>
-        </w:rPr>
-        <w:t xml:space="preserve">This was not a simple implementation of every Week 7 technology. Removing LangGraph, Pydantic, HTTPX and Tenacity reduced installation complexity and made the assessed behaviour easier to reproduce, but it also meant losing richer orchestration, asynchronous networking and built-in retry mechanisms that would matter in a production system. Similarly, implementing only OpenAlex reduced source breadth compared with the proposed arXiv/OpenAlex/CORE design. I therefore regard the Week 11 solution as architecturally faithful but technologically narrower. This comparison </w:t>
+        <w:t xml:space="preserve">The Unit 11 implementation therefore demonstrates bounded workflow autonomy rather than unrestricted independent agents. A planning component converts a goal into two to </w:t>
       </w:r>
       <w:r>
-        <w:rPr>
-          <w:rFonts w:cs="Arial"/>
-          <w:color w:val="000000" w:themeColor="text1"/>
-          <w:szCs w:val="24"/>
-        </w:rPr>
         <w:lastRenderedPageBreak/>
-        <w:t>changed my view of architectural fidelity: preserving responsibilities, interfaces and evaluable behaviour mattered more than reproducing every proposed tool.</w:t>
+        <w:t>five validated search tasks; retrieval queries OpenAlex or an offline fixture; processing normalises, deduplicates and ranks evidence; and storage writes Markdown, JSON and an execution trace. If evidence is insufficient, later cycles refine the existing searches and repeat retrieval within a maximum of three cycles. The reproducible demonstration retained three evidence records and generated the expected outputs. These results demonstrate software behaviour and resilience, not the scholarly quality of a real literature review (see Appendix C).</w:t>
       </w:r>
     </w:p>
     <w:p>
       <w:pPr>
-        <w:jc w:val="both"/>
-        <w:rPr>
-          <w:rFonts w:cs="Arial"/>
+        <w:pStyle w:val="Heading2"/>
+        <w:spacing w:before="0"/>
+        <w:rPr>
+          <w:rFonts w:ascii="Arial" w:hAnsi="Arial" w:cs="Arial"/>
           <w:color w:val="000000" w:themeColor="text1"/>
           <w:szCs w:val="24"/>
         </w:rPr>
       </w:pPr>
       <w:r>
         <w:rPr>
-          <w:rFonts w:cs="Arial"/>
+          <w:rFonts w:ascii="Arial" w:eastAsia="Arial" w:hAnsi="Arial" w:cs="Arial"/>
           <w:color w:val="000000" w:themeColor="text1"/>
-          <w:szCs w:val="24"/>
-        </w:rPr>
-        <w:t>The Unit 11 implementation therefore demonstrates bounded workflow autonomy rather than unrestricted independent agents. A planning component converts a goal into two-to-five validated search tasks; retrieval queries OpenAlex or an offline fixture; processing normalises, deduplicates and ranks evidence; and storage writes Markdown, JSON and an execution trace. If evidence is insufficient, later cycles refine the existing searches and repeat retrieval within a maximum of three cycles. The reproducible demonstration retained three evidence records and generated the expected outputs. These results demonstrate software behaviour and resilience, not the scholarly quality of a real literature review.</w:t>
-      </w:r>
-    </w:p>
-    <w:p>
-      <w:pPr>
-        <w:pStyle w:val="Heading2"/>
-        <w:rPr>
-          <w:rFonts w:ascii="Arial" w:hAnsi="Arial" w:cs="Arial"/>
-          <w:color w:val="000000" w:themeColor="text1"/>
-          <w:sz w:val="24"/>
-          <w:szCs w:val="24"/>
-        </w:rPr>
-      </w:pPr>
-      <w:r>
-        <w:rPr>
-          <w:rFonts w:ascii="Arial" w:hAnsi="Arial" w:cs="Arial"/>
-          <w:color w:val="000000" w:themeColor="text1"/>
-          <w:sz w:val="24"/>
           <w:szCs w:val="24"/>
         </w:rPr>
         <w:t>Learning outcomes</w:t>
@@ -783,19 +729,33 @@
     </w:p>
     <w:p>
       <w:pPr>
+        <w:pStyle w:val="ListNumber"/>
+        <w:numPr>
+          <w:ilvl w:val="0"/>
+          <w:numId w:val="0"/>
+        </w:numPr>
+        <w:ind w:left="360"/>
+        <w:rPr>
+          <w:rFonts w:cs="Arial"/>
+          <w:color w:val="000000" w:themeColor="text1"/>
+          <w:szCs w:val="24"/>
+        </w:rPr>
+      </w:pPr>
+    </w:p>
+    <w:p>
+      <w:pPr>
         <w:pStyle w:val="Heading2"/>
+        <w:spacing w:before="0"/>
         <w:rPr>
           <w:rFonts w:ascii="Arial" w:hAnsi="Arial" w:cs="Arial"/>
           <w:color w:val="000000" w:themeColor="text1"/>
-          <w:sz w:val="24"/>
           <w:szCs w:val="24"/>
         </w:rPr>
       </w:pPr>
       <w:r>
         <w:rPr>
-          <w:rFonts w:ascii="Arial" w:hAnsi="Arial" w:cs="Arial"/>
+          <w:rFonts w:ascii="Arial" w:eastAsia="Arial" w:hAnsi="Arial" w:cs="Arial"/>
           <w:color w:val="000000" w:themeColor="text1"/>
-          <w:sz w:val="24"/>
           <w:szCs w:val="24"/>
         </w:rPr>
         <w:lastRenderedPageBreak/>
@@ -805,6 +765,7 @@
     <w:p>
       <w:pPr>
         <w:pStyle w:val="Heading3"/>
+        <w:spacing w:before="0"/>
         <w:rPr>
           <w:rFonts w:ascii="Arial" w:hAnsi="Arial" w:cs="Arial"/>
           <w:color w:val="000000" w:themeColor="text1"/>
@@ -813,7 +774,7 @@
       </w:pPr>
       <w:r>
         <w:rPr>
-          <w:rFonts w:ascii="Arial" w:hAnsi="Arial" w:cs="Arial"/>
+          <w:rFonts w:ascii="Arial" w:eastAsia="Arial" w:hAnsi="Arial" w:cs="Arial"/>
           <w:color w:val="000000" w:themeColor="text1"/>
           <w:szCs w:val="24"/>
         </w:rPr>
@@ -857,39 +818,25 @@
         </w:rPr>
       </w:pPr>
       <w:r>
+        <w:t>So what? A deterministic score is not neutral merely because it is explainable. Ranking affects which evidence a researcher sees first and can reproduce structural inequalities in scholarly visibility. OpenAlex coverage and missing abstracts can introduce source-selection bias. This challenged my earlier tendency to equate reproducibility with fairness.</w:t>
+      </w:r>
+    </w:p>
+    <w:p>
+      <w:pPr>
+        <w:jc w:val="both"/>
+        <w:rPr>
+          <w:rFonts w:cs="Arial"/>
+          <w:color w:val="000000" w:themeColor="text1"/>
+          <w:szCs w:val="24"/>
+        </w:rPr>
+      </w:pPr>
+      <w:r>
         <w:rPr>
           <w:rFonts w:cs="Arial"/>
           <w:b/>
           <w:color w:val="000000" w:themeColor="text1"/>
           <w:szCs w:val="24"/>
         </w:rPr>
-        <w:t xml:space="preserve">So what? </w:t>
-      </w:r>
-      <w:r>
-        <w:rPr>
-          <w:rFonts w:cs="Arial"/>
-          <w:color w:val="000000" w:themeColor="text1"/>
-          <w:szCs w:val="24"/>
-        </w:rPr>
-        <w:t>A deterministic score is not neutral merely because it is explainable. Ranking affects which evidence a researcher sees first and can reproduce structural inequalities in scholarly visibility. OpenAlex coverage and missing abstracts add source-selection bias. This challenged my earlier tendency to equate reproducibility with fairness.</w:t>
-      </w:r>
-    </w:p>
-    <w:p>
-      <w:pPr>
-        <w:jc w:val="both"/>
-        <w:rPr>
-          <w:rFonts w:cs="Arial"/>
-          <w:color w:val="000000" w:themeColor="text1"/>
-          <w:szCs w:val="24"/>
-        </w:rPr>
-      </w:pPr>
-      <w:r>
-        <w:rPr>
-          <w:rFonts w:cs="Arial"/>
-          <w:b/>
-          <w:color w:val="000000" w:themeColor="text1"/>
-          <w:szCs w:val="24"/>
-        </w:rPr>
         <w:t xml:space="preserve">Now what? </w:t>
       </w:r>
       <w:r>
@@ -904,6 +851,7 @@
     <w:p>
       <w:pPr>
         <w:pStyle w:val="Heading3"/>
+        <w:spacing w:before="0"/>
         <w:rPr>
           <w:rFonts w:ascii="Arial" w:hAnsi="Arial" w:cs="Arial"/>
           <w:color w:val="000000" w:themeColor="text1"/>
@@ -912,7 +860,7 @@
       </w:pPr>
       <w:r>
         <w:rPr>
-          <w:rFonts w:ascii="Arial" w:hAnsi="Arial" w:cs="Arial"/>
+          <w:rFonts w:ascii="Arial" w:eastAsia="Arial" w:hAnsi="Arial" w:cs="Arial"/>
           <w:color w:val="000000" w:themeColor="text1"/>
           <w:szCs w:val="24"/>
         </w:rPr>
@@ -930,20 +878,13 @@
       </w:pPr>
       <w:r>
         <w:rPr>
-          <w:rFonts w:cs="Arial"/>
           <w:b/>
-          <w:color w:val="000000" w:themeColor="text1"/>
-          <w:szCs w:val="24"/>
-        </w:rPr>
-        <w:t xml:space="preserve">What? </w:t>
+          <w:bCs/>
+        </w:rPr>
+        <w:t>What?</w:t>
       </w:r>
       <w:r>
-        <w:rPr>
-          <w:rFonts w:cs="Arial"/>
-          <w:color w:val="000000" w:themeColor="text1"/>
-          <w:szCs w:val="24"/>
-        </w:rPr>
-        <w:t>The workflow plans an initial set of search tasks, retrieves evidence, assesses sufficiency and can perform further bounded retrieval cycles. I implemented two boundaries: two-to-five validated planning tasks and a maximum of three cycles. An unavailable or malformed LLM response triggers a deterministic fallback (Russell and Norvig, 2021).</w:t>
+        <w:t xml:space="preserve"> The workflow plans an initial set of search tasks, retrieves evidence, assesses sufficiency and can perform further bounded retrieval cycles. I implemented two boundaries: two to five validated planning tasks and a maximum of three cycles. An unavailable or malformed LLM response triggers a deterministic fallback. These explicit state and stopping rules constrain autonomous behaviour (Russell and Norvig, 2021).</w:t>
       </w:r>
     </w:p>
     <w:p>
@@ -1012,6 +953,7 @@
     <w:p>
       <w:pPr>
         <w:pStyle w:val="Heading3"/>
+        <w:spacing w:before="0"/>
         <w:rPr>
           <w:rFonts w:ascii="Arial" w:hAnsi="Arial" w:cs="Arial"/>
           <w:color w:val="000000" w:themeColor="text1"/>
@@ -1020,7 +962,7 @@
       </w:pPr>
       <w:r>
         <w:rPr>
-          <w:rFonts w:ascii="Arial" w:hAnsi="Arial" w:cs="Arial"/>
+          <w:rFonts w:ascii="Arial" w:eastAsia="Arial" w:hAnsi="Arial" w:cs="Arial"/>
           <w:color w:val="000000" w:themeColor="text1"/>
           <w:szCs w:val="24"/>
         </w:rPr>
@@ -1091,38 +1033,23 @@
         </w:rPr>
       </w:pPr>
       <w:r>
-        <w:rPr>
-          <w:rFonts w:cs="Arial"/>
-          <w:b/>
-          <w:color w:val="000000" w:themeColor="text1"/>
-          <w:szCs w:val="24"/>
-        </w:rPr>
-        <w:t xml:space="preserve">Now what? </w:t>
-      </w:r>
-      <w:r>
-        <w:rPr>
-          <w:rFonts w:cs="Arial"/>
-          <w:color w:val="000000" w:themeColor="text1"/>
-          <w:szCs w:val="24"/>
-        </w:rPr>
-        <w:t>I would add DOI-resolution checks and sentence-level links between claims and source passages. A manually assessed claim-support benchmark and appropriate-abstention measure would test whether explanation corresponds to evidence. Human verification would remain mandatory before academic use.</w:t>
+        <w:t>Now what? I would add DOI-resolution checks and sentence-level links between claims and source passages. A manually assessed claim-support benchmark and a measure of appropriate abstention would test whether explanation corresponds to evidence. Human verification would remain mandatory before academic use.</w:t>
       </w:r>
     </w:p>
     <w:p>
       <w:pPr>
         <w:pStyle w:val="Heading2"/>
+        <w:spacing w:before="0"/>
         <w:rPr>
           <w:rFonts w:ascii="Arial" w:hAnsi="Arial" w:cs="Arial"/>
           <w:color w:val="000000" w:themeColor="text1"/>
-          <w:sz w:val="24"/>
           <w:szCs w:val="24"/>
         </w:rPr>
       </w:pPr>
       <w:r>
         <w:rPr>
-          <w:rFonts w:ascii="Arial" w:hAnsi="Arial" w:cs="Arial"/>
+          <w:rFonts w:ascii="Arial" w:eastAsia="Arial" w:hAnsi="Arial" w:cs="Arial"/>
           <w:color w:val="000000" w:themeColor="text1"/>
-          <w:sz w:val="24"/>
           <w:szCs w:val="24"/>
         </w:rPr>
         <w:t>Professional skills matrix and action plan</w:t>
@@ -1130,32 +1057,24 @@
     </w:p>
     <w:tbl>
       <w:tblPr>
-        <w:tblStyle w:val="TableGrid"/>
+        <w:tblStyle w:val="PlainTable1"/>
         <w:tblW w:w="0" w:type="auto"/>
-        <w:jc w:val="center"/>
         <w:tblLook w:val="04A0" w:firstRow="1" w:lastRow="0" w:firstColumn="1" w:lastColumn="0" w:noHBand="0" w:noVBand="1"/>
       </w:tblPr>
       <w:tblGrid>
+        <w:gridCol w:w="2419"/>
+        <w:gridCol w:w="2385"/>
+        <w:gridCol w:w="2409"/>
         <w:gridCol w:w="2407"/>
-        <w:gridCol w:w="2383"/>
-        <w:gridCol w:w="2408"/>
-        <w:gridCol w:w="2406"/>
       </w:tblGrid>
       <w:tr>
         <w:trPr>
-          <w:jc w:val="center"/>
+          <w:cnfStyle w:val="100000000000" w:firstRow="1" w:lastRow="0" w:firstColumn="0" w:lastColumn="0" w:oddVBand="0" w:evenVBand="0" w:oddHBand="0" w:evenHBand="0" w:firstRowFirstColumn="0" w:firstRowLastColumn="0" w:lastRowFirstColumn="0" w:lastRowLastColumn="0"/>
         </w:trPr>
         <w:tc>
           <w:tcPr>
+            <w:cnfStyle w:val="001000000000" w:firstRow="0" w:lastRow="0" w:firstColumn="1" w:lastColumn="0" w:oddVBand="0" w:evenVBand="0" w:oddHBand="0" w:evenHBand="0" w:firstRowFirstColumn="0" w:firstRowLastColumn="0" w:lastRowFirstColumn="0" w:lastRowLastColumn="0"/>
             <w:tcW w:w="2448" w:type="dxa"/>
-            <w:shd w:val="clear" w:color="auto" w:fill="D9EAF7"/>
-            <w:tcMar>
-              <w:top w:w="80" w:type="dxa"/>
-              <w:left w:w="100" w:type="dxa"/>
-              <w:bottom w:w="80" w:type="dxa"/>
-              <w:right w:w="100" w:type="dxa"/>
-            </w:tcMar>
-            <w:vAlign w:val="center"/>
           </w:tcPr>
           <w:p>
             <w:pPr>
@@ -1168,7 +1087,6 @@
             <w:r>
               <w:rPr>
                 <w:rFonts w:cs="Arial"/>
-                <w:b/>
                 <w:color w:val="000000" w:themeColor="text1"/>
                 <w:szCs w:val="24"/>
               </w:rPr>
@@ -1179,17 +1097,10 @@
         <w:tc>
           <w:tcPr>
             <w:tcW w:w="2448" w:type="dxa"/>
-            <w:shd w:val="clear" w:color="auto" w:fill="D9EAF7"/>
-            <w:tcMar>
-              <w:top w:w="80" w:type="dxa"/>
-              <w:left w:w="100" w:type="dxa"/>
-              <w:bottom w:w="80" w:type="dxa"/>
-              <w:right w:w="100" w:type="dxa"/>
-            </w:tcMar>
-            <w:vAlign w:val="center"/>
           </w:tcPr>
           <w:p>
             <w:pPr>
+              <w:cnfStyle w:val="100000000000" w:firstRow="1" w:lastRow="0" w:firstColumn="0" w:lastColumn="0" w:oddVBand="0" w:evenVBand="0" w:oddHBand="0" w:evenHBand="0" w:firstRowFirstColumn="0" w:firstRowLastColumn="0" w:lastRowFirstColumn="0" w:lastRowLastColumn="0"/>
               <w:rPr>
                 <w:rFonts w:cs="Arial"/>
                 <w:color w:val="000000" w:themeColor="text1"/>
@@ -1199,7 +1110,6 @@
             <w:r>
               <w:rPr>
                 <w:rFonts w:cs="Arial"/>
-                <w:b/>
                 <w:color w:val="000000" w:themeColor="text1"/>
                 <w:szCs w:val="24"/>
               </w:rPr>
@@ -1210,17 +1120,10 @@
         <w:tc>
           <w:tcPr>
             <w:tcW w:w="2448" w:type="dxa"/>
-            <w:shd w:val="clear" w:color="auto" w:fill="D9EAF7"/>
-            <w:tcMar>
-              <w:top w:w="80" w:type="dxa"/>
-              <w:left w:w="100" w:type="dxa"/>
-              <w:bottom w:w="80" w:type="dxa"/>
-              <w:right w:w="100" w:type="dxa"/>
-            </w:tcMar>
-            <w:vAlign w:val="center"/>
           </w:tcPr>
           <w:p>
             <w:pPr>
+              <w:cnfStyle w:val="100000000000" w:firstRow="1" w:lastRow="0" w:firstColumn="0" w:lastColumn="0" w:oddVBand="0" w:evenVBand="0" w:oddHBand="0" w:evenHBand="0" w:firstRowFirstColumn="0" w:firstRowLastColumn="0" w:lastRowFirstColumn="0" w:lastRowLastColumn="0"/>
               <w:rPr>
                 <w:rFonts w:cs="Arial"/>
                 <w:color w:val="000000" w:themeColor="text1"/>
@@ -1230,7 +1133,6 @@
             <w:r>
               <w:rPr>
                 <w:rFonts w:cs="Arial"/>
-                <w:b/>
                 <w:color w:val="000000" w:themeColor="text1"/>
                 <w:szCs w:val="24"/>
               </w:rPr>
@@ -1241,17 +1143,10 @@
         <w:tc>
           <w:tcPr>
             <w:tcW w:w="2448" w:type="dxa"/>
-            <w:shd w:val="clear" w:color="auto" w:fill="D9EAF7"/>
-            <w:tcMar>
-              <w:top w:w="80" w:type="dxa"/>
-              <w:left w:w="100" w:type="dxa"/>
-              <w:bottom w:w="80" w:type="dxa"/>
-              <w:right w:w="100" w:type="dxa"/>
-            </w:tcMar>
-            <w:vAlign w:val="center"/>
           </w:tcPr>
           <w:p>
             <w:pPr>
+              <w:cnfStyle w:val="100000000000" w:firstRow="1" w:lastRow="0" w:firstColumn="0" w:lastColumn="0" w:oddVBand="0" w:evenVBand="0" w:oddHBand="0" w:evenHBand="0" w:firstRowFirstColumn="0" w:firstRowLastColumn="0" w:lastRowFirstColumn="0" w:lastRowLastColumn="0"/>
               <w:rPr>
                 <w:rFonts w:cs="Arial"/>
                 <w:color w:val="000000" w:themeColor="text1"/>
@@ -1261,7 +1156,6 @@
             <w:r>
               <w:rPr>
                 <w:rFonts w:cs="Arial"/>
-                <w:b/>
                 <w:color w:val="000000" w:themeColor="text1"/>
                 <w:szCs w:val="24"/>
               </w:rPr>
@@ -1272,17 +1166,12 @@
       </w:tr>
       <w:tr>
         <w:trPr>
-          <w:jc w:val="center"/>
+          <w:cnfStyle w:val="000000100000" w:firstRow="0" w:lastRow="0" w:firstColumn="0" w:lastColumn="0" w:oddVBand="0" w:evenVBand="0" w:oddHBand="1" w:evenHBand="0" w:firstRowFirstColumn="0" w:firstRowLastColumn="0" w:lastRowFirstColumn="0" w:lastRowLastColumn="0"/>
         </w:trPr>
         <w:tc>
           <w:tcPr>
+            <w:cnfStyle w:val="001000000000" w:firstRow="0" w:lastRow="0" w:firstColumn="1" w:lastColumn="0" w:oddVBand="0" w:evenVBand="0" w:oddHBand="0" w:evenHBand="0" w:firstRowFirstColumn="0" w:firstRowLastColumn="0" w:lastRowFirstColumn="0" w:lastRowLastColumn="0"/>
             <w:tcW w:w="2448" w:type="dxa"/>
-            <w:tcMar>
-              <w:top w:w="80" w:type="dxa"/>
-              <w:left w:w="100" w:type="dxa"/>
-              <w:bottom w:w="80" w:type="dxa"/>
-              <w:right w:w="100" w:type="dxa"/>
-            </w:tcMar>
           </w:tcPr>
           <w:p>
             <w:pPr>
@@ -1305,15 +1194,10 @@
         <w:tc>
           <w:tcPr>
             <w:tcW w:w="2448" w:type="dxa"/>
-            <w:tcMar>
-              <w:top w:w="80" w:type="dxa"/>
-              <w:left w:w="100" w:type="dxa"/>
-              <w:bottom w:w="80" w:type="dxa"/>
-              <w:right w:w="100" w:type="dxa"/>
-            </w:tcMar>
           </w:tcPr>
           <w:p>
             <w:pPr>
+              <w:cnfStyle w:val="000000100000" w:firstRow="0" w:lastRow="0" w:firstColumn="0" w:lastColumn="0" w:oddVBand="0" w:evenVBand="0" w:oddHBand="1" w:evenHBand="0" w:firstRowFirstColumn="0" w:firstRowLastColumn="0" w:lastRowFirstColumn="0" w:lastRowLastColumn="0"/>
               <w:rPr>
                 <w:rFonts w:cs="Arial"/>
                 <w:color w:val="000000" w:themeColor="text1"/>
@@ -1326,7 +1210,7 @@
                 <w:color w:val="000000" w:themeColor="text1"/>
                 <w:szCs w:val="24"/>
               </w:rPr>
-              <w:t xml:space="preserve">Three discussion </w:t>
+              <w:t xml:space="preserve">Three discussion summaries and </w:t>
             </w:r>
             <w:r>
               <w:rPr>
@@ -1335,22 +1219,17 @@
                 <w:szCs w:val="24"/>
               </w:rPr>
               <w:lastRenderedPageBreak/>
-              <w:t>summaries and design critique</w:t>
+              <w:t>design critique</w:t>
             </w:r>
           </w:p>
         </w:tc>
         <w:tc>
           <w:tcPr>
             <w:tcW w:w="2448" w:type="dxa"/>
-            <w:tcMar>
-              <w:top w:w="80" w:type="dxa"/>
-              <w:left w:w="100" w:type="dxa"/>
-              <w:bottom w:w="80" w:type="dxa"/>
-              <w:right w:w="100" w:type="dxa"/>
-            </w:tcMar>
           </w:tcPr>
           <w:p>
             <w:pPr>
+              <w:cnfStyle w:val="000000100000" w:firstRow="0" w:lastRow="0" w:firstColumn="0" w:lastColumn="0" w:oddVBand="0" w:evenVBand="0" w:oddHBand="1" w:evenHBand="0" w:firstRowFirstColumn="0" w:firstRowLastColumn="0" w:lastRowFirstColumn="0" w:lastRowLastColumn="0"/>
               <w:rPr>
                 <w:rFonts w:cs="Arial"/>
                 <w:color w:val="000000" w:themeColor="text1"/>
@@ -1364,7 +1243,7 @@
                 <w:szCs w:val="24"/>
               </w:rPr>
               <w:lastRenderedPageBreak/>
-              <w:t xml:space="preserve">Stronger at </w:t>
+              <w:t>Stronger at comparing trade-</w:t>
             </w:r>
             <w:r>
               <w:rPr>
@@ -1373,22 +1252,17 @@
                 <w:szCs w:val="24"/>
               </w:rPr>
               <w:lastRenderedPageBreak/>
-              <w:t>comparing trade-offs than at the module start</w:t>
+              <w:t>offs than at the module start</w:t>
             </w:r>
           </w:p>
         </w:tc>
         <w:tc>
           <w:tcPr>
             <w:tcW w:w="2448" w:type="dxa"/>
-            <w:tcMar>
-              <w:top w:w="80" w:type="dxa"/>
-              <w:left w:w="100" w:type="dxa"/>
-              <w:bottom w:w="80" w:type="dxa"/>
-              <w:right w:w="100" w:type="dxa"/>
-            </w:tcMar>
           </w:tcPr>
           <w:p>
             <w:pPr>
+              <w:cnfStyle w:val="000000100000" w:firstRow="0" w:lastRow="0" w:firstColumn="0" w:lastColumn="0" w:oddVBand="0" w:evenVBand="0" w:oddHBand="1" w:evenHBand="0" w:firstRowFirstColumn="0" w:firstRowLastColumn="0" w:lastRowFirstColumn="0" w:lastRowLastColumn="0"/>
               <w:rPr>
                 <w:rFonts w:cs="Arial"/>
                 <w:color w:val="000000" w:themeColor="text1"/>
@@ -1402,7 +1276,7 @@
                 <w:szCs w:val="24"/>
               </w:rPr>
               <w:lastRenderedPageBreak/>
-              <w:t xml:space="preserve">Quantify </w:t>
+              <w:t xml:space="preserve">Quantify comparisons with </w:t>
             </w:r>
             <w:r>
               <w:rPr>
@@ -1411,24 +1285,16 @@
                 <w:szCs w:val="24"/>
               </w:rPr>
               <w:lastRenderedPageBreak/>
-              <w:t>comparisons with explicit evaluation criteria</w:t>
+              <w:t>explicit evaluation criteria</w:t>
             </w:r>
           </w:p>
         </w:tc>
       </w:tr>
       <w:tr>
-        <w:trPr>
-          <w:jc w:val="center"/>
-        </w:trPr>
         <w:tc>
           <w:tcPr>
+            <w:cnfStyle w:val="001000000000" w:firstRow="0" w:lastRow="0" w:firstColumn="1" w:lastColumn="0" w:oddVBand="0" w:evenVBand="0" w:oddHBand="0" w:evenHBand="0" w:firstRowFirstColumn="0" w:firstRowLastColumn="0" w:lastRowFirstColumn="0" w:lastRowLastColumn="0"/>
             <w:tcW w:w="2448" w:type="dxa"/>
-            <w:tcMar>
-              <w:top w:w="80" w:type="dxa"/>
-              <w:left w:w="100" w:type="dxa"/>
-              <w:bottom w:w="80" w:type="dxa"/>
-              <w:right w:w="100" w:type="dxa"/>
-            </w:tcMar>
           </w:tcPr>
           <w:p>
             <w:pPr>
@@ -1452,15 +1318,10 @@
         <w:tc>
           <w:tcPr>
             <w:tcW w:w="2448" w:type="dxa"/>
-            <w:tcMar>
-              <w:top w:w="80" w:type="dxa"/>
-              <w:left w:w="100" w:type="dxa"/>
-              <w:bottom w:w="80" w:type="dxa"/>
-              <w:right w:w="100" w:type="dxa"/>
-            </w:tcMar>
           </w:tcPr>
           <w:p>
             <w:pPr>
+              <w:cnfStyle w:val="000000000000" w:firstRow="0" w:lastRow="0" w:firstColumn="0" w:lastColumn="0" w:oddVBand="0" w:evenVBand="0" w:oddHBand="0" w:evenHBand="0" w:firstRowFirstColumn="0" w:firstRowLastColumn="0" w:lastRowFirstColumn="0" w:lastRowLastColumn="0"/>
               <w:rPr>
                 <w:rFonts w:cs="Arial"/>
                 <w:color w:val="000000" w:themeColor="text1"/>
@@ -1480,15 +1341,10 @@
         <w:tc>
           <w:tcPr>
             <w:tcW w:w="2448" w:type="dxa"/>
-            <w:tcMar>
-              <w:top w:w="80" w:type="dxa"/>
-              <w:left w:w="100" w:type="dxa"/>
-              <w:bottom w:w="80" w:type="dxa"/>
-              <w:right w:w="100" w:type="dxa"/>
-            </w:tcMar>
           </w:tcPr>
           <w:p>
             <w:pPr>
+              <w:cnfStyle w:val="000000000000" w:firstRow="0" w:lastRow="0" w:firstColumn="0" w:lastColumn="0" w:oddVBand="0" w:evenVBand="0" w:oddHBand="0" w:evenHBand="0" w:firstRowFirstColumn="0" w:firstRowLastColumn="0" w:lastRowFirstColumn="0" w:lastRowLastColumn="0"/>
               <w:rPr>
                 <w:rFonts w:cs="Arial"/>
                 <w:color w:val="000000" w:themeColor="text1"/>
@@ -1508,15 +1364,10 @@
         <w:tc>
           <w:tcPr>
             <w:tcW w:w="2448" w:type="dxa"/>
-            <w:tcMar>
-              <w:top w:w="80" w:type="dxa"/>
-              <w:left w:w="100" w:type="dxa"/>
-              <w:bottom w:w="80" w:type="dxa"/>
-              <w:right w:w="100" w:type="dxa"/>
-            </w:tcMar>
           </w:tcPr>
           <w:p>
             <w:pPr>
+              <w:cnfStyle w:val="000000000000" w:firstRow="0" w:lastRow="0" w:firstColumn="0" w:lastColumn="0" w:oddVBand="0" w:evenVBand="0" w:oddHBand="0" w:evenHBand="0" w:firstRowFirstColumn="0" w:firstRowLastColumn="0" w:lastRowFirstColumn="0" w:lastRowLastColumn="0"/>
               <w:rPr>
                 <w:rFonts w:cs="Arial"/>
                 <w:color w:val="000000" w:themeColor="text1"/>
@@ -1536,17 +1387,12 @@
       </w:tr>
       <w:tr>
         <w:trPr>
-          <w:jc w:val="center"/>
+          <w:cnfStyle w:val="000000100000" w:firstRow="0" w:lastRow="0" w:firstColumn="0" w:lastColumn="0" w:oddVBand="0" w:evenVBand="0" w:oddHBand="1" w:evenHBand="0" w:firstRowFirstColumn="0" w:firstRowLastColumn="0" w:lastRowFirstColumn="0" w:lastRowLastColumn="0"/>
         </w:trPr>
         <w:tc>
           <w:tcPr>
+            <w:cnfStyle w:val="001000000000" w:firstRow="0" w:lastRow="0" w:firstColumn="1" w:lastColumn="0" w:oddVBand="0" w:evenVBand="0" w:oddHBand="0" w:evenHBand="0" w:firstRowFirstColumn="0" w:firstRowLastColumn="0" w:lastRowFirstColumn="0" w:lastRowLastColumn="0"/>
             <w:tcW w:w="2448" w:type="dxa"/>
-            <w:tcMar>
-              <w:top w:w="80" w:type="dxa"/>
-              <w:left w:w="100" w:type="dxa"/>
-              <w:bottom w:w="80" w:type="dxa"/>
-              <w:right w:w="100" w:type="dxa"/>
-            </w:tcMar>
           </w:tcPr>
           <w:p>
             <w:pPr>
@@ -1569,15 +1415,10 @@
         <w:tc>
           <w:tcPr>
             <w:tcW w:w="2448" w:type="dxa"/>
-            <w:tcMar>
-              <w:top w:w="80" w:type="dxa"/>
-              <w:left w:w="100" w:type="dxa"/>
-              <w:bottom w:w="80" w:type="dxa"/>
-              <w:right w:w="100" w:type="dxa"/>
-            </w:tcMar>
           </w:tcPr>
           <w:p>
             <w:pPr>
+              <w:cnfStyle w:val="000000100000" w:firstRow="0" w:lastRow="0" w:firstColumn="0" w:lastColumn="0" w:oddVBand="0" w:evenVBand="0" w:oddHBand="1" w:evenHBand="0" w:firstRowFirstColumn="0" w:firstRowLastColumn="0" w:lastRowFirstColumn="0" w:lastRowLastColumn="0"/>
               <w:rPr>
                 <w:rFonts w:cs="Arial"/>
                 <w:color w:val="000000" w:themeColor="text1"/>
@@ -1597,15 +1438,10 @@
         <w:tc>
           <w:tcPr>
             <w:tcW w:w="2448" w:type="dxa"/>
-            <w:tcMar>
-              <w:top w:w="80" w:type="dxa"/>
-              <w:left w:w="100" w:type="dxa"/>
-              <w:bottom w:w="80" w:type="dxa"/>
-              <w:right w:w="100" w:type="dxa"/>
-            </w:tcMar>
           </w:tcPr>
           <w:p>
             <w:pPr>
+              <w:cnfStyle w:val="000000100000" w:firstRow="0" w:lastRow="0" w:firstColumn="0" w:lastColumn="0" w:oddVBand="0" w:evenVBand="0" w:oddHBand="1" w:evenHBand="0" w:firstRowFirstColumn="0" w:firstRowLastColumn="0" w:lastRowFirstColumn="0" w:lastRowLastColumn="0"/>
               <w:rPr>
                 <w:rFonts w:cs="Arial"/>
                 <w:color w:val="000000" w:themeColor="text1"/>
@@ -1625,15 +1461,10 @@
         <w:tc>
           <w:tcPr>
             <w:tcW w:w="2448" w:type="dxa"/>
-            <w:tcMar>
-              <w:top w:w="80" w:type="dxa"/>
-              <w:left w:w="100" w:type="dxa"/>
-              <w:bottom w:w="80" w:type="dxa"/>
-              <w:right w:w="100" w:type="dxa"/>
-            </w:tcMar>
           </w:tcPr>
           <w:p>
             <w:pPr>
+              <w:cnfStyle w:val="000000100000" w:firstRow="0" w:lastRow="0" w:firstColumn="0" w:lastColumn="0" w:oddVBand="0" w:evenVBand="0" w:oddHBand="1" w:evenHBand="0" w:firstRowFirstColumn="0" w:firstRowLastColumn="0" w:lastRowFirstColumn="0" w:lastRowLastColumn="0"/>
               <w:rPr>
                 <w:rFonts w:cs="Arial"/>
                 <w:color w:val="000000" w:themeColor="text1"/>
@@ -1652,18 +1483,10 @@
         </w:tc>
       </w:tr>
       <w:tr>
-        <w:trPr>
-          <w:jc w:val="center"/>
-        </w:trPr>
         <w:tc>
           <w:tcPr>
+            <w:cnfStyle w:val="001000000000" w:firstRow="0" w:lastRow="0" w:firstColumn="1" w:lastColumn="0" w:oddVBand="0" w:evenVBand="0" w:oddHBand="0" w:evenHBand="0" w:firstRowFirstColumn="0" w:firstRowLastColumn="0" w:lastRowFirstColumn="0" w:lastRowLastColumn="0"/>
             <w:tcW w:w="2448" w:type="dxa"/>
-            <w:tcMar>
-              <w:top w:w="80" w:type="dxa"/>
-              <w:left w:w="100" w:type="dxa"/>
-              <w:bottom w:w="80" w:type="dxa"/>
-              <w:right w:w="100" w:type="dxa"/>
-            </w:tcMar>
           </w:tcPr>
           <w:p>
             <w:pPr>
@@ -1686,15 +1509,10 @@
         <w:tc>
           <w:tcPr>
             <w:tcW w:w="2448" w:type="dxa"/>
-            <w:tcMar>
-              <w:top w:w="80" w:type="dxa"/>
-              <w:left w:w="100" w:type="dxa"/>
-              <w:bottom w:w="80" w:type="dxa"/>
-              <w:right w:w="100" w:type="dxa"/>
-            </w:tcMar>
           </w:tcPr>
           <w:p>
             <w:pPr>
+              <w:cnfStyle w:val="000000000000" w:firstRow="0" w:lastRow="0" w:firstColumn="0" w:lastColumn="0" w:oddVBand="0" w:evenVBand="0" w:oddHBand="0" w:evenHBand="0" w:firstRowFirstColumn="0" w:firstRowLastColumn="0" w:lastRowFirstColumn="0" w:lastRowLastColumn="0"/>
               <w:rPr>
                 <w:rFonts w:cs="Arial"/>
                 <w:color w:val="000000" w:themeColor="text1"/>
@@ -1714,15 +1532,10 @@
         <w:tc>
           <w:tcPr>
             <w:tcW w:w="2448" w:type="dxa"/>
-            <w:tcMar>
-              <w:top w:w="80" w:type="dxa"/>
-              <w:left w:w="100" w:type="dxa"/>
-              <w:bottom w:w="80" w:type="dxa"/>
-              <w:right w:w="100" w:type="dxa"/>
-            </w:tcMar>
           </w:tcPr>
           <w:p>
             <w:pPr>
+              <w:cnfStyle w:val="000000000000" w:firstRow="0" w:lastRow="0" w:firstColumn="0" w:lastColumn="0" w:oddVBand="0" w:evenVBand="0" w:oddHBand="0" w:evenHBand="0" w:firstRowFirstColumn="0" w:firstRowLastColumn="0" w:lastRowFirstColumn="0" w:lastRowLastColumn="0"/>
               <w:rPr>
                 <w:rFonts w:cs="Arial"/>
                 <w:color w:val="000000" w:themeColor="text1"/>
@@ -1742,15 +1555,10 @@
         <w:tc>
           <w:tcPr>
             <w:tcW w:w="2448" w:type="dxa"/>
-            <w:tcMar>
-              <w:top w:w="80" w:type="dxa"/>
-              <w:left w:w="100" w:type="dxa"/>
-              <w:bottom w:w="80" w:type="dxa"/>
-              <w:right w:w="100" w:type="dxa"/>
-            </w:tcMar>
           </w:tcPr>
           <w:p>
             <w:pPr>
+              <w:cnfStyle w:val="000000000000" w:firstRow="0" w:lastRow="0" w:firstColumn="0" w:lastColumn="0" w:oddVBand="0" w:evenVBand="0" w:oddHBand="0" w:evenHBand="0" w:firstRowFirstColumn="0" w:firstRowLastColumn="0" w:lastRowFirstColumn="0" w:lastRowLastColumn="0"/>
               <w:rPr>
                 <w:rFonts w:cs="Arial"/>
                 <w:color w:val="000000" w:themeColor="text1"/>
@@ -1770,17 +1578,12 @@
       </w:tr>
       <w:tr>
         <w:trPr>
-          <w:jc w:val="center"/>
+          <w:cnfStyle w:val="000000100000" w:firstRow="0" w:lastRow="0" w:firstColumn="0" w:lastColumn="0" w:oddVBand="0" w:evenVBand="0" w:oddHBand="1" w:evenHBand="0" w:firstRowFirstColumn="0" w:firstRowLastColumn="0" w:lastRowFirstColumn="0" w:lastRowLastColumn="0"/>
         </w:trPr>
         <w:tc>
           <w:tcPr>
+            <w:cnfStyle w:val="001000000000" w:firstRow="0" w:lastRow="0" w:firstColumn="1" w:lastColumn="0" w:oddVBand="0" w:evenVBand="0" w:oddHBand="0" w:evenHBand="0" w:firstRowFirstColumn="0" w:firstRowLastColumn="0" w:lastRowFirstColumn="0" w:lastRowLastColumn="0"/>
             <w:tcW w:w="2448" w:type="dxa"/>
-            <w:tcMar>
-              <w:top w:w="80" w:type="dxa"/>
-              <w:left w:w="100" w:type="dxa"/>
-              <w:bottom w:w="80" w:type="dxa"/>
-              <w:right w:w="100" w:type="dxa"/>
-            </w:tcMar>
           </w:tcPr>
           <w:p>
             <w:pPr>
@@ -1803,15 +1606,10 @@
         <w:tc>
           <w:tcPr>
             <w:tcW w:w="2448" w:type="dxa"/>
-            <w:tcMar>
-              <w:top w:w="80" w:type="dxa"/>
-              <w:left w:w="100" w:type="dxa"/>
-              <w:bottom w:w="80" w:type="dxa"/>
-              <w:right w:w="100" w:type="dxa"/>
-            </w:tcMar>
           </w:tcPr>
           <w:p>
             <w:pPr>
+              <w:cnfStyle w:val="000000100000" w:firstRow="0" w:lastRow="0" w:firstColumn="0" w:lastColumn="0" w:oddVBand="0" w:evenVBand="0" w:oddHBand="1" w:evenHBand="0" w:firstRowFirstColumn="0" w:firstRowLastColumn="0" w:lastRowFirstColumn="0" w:lastRowLastColumn="0"/>
               <w:rPr>
                 <w:rFonts w:cs="Arial"/>
                 <w:color w:val="000000" w:themeColor="text1"/>
@@ -1831,15 +1629,10 @@
         <w:tc>
           <w:tcPr>
             <w:tcW w:w="2448" w:type="dxa"/>
-            <w:tcMar>
-              <w:top w:w="80" w:type="dxa"/>
-              <w:left w:w="100" w:type="dxa"/>
-              <w:bottom w:w="80" w:type="dxa"/>
-              <w:right w:w="100" w:type="dxa"/>
-            </w:tcMar>
           </w:tcPr>
           <w:p>
             <w:pPr>
+              <w:cnfStyle w:val="000000100000" w:firstRow="0" w:lastRow="0" w:firstColumn="0" w:lastColumn="0" w:oddVBand="0" w:evenVBand="0" w:oddHBand="1" w:evenHBand="0" w:firstRowFirstColumn="0" w:firstRowLastColumn="0" w:lastRowFirstColumn="0" w:lastRowLastColumn="0"/>
               <w:rPr>
                 <w:rFonts w:cs="Arial"/>
                 <w:color w:val="000000" w:themeColor="text1"/>
@@ -1859,15 +1652,10 @@
         <w:tc>
           <w:tcPr>
             <w:tcW w:w="2448" w:type="dxa"/>
-            <w:tcMar>
-              <w:top w:w="80" w:type="dxa"/>
-              <w:left w:w="100" w:type="dxa"/>
-              <w:bottom w:w="80" w:type="dxa"/>
-              <w:right w:w="100" w:type="dxa"/>
-            </w:tcMar>
           </w:tcPr>
           <w:p>
             <w:pPr>
+              <w:cnfStyle w:val="000000100000" w:firstRow="0" w:lastRow="0" w:firstColumn="0" w:lastColumn="0" w:oddVBand="0" w:evenVBand="0" w:oddHBand="1" w:evenHBand="0" w:firstRowFirstColumn="0" w:firstRowLastColumn="0" w:lastRowFirstColumn="0" w:lastRowLastColumn="0"/>
               <w:rPr>
                 <w:rFonts w:cs="Arial"/>
                 <w:color w:val="000000" w:themeColor="text1"/>
@@ -1886,18 +1674,10 @@
         </w:tc>
       </w:tr>
       <w:tr>
-        <w:trPr>
-          <w:jc w:val="center"/>
-        </w:trPr>
         <w:tc>
           <w:tcPr>
+            <w:cnfStyle w:val="001000000000" w:firstRow="0" w:lastRow="0" w:firstColumn="1" w:lastColumn="0" w:oddVBand="0" w:evenVBand="0" w:oddHBand="0" w:evenHBand="0" w:firstRowFirstColumn="0" w:firstRowLastColumn="0" w:lastRowFirstColumn="0" w:lastRowLastColumn="0"/>
             <w:tcW w:w="2448" w:type="dxa"/>
-            <w:tcMar>
-              <w:top w:w="80" w:type="dxa"/>
-              <w:left w:w="100" w:type="dxa"/>
-              <w:bottom w:w="80" w:type="dxa"/>
-              <w:right w:w="100" w:type="dxa"/>
-            </w:tcMar>
           </w:tcPr>
           <w:p>
             <w:pPr>
@@ -1920,15 +1700,10 @@
         <w:tc>
           <w:tcPr>
             <w:tcW w:w="2448" w:type="dxa"/>
-            <w:tcMar>
-              <w:top w:w="80" w:type="dxa"/>
-              <w:left w:w="100" w:type="dxa"/>
-              <w:bottom w:w="80" w:type="dxa"/>
-              <w:right w:w="100" w:type="dxa"/>
-            </w:tcMar>
           </w:tcPr>
           <w:p>
             <w:pPr>
+              <w:cnfStyle w:val="000000000000" w:firstRow="0" w:lastRow="0" w:firstColumn="0" w:lastColumn="0" w:oddVBand="0" w:evenVBand="0" w:oddHBand="0" w:evenHBand="0" w:firstRowFirstColumn="0" w:firstRowLastColumn="0" w:lastRowFirstColumn="0" w:lastRowLastColumn="0"/>
               <w:rPr>
                 <w:rFonts w:cs="Arial"/>
                 <w:color w:val="000000" w:themeColor="text1"/>
@@ -1941,31 +1716,17 @@
                 <w:color w:val="000000" w:themeColor="text1"/>
                 <w:szCs w:val="24"/>
               </w:rPr>
-              <w:t xml:space="preserve">KQML exercise, reports, README </w:t>
-            </w:r>
-            <w:r>
-              <w:rPr>
-                <w:rFonts w:cs="Arial"/>
-                <w:color w:val="000000" w:themeColor="text1"/>
-                <w:szCs w:val="24"/>
-              </w:rPr>
-              <w:lastRenderedPageBreak/>
-              <w:t>and presentation</w:t>
+              <w:t>KQML exercise, reports, README and presentation</w:t>
             </w:r>
           </w:p>
         </w:tc>
         <w:tc>
           <w:tcPr>
             <w:tcW w:w="2448" w:type="dxa"/>
-            <w:tcMar>
-              <w:top w:w="80" w:type="dxa"/>
-              <w:left w:w="100" w:type="dxa"/>
-              <w:bottom w:w="80" w:type="dxa"/>
-              <w:right w:w="100" w:type="dxa"/>
-            </w:tcMar>
           </w:tcPr>
           <w:p>
             <w:pPr>
+              <w:cnfStyle w:val="000000000000" w:firstRow="0" w:lastRow="0" w:firstColumn="0" w:lastColumn="0" w:oddVBand="0" w:evenVBand="0" w:oddHBand="0" w:evenHBand="0" w:firstRowFirstColumn="0" w:firstRowLastColumn="0" w:lastRowFirstColumn="0" w:lastRowLastColumn="0"/>
               <w:rPr>
                 <w:rFonts w:cs="Arial"/>
                 <w:color w:val="000000" w:themeColor="text1"/>
@@ -1978,32 +1739,17 @@
                 <w:color w:val="000000" w:themeColor="text1"/>
                 <w:szCs w:val="24"/>
               </w:rPr>
-              <w:lastRenderedPageBreak/>
-              <w:t xml:space="preserve">Technical ideas expressed for </w:t>
-            </w:r>
-            <w:r>
-              <w:rPr>
-                <w:rFonts w:cs="Arial"/>
-                <w:color w:val="000000" w:themeColor="text1"/>
-                <w:szCs w:val="24"/>
-              </w:rPr>
-              <w:lastRenderedPageBreak/>
-              <w:t>different audiences</w:t>
+              <w:t>Technical ideas expressed for different audiences</w:t>
             </w:r>
           </w:p>
         </w:tc>
         <w:tc>
           <w:tcPr>
             <w:tcW w:w="2448" w:type="dxa"/>
-            <w:tcMar>
-              <w:top w:w="80" w:type="dxa"/>
-              <w:left w:w="100" w:type="dxa"/>
-              <w:bottom w:w="80" w:type="dxa"/>
-              <w:right w:w="100" w:type="dxa"/>
-            </w:tcMar>
           </w:tcPr>
           <w:p>
             <w:pPr>
+              <w:cnfStyle w:val="000000000000" w:firstRow="0" w:lastRow="0" w:firstColumn="0" w:lastColumn="0" w:oddVBand="0" w:evenVBand="0" w:oddHBand="0" w:evenHBand="0" w:firstRowFirstColumn="0" w:firstRowLastColumn="0" w:lastRowFirstColumn="0" w:lastRowLastColumn="0"/>
               <w:rPr>
                 <w:rFonts w:cs="Arial"/>
                 <w:color w:val="000000" w:themeColor="text1"/>
@@ -2016,17 +1762,7 @@
                 <w:color w:val="000000" w:themeColor="text1"/>
                 <w:szCs w:val="24"/>
               </w:rPr>
-              <w:lastRenderedPageBreak/>
-              <w:t xml:space="preserve">Practise shorter evidence-led </w:t>
-            </w:r>
-            <w:r>
-              <w:rPr>
-                <w:rFonts w:cs="Arial"/>
-                <w:color w:val="000000" w:themeColor="text1"/>
-                <w:szCs w:val="24"/>
-              </w:rPr>
-              <w:lastRenderedPageBreak/>
-              <w:t>demonstrations</w:t>
+              <w:t>Practise shorter evidence-led demonstrations</w:t>
             </w:r>
           </w:p>
         </w:tc>
@@ -2046,25 +1782,23 @@
           <w:color w:val="000000" w:themeColor="text1"/>
           <w:szCs w:val="24"/>
         </w:rPr>
-        <w:lastRenderedPageBreak/>
         <w:br w:type="page"/>
       </w:r>
     </w:p>
     <w:p>
       <w:pPr>
         <w:pStyle w:val="Heading1"/>
+        <w:spacing w:before="0"/>
         <w:rPr>
           <w:rFonts w:ascii="Arial" w:hAnsi="Arial" w:cs="Arial"/>
           <w:color w:val="000000" w:themeColor="text1"/>
-          <w:sz w:val="24"/>
           <w:szCs w:val="24"/>
         </w:rPr>
       </w:pPr>
       <w:r>
         <w:rPr>
-          <w:rFonts w:ascii="Arial" w:hAnsi="Arial" w:cs="Arial"/>
+          <w:rFonts w:ascii="Arial" w:eastAsia="Arial" w:hAnsi="Arial" w:cs="Arial"/>
           <w:color w:val="000000" w:themeColor="text1"/>
-          <w:sz w:val="24"/>
           <w:szCs w:val="24"/>
         </w:rPr>
         <w:lastRenderedPageBreak/>
@@ -2092,18 +1826,17 @@
     <w:p>
       <w:pPr>
         <w:pStyle w:val="Heading2"/>
+        <w:spacing w:before="0"/>
         <w:rPr>
           <w:rFonts w:ascii="Arial" w:hAnsi="Arial" w:cs="Arial"/>
           <w:color w:val="000000" w:themeColor="text1"/>
-          <w:sz w:val="24"/>
           <w:szCs w:val="24"/>
         </w:rPr>
       </w:pPr>
       <w:r>
         <w:rPr>
-          <w:rFonts w:ascii="Arial" w:hAnsi="Arial" w:cs="Arial"/>
+          <w:rFonts w:ascii="Arial" w:eastAsia="Arial" w:hAnsi="Arial" w:cs="Arial"/>
           <w:color w:val="000000" w:themeColor="text1"/>
-          <w:sz w:val="24"/>
           <w:szCs w:val="24"/>
         </w:rPr>
         <w:t>What?</w:t>
@@ -2119,12 +1852,7 @@
         </w:rPr>
       </w:pPr>
       <w:r>
-        <w:rPr>
-          <w:rFonts w:cs="Arial"/>
-          <w:color w:val="000000" w:themeColor="text1"/>
-          <w:szCs w:val="24"/>
-        </w:rPr>
-        <w:t>My central project was an Academic Research Agent that receives a research goal, plans searches, retrieves scholarly metadata, processes the results and stores an inspectable report. The implemented workflow separates planning, retrieval, processing and storage. It supports optional Ollama planning and OpenAlex for live retrieval, while deterministic fallback and an offline fixture make execution reproducible when a model or network service is unavailable. Eight automated tests passed, and the demonstration generated a Markdown report, JSON evidence and a workflow trace.</w:t>
+        <w:t>My central project was an Academic Research Agent that receives a research goal, plans searches, retrieves scholarly metadata, processes the results and stores an inspectable report. The implemented workflow separates planning, retrieval, processing and storage. It supports optional Ollama planning and OpenAlex for live retrieval, while deterministic fallback and an offline fixture make execution reproducible when a model or network service is unavailable. The final run reported 11 tests and eight subtests passing; the demonstration generated Markdown, JSON and workflow-trace outputs.</w:t>
       </w:r>
     </w:p>
     <w:p>
@@ -2160,7 +1888,7 @@
           <w:color w:val="000000" w:themeColor="text1"/>
           <w:szCs w:val="24"/>
         </w:rPr>
-        <w:t xml:space="preserve">My individual Group C contribution focused on development methodology and technology selection. I began with Agile prototyping and suggestions including SQLite and named development tools. Peer discussion challenged whether these decisions belonged in the architecture and whether they were proportionate to a lightweight prototype. I changed the proposal to an architecture-first method, accepted JSON </w:t>
+        <w:t xml:space="preserve">My individual Group C contribution focused on development methodology and technology selection. I began with Agile prototyping and suggestions including SQLite and named development tools. Peer discussion challenged whether these decisions belonged in the architecture and whether they were proportionate to a lightweight prototype. I changed the proposal to an architecture-first method, accepted JSON storage and removed avoidable provider and tooling dependencies. That change </w:t>
       </w:r>
       <w:r>
         <w:rPr>
@@ -2169,24 +1897,23 @@
           <w:szCs w:val="24"/>
         </w:rPr>
         <w:lastRenderedPageBreak/>
-        <w:t>storage and removed avoidable provider and tooling dependencies. That change became important during implementation because explicit component interfaces made the final system testable without requiring every external service.</w:t>
+        <w:t>became important during implementation because explicit component interfaces made the final system testable without requiring every external service.</w:t>
       </w:r>
     </w:p>
     <w:p>
       <w:pPr>
         <w:pStyle w:val="Heading2"/>
+        <w:spacing w:before="0"/>
         <w:rPr>
           <w:rFonts w:ascii="Arial" w:hAnsi="Arial" w:cs="Arial"/>
           <w:color w:val="000000" w:themeColor="text1"/>
-          <w:sz w:val="24"/>
           <w:szCs w:val="24"/>
         </w:rPr>
       </w:pPr>
       <w:r>
         <w:rPr>
-          <w:rFonts w:ascii="Arial" w:hAnsi="Arial" w:cs="Arial"/>
+          <w:rFonts w:ascii="Arial" w:eastAsia="Arial" w:hAnsi="Arial" w:cs="Arial"/>
           <w:color w:val="000000" w:themeColor="text1"/>
-          <w:sz w:val="24"/>
           <w:szCs w:val="24"/>
         </w:rPr>
         <w:t>So what?</w:t>
@@ -2243,7 +1970,7 @@
           <w:color w:val="000000" w:themeColor="text1"/>
           <w:szCs w:val="24"/>
         </w:rPr>
-        <w:t xml:space="preserve">Communication work produced a related insight. KQML can communicate intention, but shared syntax does not ensure shared semantics. Likewise, a pipeline can successfully pass a record between components even when that record is irrelevant or misleading. The Unit 8 ambiguous parse reinforced this distinction between valid structure and </w:t>
+        <w:t xml:space="preserve">Communication work produced a related insight. KQML can communicate intention, but shared syntax does not ensure shared semantics. Likewise, a pipeline can successfully pass a record between components even when that record is irrelevant or misleading. The Unit 8 ambiguous parse reinforced this distinction between valid structure and justified meaning. In the research agent, typed records support structural consistency, </w:t>
       </w:r>
       <w:r>
         <w:rPr>
@@ -2252,7 +1979,7 @@
           <w:szCs w:val="24"/>
         </w:rPr>
         <w:lastRenderedPageBreak/>
-        <w:t>justified meaning. In the research agent, typed records support structural consistency, while provenance and human review address meaning and evidence quality. Neither substitutes for the other.</w:t>
+        <w:t>while provenance and human review address meaning and evidence quality. Neither substitutes for the other.</w:t>
       </w:r>
     </w:p>
     <w:p>
@@ -2283,12 +2010,20 @@
         </w:rPr>
       </w:pPr>
       <w:r>
+        <w:t>The strongest evidence of my technical development is the path from a design contribution to executable, tested components. I can now define agent boundaries, use replaceable dependencies, validate model output, design deterministic fallbacks and capture execution evidence. My weakest area remains empirical evaluation. The current ranking uses transparent proxies rather than a labelled real-world relevance dataset, and I did not conduct a user study. Acknowledging these limits is more useful than overstating the prototype as a complete systematic-review tool.</w:t>
+      </w:r>
+    </w:p>
+    <w:p>
+      <w:pPr>
+        <w:jc w:val="both"/>
         <w:rPr>
           <w:rFonts w:cs="Arial"/>
           <w:color w:val="000000" w:themeColor="text1"/>
           <w:szCs w:val="24"/>
         </w:rPr>
-        <w:t>The strongest evidence of my technical development is the path from a design contribution to executable, tested components. I can now define agent boundaries, inject replaceable dependencies, validate model output, design deterministic fallbacks and capture execution evidence. My weakest area remains empirical evaluation. The current ranking uses transparent proxies rather than a labelled real-world relevance dataset, and I did not conduct a user study. Acknowledging these limits is more useful than overstating the prototype as a complete systematic-review tool.</w:t>
+      </w:pPr>
+      <w:r>
+        <w:t>Final verification revealed another important lesson. An earlier stored test record did not match clean test discovery, so I reconciled the suite and evidence until the final run reported 11 tests and eight subtests passing. I also corrected the retrieval-evaluation outputs so synthetic fixture identifiers were no longer presented as resolvable scholarly DOI links. These checks showed that documentation can drift from executable reality. I now regard a fresh, repeatable validation run as part of the deliverable rather than a final administrative check.</w:t>
       </w:r>
     </w:p>
     <w:p>
@@ -2306,51 +2041,24 @@
           <w:color w:val="000000" w:themeColor="text1"/>
           <w:szCs w:val="24"/>
         </w:rPr>
-        <w:t xml:space="preserve">Final verification exposed another important lesson. An earlier stored test record did not match clean test discovery, so I reconciled the suite, added missing coverage and regenerated the evidence until the project reported eight passing tests. I also corrected the retrieval-evaluation outputs so synthetic fixture identifiers were no longer presented as resolvable scholarly DOI links. These checks showed that documentation can drift </w:t>
-      </w:r>
-      <w:r>
-        <w:rPr>
-          <w:rFonts w:cs="Arial"/>
-          <w:color w:val="000000" w:themeColor="text1"/>
-          <w:szCs w:val="24"/>
-        </w:rPr>
         <w:lastRenderedPageBreak/>
-        <w:t>from executable reality. I now regard a fresh, repeatable validation run as part of the deliverable rather than a final administrative check.</w:t>
-      </w:r>
-    </w:p>
-    <w:p>
-      <w:pPr>
-        <w:jc w:val="both"/>
-        <w:rPr>
-          <w:rFonts w:cs="Arial"/>
-          <w:color w:val="000000" w:themeColor="text1"/>
-          <w:szCs w:val="24"/>
-        </w:rPr>
-      </w:pPr>
-      <w:r>
-        <w:rPr>
-          <w:rFonts w:cs="Arial"/>
-          <w:color w:val="000000" w:themeColor="text1"/>
-          <w:szCs w:val="24"/>
-        </w:rPr>
         <w:t>Team participation also altered my working practice. My peer responses across the discussions introduced coordination risk, ontology alignment, representative testing, privacy and provenance into my conclusions. In Group C, simplifying storage and decoupling providers resulted from collaborative review. I learned that effective virtual teamwork requires visible reasoning and willingness to update decisions. In future, I would maintain a decision log recording options, evidence, owners and acceptance criteria so contribution and accountability are easier to evaluate.</w:t>
       </w:r>
     </w:p>
     <w:p>
       <w:pPr>
         <w:pStyle w:val="Heading2"/>
+        <w:spacing w:before="0"/>
         <w:rPr>
           <w:rFonts w:ascii="Arial" w:hAnsi="Arial" w:cs="Arial"/>
           <w:color w:val="000000" w:themeColor="text1"/>
-          <w:sz w:val="24"/>
           <w:szCs w:val="24"/>
         </w:rPr>
       </w:pPr>
       <w:r>
         <w:rPr>
-          <w:rFonts w:ascii="Arial" w:hAnsi="Arial" w:cs="Arial"/>
+          <w:rFonts w:ascii="Arial" w:eastAsia="Arial" w:hAnsi="Arial" w:cs="Arial"/>
           <w:color w:val="000000" w:themeColor="text1"/>
-          <w:sz w:val="24"/>
           <w:szCs w:val="24"/>
         </w:rPr>
         <w:t>Now what?</w:t>
@@ -2389,16 +2097,7 @@
           <w:color w:val="000000" w:themeColor="text1"/>
           <w:szCs w:val="24"/>
         </w:rPr>
-        <w:t xml:space="preserve">Professionally, I will begin future intelligent-agent projects with three questions: what behaviour is required, what evidence demonstrates it, and what boundary limits harm when assumptions fail? I will separate architectural requirements from preferred tools, make uncertainty visible and preserve human approval for consequential actions. The module has therefore changed my conception of a successful agent from one that </w:t>
-      </w:r>
-      <w:r>
-        <w:rPr>
-          <w:rFonts w:cs="Arial"/>
-          <w:color w:val="000000" w:themeColor="text1"/>
-          <w:szCs w:val="24"/>
-        </w:rPr>
-        <w:lastRenderedPageBreak/>
-        <w:t>completes a task to one whose actions, limitations and responsibilities can be examined and governed.</w:t>
+        <w:t>Professionally, I will begin future intelligent-agent projects with three questions: what behaviour is required, what evidence demonstrates it, and what boundary limits harm when assumptions fail? I will separate architectural requirements from preferred tools, make uncertainty visible and preserve human approval for consequential actions. The module has therefore changed my conception of a successful agent from one that completes a task to one whose actions, limitations and responsibilities can be examined and governed.</w:t>
       </w:r>
     </w:p>
     <w:p>
@@ -2421,18 +2120,18 @@
     <w:p>
       <w:pPr>
         <w:pStyle w:val="Heading1"/>
-        <w:rPr>
-          <w:rFonts w:ascii="Arial" w:hAnsi="Arial" w:cs="Arial"/>
+        <w:spacing w:before="120" w:after="120"/>
+        <w:jc w:val="both"/>
+        <w:rPr>
+          <w:rFonts w:ascii="Arial" w:eastAsia="Arial" w:hAnsi="Arial" w:cs="Arial"/>
           <w:color w:val="000000" w:themeColor="text1"/>
-          <w:sz w:val="24"/>
           <w:szCs w:val="24"/>
         </w:rPr>
       </w:pPr>
       <w:r>
         <w:rPr>
-          <w:rFonts w:ascii="Arial" w:hAnsi="Arial" w:cs="Arial"/>
+          <w:rFonts w:ascii="Arial" w:eastAsia="Arial" w:hAnsi="Arial" w:cs="Arial"/>
           <w:color w:val="000000" w:themeColor="text1"/>
-          <w:sz w:val="24"/>
           <w:szCs w:val="24"/>
         </w:rPr>
         <w:lastRenderedPageBreak/>
@@ -2441,459 +2140,873 @@
     </w:p>
     <w:p>
       <w:pPr>
-        <w:spacing w:after="120"/>
-        <w:rPr>
-          <w:rFonts w:cs="Arial"/>
-          <w:color w:val="000000" w:themeColor="text1"/>
-          <w:szCs w:val="24"/>
+        <w:pStyle w:val="NormalWeb"/>
+        <w:spacing w:before="120" w:beforeAutospacing="0" w:after="120" w:afterAutospacing="0" w:line="480" w:lineRule="auto"/>
+        <w:jc w:val="both"/>
+        <w:rPr>
+          <w:b/>
+          <w:bCs/>
         </w:rPr>
       </w:pPr>
       <w:r>
         <w:rPr>
-          <w:rFonts w:cs="Arial"/>
-          <w:color w:val="000000" w:themeColor="text1"/>
-          <w:szCs w:val="24"/>
+          <w:rStyle w:val="Strong"/>
+          <w:b w:val="0"/>
+          <w:bCs w:val="0"/>
         </w:rPr>
         <w:t xml:space="preserve">Group C (2026) </w:t>
       </w:r>
       <w:r>
         <w:rPr>
-          <w:rFonts w:cs="Arial"/>
-          <w:i/>
-          <w:color w:val="000000" w:themeColor="text1"/>
-          <w:szCs w:val="24"/>
+          <w:rStyle w:val="Emphasis"/>
+          <w:b/>
+          <w:bCs/>
         </w:rPr>
         <w:t>Design Proposal for an Academic and Information Gathering Multi-Agent Artificial Intelligence Tool</w:t>
       </w:r>
       <w:r>
         <w:rPr>
-          <w:rFonts w:cs="Arial"/>
-          <w:color w:val="000000" w:themeColor="text1"/>
-          <w:szCs w:val="24"/>
-        </w:rPr>
-        <w:t>. University of Essex Online, Intelligent Agents module.</w:t>
+          <w:rStyle w:val="Strong"/>
+          <w:b w:val="0"/>
+          <w:bCs w:val="0"/>
+        </w:rPr>
+        <w:t>. Unpublished group design proposal. University of Essex Online.</w:t>
       </w:r>
     </w:p>
     <w:p>
       <w:pPr>
-        <w:spacing w:after="120"/>
-        <w:rPr>
-          <w:rFonts w:cs="Arial"/>
-          <w:color w:val="000000" w:themeColor="text1"/>
-          <w:szCs w:val="24"/>
+        <w:pStyle w:val="NormalWeb"/>
+        <w:spacing w:line="480" w:lineRule="auto"/>
+        <w:jc w:val="both"/>
+        <w:rPr>
+          <w:b/>
+          <w:bCs/>
         </w:rPr>
       </w:pPr>
       <w:r>
         <w:rPr>
-          <w:rFonts w:cs="Arial"/>
-          <w:color w:val="000000" w:themeColor="text1"/>
-          <w:szCs w:val="24"/>
-        </w:rPr>
-        <w:t xml:space="preserve">Jennings, N.R. (2000) 'On </w:t>
-      </w:r>
-      <w:proofErr w:type="gramStart"/>
-      <w:r>
-        <w:rPr>
-          <w:rFonts w:cs="Arial"/>
-          <w:color w:val="000000" w:themeColor="text1"/>
-          <w:szCs w:val="24"/>
-        </w:rPr>
-        <w:t>agent based</w:t>
-      </w:r>
-      <w:proofErr w:type="gramEnd"/>
-      <w:r>
-        <w:rPr>
-          <w:rFonts w:cs="Arial"/>
-          <w:color w:val="000000" w:themeColor="text1"/>
-          <w:szCs w:val="24"/>
-        </w:rPr>
-        <w:t xml:space="preserve"> software engineering', </w:t>
+          <w:rStyle w:val="Strong"/>
+          <w:b w:val="0"/>
+          <w:bCs w:val="0"/>
+        </w:rPr>
+        <w:t xml:space="preserve">Jennings, N.R. (2000) ‘On agent-based software engineering’, </w:t>
       </w:r>
       <w:r>
         <w:rPr>
-          <w:rFonts w:cs="Arial"/>
-          <w:i/>
-          <w:color w:val="000000" w:themeColor="text1"/>
-          <w:szCs w:val="24"/>
+          <w:rStyle w:val="Emphasis"/>
+          <w:b/>
+          <w:bCs/>
         </w:rPr>
         <w:t>Artificial Intelligence</w:t>
       </w:r>
       <w:r>
         <w:rPr>
-          <w:rFonts w:cs="Arial"/>
-          <w:color w:val="000000" w:themeColor="text1"/>
-          <w:szCs w:val="24"/>
-        </w:rPr>
-        <w:t>, 117(2), pp. 277–296.</w:t>
+          <w:rStyle w:val="Strong"/>
+          <w:b w:val="0"/>
+          <w:bCs w:val="0"/>
+        </w:rPr>
+        <w:t xml:space="preserve">, 117(2), pp. 277–296. Available at: </w:t>
+      </w:r>
+      <w:hyperlink r:id="rId9" w:history="1">
+        <w:r>
+          <w:rPr>
+            <w:rStyle w:val="Hyperlink"/>
+            <w:b/>
+            <w:bCs/>
+          </w:rPr>
+          <w:t>https://doi.org/10.1016/S0004-3702(99)00107-1</w:t>
+        </w:r>
+      </w:hyperlink>
+      <w:r>
+        <w:rPr>
+          <w:rStyle w:val="Strong"/>
+          <w:b w:val="0"/>
+          <w:bCs w:val="0"/>
+        </w:rPr>
+        <w:t xml:space="preserve"> (Accessed: 17 October 2026).</w:t>
       </w:r>
     </w:p>
     <w:p>
       <w:pPr>
-        <w:spacing w:after="120"/>
-        <w:rPr>
-          <w:rFonts w:cs="Arial"/>
-          <w:color w:val="000000" w:themeColor="text1"/>
-          <w:szCs w:val="24"/>
+        <w:pStyle w:val="NormalWeb"/>
+        <w:spacing w:line="480" w:lineRule="auto"/>
+        <w:jc w:val="both"/>
+        <w:rPr>
+          <w:b/>
+          <w:bCs/>
         </w:rPr>
       </w:pPr>
       <w:r>
         <w:rPr>
-          <w:rFonts w:cs="Arial"/>
-          <w:color w:val="000000" w:themeColor="text1"/>
-          <w:szCs w:val="24"/>
+          <w:rStyle w:val="Strong"/>
+          <w:b w:val="0"/>
+          <w:bCs w:val="0"/>
         </w:rPr>
         <w:t xml:space="preserve">National Institute of Standards and Technology (NIST) (2024) </w:t>
       </w:r>
       <w:r>
         <w:rPr>
-          <w:rFonts w:cs="Arial"/>
-          <w:i/>
-          <w:color w:val="000000" w:themeColor="text1"/>
-          <w:szCs w:val="24"/>
+          <w:rStyle w:val="Emphasis"/>
+          <w:b/>
+          <w:bCs/>
         </w:rPr>
         <w:t>Artificial Intelligence Risk Management Framework: Generative Artificial Intelligence Profile</w:t>
       </w:r>
       <w:r>
         <w:rPr>
-          <w:rFonts w:cs="Arial"/>
-          <w:color w:val="000000" w:themeColor="text1"/>
-          <w:szCs w:val="24"/>
-        </w:rPr>
-        <w:t>. NIST AI 600-1. Gaithersburg, MD: NIST. Available from: https://doi.org/10.6028/NIST.AI.600-1 [Accessed 29 September 2026].</w:t>
+          <w:rStyle w:val="Strong"/>
+          <w:b w:val="0"/>
+          <w:bCs w:val="0"/>
+        </w:rPr>
+        <w:t xml:space="preserve">. NIST AI 600-1. Gaithersburg, MD: National Institute of Standards and Technology. Available at: </w:t>
+      </w:r>
+      <w:hyperlink r:id="rId10" w:history="1">
+        <w:r>
+          <w:rPr>
+            <w:rStyle w:val="Hyperlink"/>
+            <w:b/>
+            <w:bCs/>
+          </w:rPr>
+          <w:t>https://doi.org/10.6028/NIST.AI.600-1</w:t>
+        </w:r>
+      </w:hyperlink>
+      <w:r>
+        <w:rPr>
+          <w:rStyle w:val="Strong"/>
+          <w:b w:val="0"/>
+          <w:bCs w:val="0"/>
+        </w:rPr>
+        <w:t xml:space="preserve"> (Accessed: 29 September 2026).</w:t>
       </w:r>
     </w:p>
     <w:p>
       <w:pPr>
-        <w:spacing w:after="120"/>
-        <w:rPr>
-          <w:rFonts w:cs="Arial"/>
-          <w:color w:val="000000" w:themeColor="text1"/>
-          <w:szCs w:val="24"/>
+        <w:pStyle w:val="NormalWeb"/>
+        <w:spacing w:line="480" w:lineRule="auto"/>
+        <w:jc w:val="both"/>
+        <w:rPr>
+          <w:b/>
+          <w:bCs/>
         </w:rPr>
       </w:pPr>
       <w:r>
         <w:rPr>
-          <w:rFonts w:cs="Arial"/>
-          <w:color w:val="000000" w:themeColor="text1"/>
-          <w:szCs w:val="24"/>
+          <w:rStyle w:val="Strong"/>
+          <w:b w:val="0"/>
+          <w:bCs w:val="0"/>
         </w:rPr>
         <w:t xml:space="preserve">Rolfe, G., Freshwater, D. and Jasper, M. (2001) </w:t>
       </w:r>
       <w:r>
         <w:rPr>
-          <w:rFonts w:cs="Arial"/>
-          <w:i/>
-          <w:color w:val="000000" w:themeColor="text1"/>
-          <w:szCs w:val="24"/>
-        </w:rPr>
-        <w:t>Critical reflection in nursing and the helping professions: a user's guide</w:t>
+          <w:rStyle w:val="Emphasis"/>
+          <w:b/>
+          <w:bCs/>
+        </w:rPr>
+        <w:t>Critical reflection in nursing and the helping professions: a user’s guide</w:t>
       </w:r>
       <w:r>
         <w:rPr>
-          <w:rFonts w:cs="Arial"/>
-          <w:color w:val="000000" w:themeColor="text1"/>
-          <w:szCs w:val="24"/>
+          <w:rStyle w:val="Strong"/>
+          <w:b w:val="0"/>
+          <w:bCs w:val="0"/>
         </w:rPr>
         <w:t>. Basingstoke: Palgrave Macmillan.</w:t>
       </w:r>
     </w:p>
     <w:p>
       <w:pPr>
-        <w:spacing w:after="120"/>
-        <w:rPr>
-          <w:rFonts w:cs="Arial"/>
-          <w:color w:val="000000" w:themeColor="text1"/>
-          <w:szCs w:val="24"/>
+        <w:pStyle w:val="NormalWeb"/>
+        <w:spacing w:line="480" w:lineRule="auto"/>
+        <w:jc w:val="both"/>
+        <w:rPr>
+          <w:b/>
+          <w:bCs/>
         </w:rPr>
       </w:pPr>
       <w:r>
         <w:rPr>
-          <w:rFonts w:cs="Arial"/>
-          <w:color w:val="000000" w:themeColor="text1"/>
-          <w:szCs w:val="24"/>
+          <w:rStyle w:val="Strong"/>
+          <w:b w:val="0"/>
+          <w:bCs w:val="0"/>
         </w:rPr>
         <w:t xml:space="preserve">Russell, S.J. and Norvig, P. (2021) </w:t>
       </w:r>
       <w:r>
         <w:rPr>
-          <w:rFonts w:cs="Arial"/>
-          <w:i/>
-          <w:color w:val="000000" w:themeColor="text1"/>
-          <w:szCs w:val="24"/>
+          <w:rStyle w:val="Emphasis"/>
+          <w:b/>
+          <w:bCs/>
         </w:rPr>
         <w:t>Artificial Intelligence: A Modern Approach</w:t>
       </w:r>
       <w:r>
         <w:rPr>
-          <w:rFonts w:cs="Arial"/>
-          <w:color w:val="000000" w:themeColor="text1"/>
-          <w:szCs w:val="24"/>
+          <w:rStyle w:val="Strong"/>
+          <w:b w:val="0"/>
+          <w:bCs w:val="0"/>
         </w:rPr>
         <w:t>. 4th edn. Harlow: Pearson Education.</w:t>
       </w:r>
     </w:p>
     <w:p>
       <w:pPr>
-        <w:spacing w:after="120"/>
-        <w:rPr>
-          <w:rFonts w:cs="Arial"/>
-          <w:color w:val="000000" w:themeColor="text1"/>
-          <w:szCs w:val="24"/>
+        <w:pStyle w:val="NormalWeb"/>
+        <w:spacing w:line="480" w:lineRule="auto"/>
+        <w:jc w:val="both"/>
+        <w:rPr>
+          <w:b/>
+          <w:bCs/>
         </w:rPr>
       </w:pPr>
       <w:r>
         <w:rPr>
-          <w:rFonts w:cs="Arial"/>
-          <w:color w:val="000000" w:themeColor="text1"/>
-          <w:szCs w:val="24"/>
-        </w:rPr>
-        <w:t xml:space="preserve">Walters, W.H. and Wilder, E.I. (2023) 'Fabrication and errors in the bibliographic citations generated by ChatGPT', </w:t>
+          <w:rStyle w:val="Strong"/>
+          <w:b w:val="0"/>
+          <w:bCs w:val="0"/>
+        </w:rPr>
+        <w:t xml:space="preserve">Walters, W.H. and Wilder, E.I. (2023) ‘Fabrication and errors in the bibliographic citations generated by ChatGPT’, </w:t>
       </w:r>
       <w:r>
         <w:rPr>
-          <w:rFonts w:cs="Arial"/>
-          <w:i/>
-          <w:color w:val="000000" w:themeColor="text1"/>
-          <w:szCs w:val="24"/>
+          <w:rStyle w:val="Emphasis"/>
+          <w:b/>
+          <w:bCs/>
         </w:rPr>
         <w:t>Scientific Reports</w:t>
       </w:r>
       <w:r>
         <w:rPr>
-          <w:rFonts w:cs="Arial"/>
-          <w:color w:val="000000" w:themeColor="text1"/>
-          <w:szCs w:val="24"/>
-        </w:rPr>
-        <w:t>, 13, article 14045. Available from: https://doi.org/10.1038/s41598-023-41032-5 [Accessed 29 September 2026].</w:t>
+          <w:rStyle w:val="Strong"/>
+          <w:b w:val="0"/>
+          <w:bCs w:val="0"/>
+        </w:rPr>
+        <w:t xml:space="preserve">, 13, article 14045. Available at: </w:t>
+      </w:r>
+      <w:hyperlink r:id="rId11" w:history="1">
+        <w:r>
+          <w:rPr>
+            <w:rStyle w:val="Hyperlink"/>
+            <w:b/>
+            <w:bCs/>
+          </w:rPr>
+          <w:t>https://doi.org/10.1038/s41598-023-41032-5</w:t>
+        </w:r>
+      </w:hyperlink>
+      <w:r>
+        <w:rPr>
+          <w:rStyle w:val="Strong"/>
+          <w:b w:val="0"/>
+          <w:bCs w:val="0"/>
+        </w:rPr>
+        <w:t xml:space="preserve"> (Accessed: 29 September 2026).</w:t>
       </w:r>
     </w:p>
     <w:p>
       <w:pPr>
-        <w:spacing w:after="120"/>
-        <w:rPr>
-          <w:rFonts w:cs="Arial"/>
-          <w:color w:val="000000" w:themeColor="text1"/>
-          <w:szCs w:val="24"/>
+        <w:pStyle w:val="NormalWeb"/>
+        <w:spacing w:line="480" w:lineRule="auto"/>
+        <w:jc w:val="both"/>
+        <w:rPr>
+          <w:b/>
+          <w:bCs/>
         </w:rPr>
       </w:pPr>
       <w:r>
         <w:rPr>
-          <w:rFonts w:cs="Arial"/>
-          <w:color w:val="000000" w:themeColor="text1"/>
-          <w:szCs w:val="24"/>
-        </w:rPr>
-        <w:t xml:space="preserve">Wooldridge, M.J. and Jennings, N.R. (1995) 'Intelligent agents: theory and practice', </w:t>
+          <w:rStyle w:val="Strong"/>
+          <w:b w:val="0"/>
+          <w:bCs w:val="0"/>
+        </w:rPr>
+        <w:lastRenderedPageBreak/>
+        <w:t xml:space="preserve">Wooldridge, M.J. and Jennings, N.R. (1995) ‘Intelligent agents: theory and practice’, </w:t>
       </w:r>
       <w:r>
         <w:rPr>
-          <w:rFonts w:cs="Arial"/>
-          <w:i/>
-          <w:color w:val="000000" w:themeColor="text1"/>
-          <w:szCs w:val="24"/>
+          <w:rStyle w:val="Emphasis"/>
+          <w:b/>
+          <w:bCs/>
         </w:rPr>
         <w:t>The Knowledge Engineering Review</w:t>
       </w:r>
       <w:r>
         <w:rPr>
-          <w:rFonts w:cs="Arial"/>
+          <w:rStyle w:val="Strong"/>
+          <w:b w:val="0"/>
+          <w:bCs w:val="0"/>
+        </w:rPr>
+        <w:t xml:space="preserve">, 10(2), pp. 115–152. Available at: </w:t>
+      </w:r>
+      <w:hyperlink r:id="rId12" w:history="1">
+        <w:r>
+          <w:rPr>
+            <w:rStyle w:val="Hyperlink"/>
+            <w:b/>
+            <w:bCs/>
+          </w:rPr>
+          <w:t>https://doi.org/10.1017/S0269888900008122</w:t>
+        </w:r>
+      </w:hyperlink>
+      <w:r>
+        <w:rPr>
+          <w:rStyle w:val="Strong"/>
+          <w:b w:val="0"/>
+          <w:bCs w:val="0"/>
+        </w:rPr>
+        <w:t xml:space="preserve"> (Accessed: 17 October 2026).</w:t>
+      </w:r>
+    </w:p>
+    <w:p/>
+    <w:p>
+      <w:pPr>
+        <w:pStyle w:val="Heading1"/>
+        <w:pageBreakBefore/>
+        <w:spacing w:before="0"/>
+        <w:rPr>
+          <w:rFonts w:ascii="Arial" w:hAnsi="Arial" w:cs="Arial"/>
           <w:color w:val="000000" w:themeColor="text1"/>
           <w:szCs w:val="24"/>
         </w:rPr>
-        <w:t>, 10(2), pp. 115–152.</w:t>
+      </w:pPr>
+      <w:r>
+        <w:rPr>
+          <w:rFonts w:ascii="Arial" w:eastAsia="Arial" w:hAnsi="Arial"/>
+          <w:color w:val="000000" w:themeColor="text1"/>
+        </w:rPr>
+        <w:lastRenderedPageBreak/>
+        <w:t>Appendix A – Evidence Index</w:t>
       </w:r>
     </w:p>
     <w:p>
       <w:pPr>
-        <w:spacing w:after="120"/>
-        <w:rPr>
-          <w:rFonts w:cs="Arial"/>
-          <w:color w:val="000000" w:themeColor="text1"/>
-          <w:szCs w:val="24"/>
-        </w:rPr>
-      </w:pPr>
-    </w:p>
-    <w:p>
-      <w:pPr>
-        <w:pStyle w:val="Heading1"/>
-        <w:rPr>
-          <w:rFonts w:ascii="Arial" w:hAnsi="Arial" w:cs="Arial"/>
-          <w:color w:val="000000" w:themeColor="text1"/>
-          <w:sz w:val="24"/>
-          <w:szCs w:val="24"/>
-        </w:rPr>
-      </w:pPr>
-      <w:r>
-        <w:rPr>
-          <w:rFonts w:ascii="Arial" w:hAnsi="Arial" w:cs="Arial"/>
-          <w:color w:val="000000" w:themeColor="text1"/>
-          <w:sz w:val="24"/>
-          <w:szCs w:val="24"/>
-        </w:rPr>
-        <w:lastRenderedPageBreak/>
-        <w:t>Evidence Index</w:t>
-      </w:r>
-    </w:p>
-    <w:p>
-      <w:pPr>
         <w:pStyle w:val="ListBullet"/>
-        <w:rPr>
-          <w:rFonts w:cs="Arial"/>
-          <w:color w:val="000000" w:themeColor="text1"/>
-          <w:szCs w:val="24"/>
-        </w:rPr>
-      </w:pPr>
-      <w:hyperlink r:id="rId9">
+      </w:pPr>
+      <w:hyperlink r:id="rId13" w:history="1">
         <w:r>
           <w:rPr>
-            <w:rFonts w:cs="Arial"/>
-            <w:color w:val="000000" w:themeColor="text1"/>
-            <w:szCs w:val="24"/>
-            <w:u w:val="single"/>
+            <w:rStyle w:val="Hyperlink"/>
           </w:rPr>
-          <w:t>Units 1–3: Collaborative Discussion 1 – initial post, peer responses and summary post</w:t>
+          <w:t>Units 1 – 3 – Collaborative Discussion 1 Evidence</w:t>
         </w:r>
       </w:hyperlink>
     </w:p>
     <w:p>
       <w:pPr>
         <w:pStyle w:val="ListBullet"/>
-        <w:rPr>
-          <w:rFonts w:cs="Arial"/>
-          <w:color w:val="000000" w:themeColor="text1"/>
-          <w:szCs w:val="24"/>
-        </w:rPr>
-      </w:pPr>
-      <w:hyperlink r:id="rId10">
+      </w:pPr>
+      <w:hyperlink r:id="rId14" w:history="1">
         <w:r>
           <w:rPr>
-            <w:rFonts w:cs="Arial"/>
-            <w:color w:val="000000" w:themeColor="text1"/>
-            <w:szCs w:val="24"/>
-            <w:u w:val="single"/>
+            <w:rStyle w:val="Hyperlink"/>
           </w:rPr>
-          <w:t>Units 5–7: Collaborative Discussion 2 and KQML/KIF agent-dialogue evidence</w:t>
+          <w:t>Unit 6 KQML/KIF agent dialogue</w:t>
+        </w:r>
+      </w:hyperlink>
+      <w:r>
+        <w:rPr>
+          <w:color w:val="0563C1"/>
+          <w:u w:val="single"/>
+        </w:rPr>
+        <w:t xml:space="preserve"> </w:t>
+      </w:r>
+    </w:p>
+    <w:p>
+      <w:pPr>
+        <w:pStyle w:val="ListBullet"/>
+      </w:pPr>
+      <w:hyperlink r:id="rId15" w:history="1">
+        <w:r>
+          <w:rPr>
+            <w:rStyle w:val="Hyperlink"/>
+          </w:rPr>
+          <w:t>Units 5 – 9 Collaborative Discussion 2</w:t>
         </w:r>
       </w:hyperlink>
     </w:p>
     <w:p>
       <w:pPr>
         <w:pStyle w:val="ListBullet"/>
-        <w:rPr>
-          <w:rFonts w:cs="Arial"/>
-          <w:color w:val="000000" w:themeColor="text1"/>
-          <w:szCs w:val="24"/>
-        </w:rPr>
-      </w:pPr>
-      <w:hyperlink r:id="rId11">
+      </w:pPr>
+      <w:hyperlink r:id="rId16" w:history="1">
         <w:r>
           <w:rPr>
-            <w:rFonts w:cs="Arial"/>
-            <w:color w:val="000000" w:themeColor="text1"/>
-            <w:szCs w:val="24"/>
-            <w:u w:val="single"/>
+            <w:rStyle w:val="Hyperlink"/>
           </w:rPr>
-          <w:t>Unit 8: Constituency parse trees and ambiguity analysis</w:t>
+          <w:t>Unit 8 – Constituency parse trees and ambiguity analysis</w:t>
         </w:r>
       </w:hyperlink>
     </w:p>
     <w:p>
       <w:pPr>
         <w:pStyle w:val="ListBullet"/>
-        <w:rPr>
-          <w:rFonts w:cs="Arial"/>
-          <w:color w:val="000000" w:themeColor="text1"/>
-          <w:szCs w:val="24"/>
-        </w:rPr>
-      </w:pPr>
-      <w:hyperlink r:id="rId12">
+      </w:pPr>
+      <w:hyperlink r:id="rId17" w:history="1">
         <w:r>
           <w:rPr>
-            <w:rFonts w:cs="Arial"/>
-            <w:color w:val="000000" w:themeColor="text1"/>
-            <w:szCs w:val="24"/>
-            <w:u w:val="single"/>
+            <w:rStyle w:val="Hyperlink"/>
           </w:rPr>
-          <w:t>Units 9–11: Collaborative Discussion 3, ethics and reflection evidence</w:t>
+          <w:t>Units 9 -11 – Collaborative Discussion 3/formative activity Evidence</w:t>
         </w:r>
       </w:hyperlink>
     </w:p>
     <w:p>
       <w:pPr>
         <w:pStyle w:val="ListBullet"/>
-        <w:rPr>
-          <w:rFonts w:cs="Arial"/>
-          <w:color w:val="000000" w:themeColor="text1"/>
-          <w:szCs w:val="24"/>
-        </w:rPr>
-      </w:pPr>
-      <w:hyperlink r:id="rId13">
+      </w:pPr>
+      <w:hyperlink r:id="rId18" w:history="1">
         <w:r>
           <w:rPr>
-            <w:rFonts w:cs="Arial"/>
-            <w:color w:val="000000" w:themeColor="text1"/>
-            <w:szCs w:val="24"/>
-            <w:u w:val="single"/>
+            <w:rStyle w:val="Hyperlink"/>
           </w:rPr>
-          <w:t>Group C project: design proposal, peer evaluation, team discussion/reflection and individual methodology contribution</w:t>
+          <w:t>Group C project – design, peer evaluation, discussion/reflection and individual contribution</w:t>
         </w:r>
       </w:hyperlink>
     </w:p>
     <w:p>
       <w:pPr>
         <w:pStyle w:val="ListBullet"/>
-        <w:rPr>
-          <w:rFonts w:cs="Arial"/>
-          <w:color w:val="000000" w:themeColor="text1"/>
-          <w:szCs w:val="24"/>
-        </w:rPr>
-      </w:pPr>
-      <w:hyperlink r:id="rId14">
+      </w:pPr>
+      <w:hyperlink r:id="rId19" w:history="1">
         <w:r>
           <w:rPr>
-            <w:rFonts w:cs="Arial"/>
-            <w:color w:val="000000" w:themeColor="text1"/>
-            <w:szCs w:val="24"/>
-            <w:u w:val="single"/>
+            <w:rStyle w:val="Hyperlink"/>
           </w:rPr>
-          <w:t>Unit 11: Academic Research Agent source, tests, README, execution evidence, presentation and transcript</w:t>
+          <w:t>Unit 11 – Academic Research Agent source, tests, README and execution evidence</w:t>
         </w:r>
       </w:hyperlink>
     </w:p>
     <w:p>
       <w:pPr>
-        <w:rPr>
-          <w:rFonts w:cs="Arial"/>
-          <w:color w:val="000000" w:themeColor="text1"/>
-          <w:szCs w:val="24"/>
-        </w:rPr>
+        <w:pStyle w:val="ListBullet"/>
       </w:pPr>
       <w:r>
-        <w:rPr>
-          <w:rFonts w:cs="Arial"/>
-          <w:b/>
-          <w:color w:val="000000" w:themeColor="text1"/>
-          <w:szCs w:val="24"/>
-        </w:rPr>
-        <w:t xml:space="preserve">Portfolio home: </w:t>
+        <w:t>E-Portfolio home:</w:t>
       </w:r>
-      <w:hyperlink r:id="rId15">
+      <w:r>
+        <w:t xml:space="preserve"> </w:t>
+      </w:r>
+      <w:hyperlink r:id="rId20" w:history="1">
         <w:r>
           <w:rPr>
-            <w:rFonts w:cs="Arial"/>
-            <w:color w:val="000000" w:themeColor="text1"/>
-            <w:szCs w:val="24"/>
-            <w:u w:val="single"/>
+            <w:rStyle w:val="Hyperlink"/>
           </w:rPr>
           <w:t>https://ie25073.github.io/</w:t>
         </w:r>
       </w:hyperlink>
+      <w:r>
+        <w:t xml:space="preserve"> </w:t>
+      </w:r>
+    </w:p>
+    <w:p>
+      <w:pPr>
+        <w:pStyle w:val="Heading1"/>
+        <w:pageBreakBefore/>
+        <w:rPr>
+          <w:color w:val="000000" w:themeColor="text1"/>
+        </w:rPr>
+      </w:pPr>
+      <w:r>
+        <w:rPr>
+          <w:rFonts w:ascii="Arial" w:hAnsi="Arial"/>
+          <w:color w:val="000000" w:themeColor="text1"/>
+        </w:rPr>
+        <w:lastRenderedPageBreak/>
+        <w:t>Appendix B – Group C Collaboration Evidence</w:t>
+      </w:r>
+    </w:p>
+    <w:p>
+      <w:r>
+        <w:t>The screenshots below provide supporting evidence of my participation in Group C discussions, decision-making, review and revision activities.</w:t>
+      </w:r>
+    </w:p>
+    <w:p>
+      <w:pPr>
+        <w:jc w:val="center"/>
+      </w:pPr>
+      <w:r>
+        <w:rPr>
+          <w:noProof/>
+        </w:rPr>
+        <w:drawing>
+          <wp:inline distT="0" distB="0" distL="0" distR="0" wp14:anchorId="0DD33432" wp14:editId="4C73CD25">
+            <wp:extent cx="5972810" cy="2732405"/>
+            <wp:effectExtent l="0" t="0" r="0" b="0"/>
+            <wp:docPr id="888870149" name="Picture 1"/>
+            <wp:cNvGraphicFramePr>
+              <a:graphicFrameLocks xmlns:a="http://schemas.openxmlformats.org/drawingml/2006/main" noChangeAspect="1"/>
+            </wp:cNvGraphicFramePr>
+            <a:graphic xmlns:a="http://schemas.openxmlformats.org/drawingml/2006/main">
+              <a:graphicData uri="http://schemas.openxmlformats.org/drawingml/2006/picture">
+                <pic:pic xmlns:pic="http://schemas.openxmlformats.org/drawingml/2006/picture">
+                  <pic:nvPicPr>
+                    <pic:cNvPr id="888870149" name="Picture 888870149"/>
+                    <pic:cNvPicPr/>
+                  </pic:nvPicPr>
+                  <pic:blipFill>
+                    <a:blip r:embed="rId21"/>
+                    <a:stretch>
+                      <a:fillRect/>
+                    </a:stretch>
+                  </pic:blipFill>
+                  <pic:spPr>
+                    <a:xfrm>
+                      <a:off x="0" y="0"/>
+                      <a:ext cx="5972810" cy="2732405"/>
+                    </a:xfrm>
+                    <a:prstGeom prst="rect">
+                      <a:avLst/>
+                    </a:prstGeom>
+                  </pic:spPr>
+                </pic:pic>
+              </a:graphicData>
+            </a:graphic>
+          </wp:inline>
+        </w:drawing>
+      </w:r>
+    </w:p>
+    <w:p>
+      <w:pPr>
+        <w:spacing w:after="120" w:line="240" w:lineRule="auto"/>
+        <w:jc w:val="center"/>
+      </w:pPr>
+      <w:r>
+        <w:rPr>
+          <w:i/>
+          <w:sz w:val="20"/>
+        </w:rPr>
+        <w:t>Figure B1. Team-contract discussion showing my question on the scope of the agent deliverable.</w:t>
+      </w:r>
+    </w:p>
+    <w:p>
+      <w:pPr>
+        <w:jc w:val="center"/>
+      </w:pPr>
+      <w:r>
+        <w:rPr>
+          <w:noProof/>
+        </w:rPr>
+        <w:drawing>
+          <wp:inline distT="0" distB="0" distL="0" distR="0" wp14:anchorId="6FAC7DF9" wp14:editId="34DC11D2">
+            <wp:extent cx="5972810" cy="3251200"/>
+            <wp:effectExtent l="0" t="0" r="0" b="0"/>
+            <wp:docPr id="1850251531" name="Picture 2"/>
+            <wp:cNvGraphicFramePr>
+              <a:graphicFrameLocks xmlns:a="http://schemas.openxmlformats.org/drawingml/2006/main" noChangeAspect="1"/>
+            </wp:cNvGraphicFramePr>
+            <a:graphic xmlns:a="http://schemas.openxmlformats.org/drawingml/2006/main">
+              <a:graphicData uri="http://schemas.openxmlformats.org/drawingml/2006/picture">
+                <pic:pic xmlns:pic="http://schemas.openxmlformats.org/drawingml/2006/picture">
+                  <pic:nvPicPr>
+                    <pic:cNvPr id="1850251531" name="Picture 1850251531"/>
+                    <pic:cNvPicPr/>
+                  </pic:nvPicPr>
+                  <pic:blipFill>
+                    <a:blip r:embed="rId22"/>
+                    <a:stretch>
+                      <a:fillRect/>
+                    </a:stretch>
+                  </pic:blipFill>
+                  <pic:spPr>
+                    <a:xfrm>
+                      <a:off x="0" y="0"/>
+                      <a:ext cx="5972810" cy="3251200"/>
+                    </a:xfrm>
+                    <a:prstGeom prst="rect">
+                      <a:avLst/>
+                    </a:prstGeom>
+                  </pic:spPr>
+                </pic:pic>
+              </a:graphicData>
+            </a:graphic>
+          </wp:inline>
+        </w:drawing>
+      </w:r>
+    </w:p>
+    <w:p>
+      <w:pPr>
+        <w:spacing w:after="120" w:line="240" w:lineRule="auto"/>
+        <w:jc w:val="center"/>
+      </w:pPr>
+      <w:r>
+        <w:rPr>
+          <w:i/>
+          <w:sz w:val="20"/>
+        </w:rPr>
+        <w:t>Figure B2. Group discussion on task allocation, word-count division and coordination.</w:t>
+      </w:r>
+    </w:p>
+    <w:p>
+      <w:pPr>
+        <w:pageBreakBefore/>
+      </w:pPr>
+    </w:p>
+    <w:p>
+      <w:pPr>
+        <w:jc w:val="center"/>
+      </w:pPr>
+      <w:r>
+        <w:rPr>
+          <w:noProof/>
+        </w:rPr>
+        <w:drawing>
+          <wp:inline distT="0" distB="0" distL="0" distR="0" wp14:anchorId="57E30C2F" wp14:editId="5AB4B3F3">
+            <wp:extent cx="5972810" cy="2948940"/>
+            <wp:effectExtent l="0" t="0" r="0" b="0"/>
+            <wp:docPr id="1988884744" name="Picture 3"/>
+            <wp:cNvGraphicFramePr>
+              <a:graphicFrameLocks xmlns:a="http://schemas.openxmlformats.org/drawingml/2006/main" noChangeAspect="1"/>
+            </wp:cNvGraphicFramePr>
+            <a:graphic xmlns:a="http://schemas.openxmlformats.org/drawingml/2006/main">
+              <a:graphicData uri="http://schemas.openxmlformats.org/drawingml/2006/picture">
+                <pic:pic xmlns:pic="http://schemas.openxmlformats.org/drawingml/2006/picture">
+                  <pic:nvPicPr>
+                    <pic:cNvPr id="1988884744" name="Picture 1988884744"/>
+                    <pic:cNvPicPr/>
+                  </pic:nvPicPr>
+                  <pic:blipFill>
+                    <a:blip r:embed="rId23"/>
+                    <a:stretch>
+                      <a:fillRect/>
+                    </a:stretch>
+                  </pic:blipFill>
+                  <pic:spPr>
+                    <a:xfrm>
+                      <a:off x="0" y="0"/>
+                      <a:ext cx="5972810" cy="2948940"/>
+                    </a:xfrm>
+                    <a:prstGeom prst="rect">
+                      <a:avLst/>
+                    </a:prstGeom>
+                  </pic:spPr>
+                </pic:pic>
+              </a:graphicData>
+            </a:graphic>
+          </wp:inline>
+        </w:drawing>
+      </w:r>
+    </w:p>
+    <w:p>
+      <w:pPr>
+        <w:spacing w:after="120" w:line="240" w:lineRule="auto"/>
+        <w:jc w:val="center"/>
+      </w:pPr>
+      <w:r>
+        <w:rPr>
+          <w:i/>
+          <w:sz w:val="20"/>
+        </w:rPr>
+        <w:t>Figure B3. My proposed design draft and comments exchanged with Group C members.</w:t>
+      </w:r>
+    </w:p>
+    <w:p>
+      <w:pPr>
+        <w:jc w:val="center"/>
+      </w:pPr>
+      <w:r>
+        <w:rPr>
+          <w:noProof/>
+        </w:rPr>
+        <w:drawing>
+          <wp:inline distT="0" distB="0" distL="0" distR="0" wp14:anchorId="16D16413" wp14:editId="168F03CD">
+            <wp:extent cx="5972810" cy="2978785"/>
+            <wp:effectExtent l="0" t="0" r="0" b="5715"/>
+            <wp:docPr id="214366094" name="Picture 4"/>
+            <wp:cNvGraphicFramePr>
+              <a:graphicFrameLocks xmlns:a="http://schemas.openxmlformats.org/drawingml/2006/main" noChangeAspect="1"/>
+            </wp:cNvGraphicFramePr>
+            <a:graphic xmlns:a="http://schemas.openxmlformats.org/drawingml/2006/main">
+              <a:graphicData uri="http://schemas.openxmlformats.org/drawingml/2006/picture">
+                <pic:pic xmlns:pic="http://schemas.openxmlformats.org/drawingml/2006/picture">
+                  <pic:nvPicPr>
+                    <pic:cNvPr id="214366094" name="Picture 214366094"/>
+                    <pic:cNvPicPr/>
+                  </pic:nvPicPr>
+                  <pic:blipFill>
+                    <a:blip r:embed="rId24"/>
+                    <a:stretch>
+                      <a:fillRect/>
+                    </a:stretch>
+                  </pic:blipFill>
+                  <pic:spPr>
+                    <a:xfrm>
+                      <a:off x="0" y="0"/>
+                      <a:ext cx="5972810" cy="2978785"/>
+                    </a:xfrm>
+                    <a:prstGeom prst="rect">
+                      <a:avLst/>
+                    </a:prstGeom>
+                  </pic:spPr>
+                </pic:pic>
+              </a:graphicData>
+            </a:graphic>
+          </wp:inline>
+        </w:drawing>
+      </w:r>
+    </w:p>
+    <w:p>
+      <w:pPr>
+        <w:spacing w:after="120" w:line="240" w:lineRule="auto"/>
+        <w:jc w:val="center"/>
+      </w:pPr>
+      <w:r>
+        <w:rPr>
+          <w:i/>
+          <w:sz w:val="20"/>
+        </w:rPr>
+        <w:t>Figure B4. Follow-up discussion and response to peer feedback on the proposed design.</w:t>
+      </w:r>
+    </w:p>
+    <w:p>
+      <w:pPr>
+        <w:pStyle w:val="Heading1"/>
+        <w:pageBreakBefore/>
+        <w:rPr>
+          <w:color w:val="000000" w:themeColor="text1"/>
+        </w:rPr>
+      </w:pPr>
+      <w:r>
+        <w:rPr>
+          <w:rFonts w:ascii="Arial" w:hAnsi="Arial"/>
+          <w:color w:val="000000" w:themeColor="text1"/>
+        </w:rPr>
+        <w:lastRenderedPageBreak/>
+        <w:t>Appendix C – Unit 11 Testing and Execution Evidence</w:t>
+      </w:r>
+    </w:p>
+    <w:p>
+      <w:r>
+        <w:t>The screenshots below provide direct evidence of the final automated test run and the reproducible offline execution of the Unit 11 Academic Research Agent.</w:t>
+      </w:r>
+    </w:p>
+    <w:p>
+      <w:pPr>
+        <w:jc w:val="center"/>
+      </w:pPr>
+      <w:r>
+        <w:rPr>
+          <w:noProof/>
+        </w:rPr>
+        <w:drawing>
+          <wp:inline distT="0" distB="0" distL="0" distR="0" wp14:anchorId="5F69AC21" wp14:editId="73FD68B8">
+            <wp:extent cx="5760000" cy="3228592"/>
+            <wp:effectExtent l="0" t="0" r="0" b="0"/>
+            <wp:docPr id="5" name="Picture 5"/>
+            <wp:cNvGraphicFramePr>
+              <a:graphicFrameLocks xmlns:a="http://schemas.openxmlformats.org/drawingml/2006/main" noChangeAspect="1"/>
+            </wp:cNvGraphicFramePr>
+            <a:graphic xmlns:a="http://schemas.openxmlformats.org/drawingml/2006/main">
+              <a:graphicData uri="http://schemas.openxmlformats.org/drawingml/2006/picture">
+                <pic:pic xmlns:pic="http://schemas.openxmlformats.org/drawingml/2006/picture">
+                  <pic:nvPicPr>
+                    <pic:cNvPr id="0" name="image(20261017-122006).png"/>
+                    <pic:cNvPicPr/>
+                  </pic:nvPicPr>
+                  <pic:blipFill>
+                    <a:blip r:embed="rId25"/>
+                    <a:stretch>
+                      <a:fillRect/>
+                    </a:stretch>
+                  </pic:blipFill>
+                  <pic:spPr>
+                    <a:xfrm>
+                      <a:off x="0" y="0"/>
+                      <a:ext cx="5760000" cy="3228592"/>
+                    </a:xfrm>
+                    <a:prstGeom prst="rect">
+                      <a:avLst/>
+                    </a:prstGeom>
+                  </pic:spPr>
+                </pic:pic>
+              </a:graphicData>
+            </a:graphic>
+          </wp:inline>
+        </w:drawing>
+      </w:r>
+    </w:p>
+    <w:p>
+      <w:pPr>
+        <w:spacing w:after="120" w:line="240" w:lineRule="auto"/>
+        <w:jc w:val="center"/>
+      </w:pPr>
+      <w:r>
+        <w:rPr>
+          <w:i/>
+          <w:sz w:val="20"/>
+        </w:rPr>
+        <w:t>Figure C1. Final automated test run showing 11 tests passed and eight subtests passed.</w:t>
+      </w:r>
+    </w:p>
+    <w:p>
+      <w:pPr>
+        <w:pageBreakBefore/>
+      </w:pPr>
+    </w:p>
+    <w:p>
+      <w:pPr>
+        <w:jc w:val="center"/>
+      </w:pPr>
+      <w:r>
+        <w:rPr>
+          <w:noProof/>
+        </w:rPr>
+        <w:drawing>
+          <wp:inline distT="0" distB="0" distL="0" distR="0" wp14:anchorId="5BA748E9" wp14:editId="3BA50C67">
+            <wp:extent cx="5760000" cy="3244275"/>
+            <wp:effectExtent l="0" t="0" r="0" b="0"/>
+            <wp:docPr id="6" name="Picture 6"/>
+            <wp:cNvGraphicFramePr>
+              <a:graphicFrameLocks xmlns:a="http://schemas.openxmlformats.org/drawingml/2006/main" noChangeAspect="1"/>
+            </wp:cNvGraphicFramePr>
+            <a:graphic xmlns:a="http://schemas.openxmlformats.org/drawingml/2006/main">
+              <a:graphicData uri="http://schemas.openxmlformats.org/drawingml/2006/picture">
+                <pic:pic xmlns:pic="http://schemas.openxmlformats.org/drawingml/2006/picture">
+                  <pic:nvPicPr>
+                    <pic:cNvPr id="0" name="image(20261017-122306).png"/>
+                    <pic:cNvPicPr/>
+                  </pic:nvPicPr>
+                  <pic:blipFill>
+                    <a:blip r:embed="rId26"/>
+                    <a:stretch>
+                      <a:fillRect/>
+                    </a:stretch>
+                  </pic:blipFill>
+                  <pic:spPr>
+                    <a:xfrm>
+                      <a:off x="0" y="0"/>
+                      <a:ext cx="5760000" cy="3244275"/>
+                    </a:xfrm>
+                    <a:prstGeom prst="rect">
+                      <a:avLst/>
+                    </a:prstGeom>
+                  </pic:spPr>
+                </pic:pic>
+              </a:graphicData>
+            </a:graphic>
+          </wp:inline>
+        </w:drawing>
+      </w:r>
+    </w:p>
+    <w:p>
+      <w:pPr>
+        <w:spacing w:after="120" w:line="240" w:lineRule="auto"/>
+        <w:jc w:val="center"/>
+      </w:pPr>
+      <w:r>
+        <w:rPr>
+          <w:i/>
+          <w:sz w:val="20"/>
+        </w:rPr>
+        <w:t>Figure C2. Offline Academic Research Agent execution retaining three evidence records and generating research-report.md, research-report.json and workflow-trace.json.</w:t>
+      </w:r>
     </w:p>
     <w:sectPr>
-      <w:headerReference w:type="default" r:id="rId16"/>
-      <w:footerReference w:type="default" r:id="rId17"/>
+      <w:headerReference w:type="default" r:id="rId27"/>
+      <w:footerReference w:type="default" r:id="rId28"/>
       <w:pgSz w:w="12240" w:h="15840"/>
       <w:pgMar w:top="1418" w:right="1418" w:bottom="1418" w:left="1418" w:header="720" w:footer="720" w:gutter="0"/>
+      <w:pgNumType w:start="0"/>
       <w:cols w:space="720"/>
+      <w:titlePg/>
       <w:docGrid w:linePitch="360"/>
     </w:sectPr>
   </w:body>
@@ -2932,6 +3045,49 @@
       <w:pStyle w:val="Footer"/>
       <w:jc w:val="center"/>
     </w:pPr>
+    <w:r>
+      <w:rPr>
+        <w:sz w:val="20"/>
+      </w:rPr>
+      <w:tab/>
+    </w:r>
+    <w:r>
+      <w:rPr>
+        <w:sz w:val="20"/>
+      </w:rPr>
+      <w:tab/>
+    </w:r>
+    <w:r>
+      <w:rPr>
+        <w:sz w:val="20"/>
+      </w:rPr>
+      <w:fldChar w:fldCharType="begin"/>
+    </w:r>
+    <w:r>
+      <w:rPr>
+        <w:sz w:val="20"/>
+      </w:rPr>
+      <w:instrText xml:space="preserve"> PAGE </w:instrText>
+    </w:r>
+    <w:r>
+      <w:rPr>
+        <w:sz w:val="20"/>
+      </w:rPr>
+      <w:fldChar w:fldCharType="separate"/>
+    </w:r>
+    <w:r>
+      <w:rPr>
+        <w:noProof/>
+        <w:sz w:val="20"/>
+      </w:rPr>
+      <w:t>1</w:t>
+    </w:r>
+    <w:r>
+      <w:rPr>
+        <w:sz w:val="20"/>
+      </w:rPr>
+      <w:fldChar w:fldCharType="end"/>
+    </w:r>
   </w:p>
 </w:ftr>
 </file>
@@ -3127,7 +3283,7 @@
   <w:abstractNum w:abstractNumId="8" w15:restartNumberingAfterBreak="0">
     <w:nsid w:val="FFFFFF89"/>
     <w:multiLevelType w:val="singleLevel"/>
-    <w:tmpl w:val="29761A62"/>
+    <w:tmpl w:val="787CBF54"/>
     <w:lvl w:ilvl="0">
       <w:start w:val="1"/>
       <w:numFmt w:val="bullet"/>
@@ -3592,7 +3748,6 @@
       <w:b/>
       <w:bCs/>
       <w:color w:val="17365D"/>
-      <w:sz w:val="32"/>
       <w:szCs w:val="28"/>
     </w:rPr>
   </w:style>
@@ -3616,7 +3771,6 @@
       <w:b/>
       <w:bCs/>
       <w:color w:val="2F5597"/>
-      <w:sz w:val="28"/>
       <w:szCs w:val="26"/>
     </w:rPr>
   </w:style>
@@ -3753,7 +3907,6 @@
     <w:rPr>
       <w:rFonts w:asciiTheme="majorHAnsi" w:eastAsiaTheme="majorEastAsia" w:hAnsiTheme="majorHAnsi" w:cstheme="majorBidi"/>
       <w:color w:val="4F81BD" w:themeColor="accent1"/>
-      <w:sz w:val="20"/>
       <w:szCs w:val="20"/>
     </w:rPr>
   </w:style>
@@ -3778,7 +3931,6 @@
       <w:i/>
       <w:iCs/>
       <w:color w:val="404040" w:themeColor="text1" w:themeTint="BF"/>
-      <w:sz w:val="20"/>
       <w:szCs w:val="20"/>
     </w:rPr>
   </w:style>
@@ -3830,6 +3982,10 @@
     <w:link w:val="Header"/>
     <w:uiPriority w:val="99"/>
     <w:rsid w:val="00E618BF"/>
+    <w:rPr>
+      <w:rFonts w:ascii="Arial" w:eastAsia="Arial" w:hAnsi="Arial"/>
+      <w:sz w:val="24"/>
+    </w:rPr>
   </w:style>
   <w:style w:type="paragraph" w:styleId="Footer">
     <w:name w:val="footer"/>
@@ -3852,6 +4008,10 @@
     <w:link w:val="Footer"/>
     <w:uiPriority w:val="99"/>
     <w:rsid w:val="00E618BF"/>
+    <w:rPr>
+      <w:rFonts w:ascii="Arial" w:eastAsia="Arial" w:hAnsi="Arial"/>
+      <w:sz w:val="24"/>
+    </w:rPr>
   </w:style>
   <w:style w:type="paragraph" w:styleId="NoSpacing">
     <w:name w:val="No Spacing"/>
@@ -3861,6 +4021,10 @@
     <w:pPr>
       <w:spacing w:after="0" w:line="240" w:lineRule="auto"/>
     </w:pPr>
+    <w:rPr>
+      <w:rFonts w:ascii="Arial" w:eastAsia="Arial" w:hAnsi="Arial"/>
+      <w:sz w:val="24"/>
+    </w:rPr>
   </w:style>
   <w:style w:type="character" w:customStyle="1" w:styleId="Heading1Char">
     <w:name w:val="Heading 1 Char"/>
@@ -3873,7 +4037,7 @@
       <w:b/>
       <w:bCs/>
       <w:color w:val="365F91" w:themeColor="accent1" w:themeShade="BF"/>
-      <w:sz w:val="28"/>
+      <w:sz w:val="24"/>
       <w:szCs w:val="28"/>
     </w:rPr>
   </w:style>
@@ -3888,7 +4052,7 @@
       <w:b/>
       <w:bCs/>
       <w:color w:val="4F81BD" w:themeColor="accent1"/>
-      <w:sz w:val="26"/>
+      <w:sz w:val="24"/>
       <w:szCs w:val="26"/>
     </w:rPr>
   </w:style>
@@ -3903,6 +4067,7 @@
       <w:b/>
       <w:bCs/>
       <w:color w:val="4F81BD" w:themeColor="accent1"/>
+      <w:sz w:val="24"/>
     </w:rPr>
   </w:style>
   <w:style w:type="paragraph" w:styleId="Title">
@@ -3926,7 +4091,6 @@
       <w:color w:val="17365D"/>
       <w:spacing w:val="5"/>
       <w:kern w:val="28"/>
-      <w:sz w:val="40"/>
       <w:szCs w:val="52"/>
     </w:rPr>
   </w:style>
@@ -3941,7 +4105,7 @@
       <w:color w:val="17365D" w:themeColor="text2" w:themeShade="BF"/>
       <w:spacing w:val="5"/>
       <w:kern w:val="28"/>
-      <w:sz w:val="52"/>
+      <w:sz w:val="24"/>
       <w:szCs w:val="52"/>
     </w:rPr>
   </w:style>
@@ -4011,6 +4175,10 @@
     <w:link w:val="BodyText"/>
     <w:uiPriority w:val="99"/>
     <w:rsid w:val="00AA1D8D"/>
+    <w:rPr>
+      <w:rFonts w:ascii="Arial" w:eastAsia="Arial" w:hAnsi="Arial"/>
+      <w:sz w:val="24"/>
+    </w:rPr>
   </w:style>
   <w:style w:type="paragraph" w:styleId="BodyText2">
     <w:name w:val="Body Text 2"/>
@@ -4029,6 +4197,10 @@
     <w:link w:val="BodyText2"/>
     <w:uiPriority w:val="99"/>
     <w:rsid w:val="00AA1D8D"/>
+    <w:rPr>
+      <w:rFonts w:ascii="Arial" w:eastAsia="Arial" w:hAnsi="Arial"/>
+      <w:sz w:val="24"/>
+    </w:rPr>
   </w:style>
   <w:style w:type="paragraph" w:styleId="BodyText3">
     <w:name w:val="Body Text 3"/>
@@ -4041,7 +4213,6 @@
       <w:spacing w:after="120"/>
     </w:pPr>
     <w:rPr>
-      <w:sz w:val="16"/>
       <w:szCs w:val="16"/>
     </w:rPr>
   </w:style>
@@ -4052,7 +4223,8 @@
     <w:uiPriority w:val="99"/>
     <w:rsid w:val="00AA1D8D"/>
     <w:rPr>
-      <w:sz w:val="16"/>
+      <w:rFonts w:ascii="Arial" w:eastAsia="Arial" w:hAnsi="Arial"/>
+      <w:sz w:val="24"/>
       <w:szCs w:val="16"/>
     </w:rPr>
   </w:style>
@@ -4221,8 +4393,8 @@
       </w:tabs>
     </w:pPr>
     <w:rPr>
-      <w:rFonts w:ascii="Courier" w:hAnsi="Courier"/>
-      <w:sz w:val="20"/>
+      <w:rFonts w:ascii="Arial" w:eastAsia="Arial" w:hAnsi="Arial"/>
+      <w:sz w:val="24"/>
       <w:szCs w:val="20"/>
     </w:rPr>
   </w:style>
@@ -4233,8 +4405,8 @@
     <w:uiPriority w:val="99"/>
     <w:rsid w:val="0029639D"/>
     <w:rPr>
-      <w:rFonts w:ascii="Courier" w:hAnsi="Courier"/>
-      <w:sz w:val="20"/>
+      <w:rFonts w:ascii="Arial" w:eastAsia="Arial" w:hAnsi="Arial"/>
+      <w:sz w:val="24"/>
       <w:szCs w:val="20"/>
     </w:rPr>
   </w:style>
@@ -4259,9 +4431,11 @@
     <w:uiPriority w:val="29"/>
     <w:rsid w:val="00FC693F"/>
     <w:rPr>
+      <w:rFonts w:ascii="Arial" w:eastAsia="Arial" w:hAnsi="Arial"/>
       <w:i/>
       <w:iCs/>
       <w:color w:val="000000" w:themeColor="text1"/>
+      <w:sz w:val="24"/>
     </w:rPr>
   </w:style>
   <w:style w:type="character" w:customStyle="1" w:styleId="Heading4Char">
@@ -4278,6 +4452,7 @@
       <w:i/>
       <w:iCs/>
       <w:color w:val="4F81BD" w:themeColor="accent1"/>
+      <w:sz w:val="24"/>
     </w:rPr>
   </w:style>
   <w:style w:type="character" w:customStyle="1" w:styleId="Heading5Char">
@@ -4290,6 +4465,7 @@
     <w:rPr>
       <w:rFonts w:asciiTheme="majorHAnsi" w:eastAsiaTheme="majorEastAsia" w:hAnsiTheme="majorHAnsi" w:cstheme="majorBidi"/>
       <w:color w:val="243F60" w:themeColor="accent1" w:themeShade="7F"/>
+      <w:sz w:val="24"/>
     </w:rPr>
   </w:style>
   <w:style w:type="character" w:customStyle="1" w:styleId="Heading6Char">
@@ -4304,6 +4480,7 @@
       <w:i/>
       <w:iCs/>
       <w:color w:val="243F60" w:themeColor="accent1" w:themeShade="7F"/>
+      <w:sz w:val="24"/>
     </w:rPr>
   </w:style>
   <w:style w:type="character" w:customStyle="1" w:styleId="Heading7Char">
@@ -4318,6 +4495,7 @@
       <w:i/>
       <w:iCs/>
       <w:color w:val="404040" w:themeColor="text1" w:themeTint="BF"/>
+      <w:sz w:val="24"/>
     </w:rPr>
   </w:style>
   <w:style w:type="character" w:customStyle="1" w:styleId="Heading8Char">
@@ -4330,7 +4508,7 @@
     <w:rPr>
       <w:rFonts w:asciiTheme="majorHAnsi" w:eastAsiaTheme="majorEastAsia" w:hAnsiTheme="majorHAnsi" w:cstheme="majorBidi"/>
       <w:color w:val="4F81BD" w:themeColor="accent1"/>
-      <w:sz w:val="20"/>
+      <w:sz w:val="24"/>
       <w:szCs w:val="20"/>
     </w:rPr>
   </w:style>
@@ -4346,7 +4524,7 @@
       <w:i/>
       <w:iCs/>
       <w:color w:val="404040" w:themeColor="text1" w:themeTint="BF"/>
-      <w:sz w:val="20"/>
+      <w:sz w:val="24"/>
       <w:szCs w:val="20"/>
     </w:rPr>
   </w:style>
@@ -4366,7 +4544,6 @@
       <w:b/>
       <w:bCs/>
       <w:color w:val="4F81BD" w:themeColor="accent1"/>
-      <w:sz w:val="18"/>
       <w:szCs w:val="18"/>
     </w:rPr>
   </w:style>
@@ -4377,8 +4554,10 @@
     <w:qFormat/>
     <w:rsid w:val="00FC693F"/>
     <w:rPr>
+      <w:rFonts w:ascii="Arial" w:eastAsia="Arial" w:hAnsi="Arial"/>
       <w:b/>
       <w:bCs/>
+      <w:sz w:val="24"/>
     </w:rPr>
   </w:style>
   <w:style w:type="character" w:styleId="Emphasis">
@@ -4388,8 +4567,10 @@
     <w:qFormat/>
     <w:rsid w:val="00FC693F"/>
     <w:rPr>
+      <w:rFonts w:ascii="Arial" w:eastAsia="Arial" w:hAnsi="Arial"/>
       <w:i/>
       <w:iCs/>
+      <w:sz w:val="24"/>
     </w:rPr>
   </w:style>
   <w:style w:type="paragraph" w:styleId="IntenseQuote">
@@ -4422,11 +4603,13 @@
     <w:uiPriority w:val="30"/>
     <w:rsid w:val="00FC693F"/>
     <w:rPr>
+      <w:rFonts w:ascii="Arial" w:eastAsia="Arial" w:hAnsi="Arial"/>
       <w:b/>
       <w:bCs/>
       <w:i/>
       <w:iCs/>
       <w:color w:val="4F81BD" w:themeColor="accent1"/>
+      <w:sz w:val="24"/>
     </w:rPr>
   </w:style>
   <w:style w:type="character" w:styleId="SubtleEmphasis">
@@ -4436,9 +4619,11 @@
     <w:qFormat/>
     <w:rsid w:val="00FC693F"/>
     <w:rPr>
+      <w:rFonts w:ascii="Arial" w:eastAsia="Arial" w:hAnsi="Arial"/>
       <w:i/>
       <w:iCs/>
       <w:color w:val="808080" w:themeColor="text1" w:themeTint="7F"/>
+      <w:sz w:val="24"/>
     </w:rPr>
   </w:style>
   <w:style w:type="character" w:styleId="IntenseEmphasis">
@@ -4448,11 +4633,13 @@
     <w:qFormat/>
     <w:rsid w:val="00FC693F"/>
     <w:rPr>
+      <w:rFonts w:ascii="Arial" w:eastAsia="Arial" w:hAnsi="Arial"/>
       <w:b/>
       <w:bCs/>
       <w:i/>
       <w:iCs/>
       <w:color w:val="4F81BD" w:themeColor="accent1"/>
+      <w:sz w:val="24"/>
     </w:rPr>
   </w:style>
   <w:style w:type="character" w:styleId="SubtleReference">
@@ -4462,8 +4649,10 @@
     <w:qFormat/>
     <w:rsid w:val="00FC693F"/>
     <w:rPr>
+      <w:rFonts w:ascii="Arial" w:eastAsia="Arial" w:hAnsi="Arial"/>
       <w:smallCaps/>
       <w:color w:val="C0504D" w:themeColor="accent2"/>
+      <w:sz w:val="24"/>
       <w:u w:val="single"/>
     </w:rPr>
   </w:style>
@@ -4474,11 +4663,13 @@
     <w:qFormat/>
     <w:rsid w:val="00FC693F"/>
     <w:rPr>
+      <w:rFonts w:ascii="Arial" w:eastAsia="Arial" w:hAnsi="Arial"/>
       <w:b/>
       <w:bCs/>
       <w:smallCaps/>
       <w:color w:val="C0504D" w:themeColor="accent2"/>
       <w:spacing w:val="5"/>
+      <w:sz w:val="24"/>
       <w:u w:val="single"/>
     </w:rPr>
   </w:style>
@@ -4489,10 +4680,12 @@
     <w:qFormat/>
     <w:rsid w:val="00FC693F"/>
     <w:rPr>
+      <w:rFonts w:ascii="Arial" w:eastAsia="Arial" w:hAnsi="Arial"/>
       <w:b/>
       <w:bCs/>
       <w:smallCaps/>
       <w:spacing w:val="5"/>
+      <w:sz w:val="24"/>
     </w:rPr>
   </w:style>
   <w:style w:type="paragraph" w:styleId="TOCHeading">
@@ -4507,6 +4700,9 @@
     <w:pPr>
       <w:outlineLvl w:val="9"/>
     </w:pPr>
+    <w:rPr>
+      <w:rFonts w:ascii="Arial" w:eastAsia="Arial" w:hAnsi="Arial"/>
+    </w:rPr>
   </w:style>
   <w:style w:type="table" w:styleId="TableGrid">
     <w:name w:val="Table Grid"/>
@@ -4516,6 +4712,10 @@
     <w:pPr>
       <w:spacing w:after="0" w:line="240" w:lineRule="auto"/>
     </w:pPr>
+    <w:rPr>
+      <w:rFonts w:ascii="Arial" w:eastAsia="Arial" w:hAnsi="Arial"/>
+      <w:sz w:val="24"/>
+    </w:rPr>
     <w:tblPr>
       <w:tblBorders>
         <w:top w:val="single" w:sz="4" w:space="0" w:color="auto"/>
@@ -4536,7 +4736,9 @@
       <w:spacing w:after="0" w:line="240" w:lineRule="auto"/>
     </w:pPr>
     <w:rPr>
+      <w:rFonts w:ascii="Arial" w:eastAsia="Arial" w:hAnsi="Arial"/>
       <w:color w:val="000000" w:themeColor="text1" w:themeShade="BF"/>
+      <w:sz w:val="24"/>
     </w:rPr>
     <w:tblPr>
       <w:tblStyleRowBandSize w:val="1"/>
@@ -4632,7 +4834,9 @@
       <w:spacing w:after="0" w:line="240" w:lineRule="auto"/>
     </w:pPr>
     <w:rPr>
+      <w:rFonts w:ascii="Arial" w:eastAsia="Arial" w:hAnsi="Arial"/>
       <w:color w:val="365F91" w:themeColor="accent1" w:themeShade="BF"/>
+      <w:sz w:val="24"/>
     </w:rPr>
     <w:tblPr>
       <w:tblStyleRowBandSize w:val="1"/>
@@ -4728,7 +4932,9 @@
       <w:spacing w:after="0" w:line="240" w:lineRule="auto"/>
     </w:pPr>
     <w:rPr>
+      <w:rFonts w:ascii="Arial" w:eastAsia="Arial" w:hAnsi="Arial"/>
       <w:color w:val="943634" w:themeColor="accent2" w:themeShade="BF"/>
+      <w:sz w:val="24"/>
     </w:rPr>
     <w:tblPr>
       <w:tblStyleRowBandSize w:val="1"/>
@@ -4824,7 +5030,9 @@
       <w:spacing w:after="0" w:line="240" w:lineRule="auto"/>
     </w:pPr>
     <w:rPr>
+      <w:rFonts w:ascii="Arial" w:eastAsia="Arial" w:hAnsi="Arial"/>
       <w:color w:val="76923C" w:themeColor="accent3" w:themeShade="BF"/>
+      <w:sz w:val="24"/>
     </w:rPr>
     <w:tblPr>
       <w:tblStyleRowBandSize w:val="1"/>
@@ -4920,7 +5128,9 @@
       <w:spacing w:after="0" w:line="240" w:lineRule="auto"/>
     </w:pPr>
     <w:rPr>
+      <w:rFonts w:ascii="Arial" w:eastAsia="Arial" w:hAnsi="Arial"/>
       <w:color w:val="5F497A" w:themeColor="accent4" w:themeShade="BF"/>
+      <w:sz w:val="24"/>
     </w:rPr>
     <w:tblPr>
       <w:tblStyleRowBandSize w:val="1"/>
@@ -5016,7 +5226,9 @@
       <w:spacing w:after="0" w:line="240" w:lineRule="auto"/>
     </w:pPr>
     <w:rPr>
+      <w:rFonts w:ascii="Arial" w:eastAsia="Arial" w:hAnsi="Arial"/>
       <w:color w:val="31849B" w:themeColor="accent5" w:themeShade="BF"/>
+      <w:sz w:val="24"/>
     </w:rPr>
     <w:tblPr>
       <w:tblStyleRowBandSize w:val="1"/>
@@ -5112,7 +5324,9 @@
       <w:spacing w:after="0" w:line="240" w:lineRule="auto"/>
     </w:pPr>
     <w:rPr>
+      <w:rFonts w:ascii="Arial" w:eastAsia="Arial" w:hAnsi="Arial"/>
       <w:color w:val="E36C0A" w:themeColor="accent6" w:themeShade="BF"/>
+      <w:sz w:val="24"/>
     </w:rPr>
     <w:tblPr>
       <w:tblStyleRowBandSize w:val="1"/>
@@ -5207,6 +5421,10 @@
     <w:pPr>
       <w:spacing w:after="0" w:line="240" w:lineRule="auto"/>
     </w:pPr>
+    <w:rPr>
+      <w:rFonts w:ascii="Arial" w:eastAsia="Arial" w:hAnsi="Arial"/>
+      <w:sz w:val="24"/>
+    </w:rPr>
     <w:tblPr>
       <w:tblStyleRowBandSize w:val="1"/>
       <w:tblStyleColBandSize w:val="1"/>
@@ -5292,6 +5510,10 @@
     <w:pPr>
       <w:spacing w:after="0" w:line="240" w:lineRule="auto"/>
     </w:pPr>
+    <w:rPr>
+      <w:rFonts w:ascii="Arial" w:eastAsia="Arial" w:hAnsi="Arial"/>
+      <w:sz w:val="24"/>
+    </w:rPr>
     <w:tblPr>
       <w:tblStyleRowBandSize w:val="1"/>
       <w:tblStyleColBandSize w:val="1"/>
@@ -5377,6 +5599,10 @@
     <w:pPr>
       <w:spacing w:after="0" w:line="240" w:lineRule="auto"/>
     </w:pPr>
+    <w:rPr>
+      <w:rFonts w:ascii="Arial" w:eastAsia="Arial" w:hAnsi="Arial"/>
+      <w:sz w:val="24"/>
+    </w:rPr>
     <w:tblPr>
       <w:tblStyleRowBandSize w:val="1"/>
       <w:tblStyleColBandSize w:val="1"/>
@@ -5462,6 +5688,10 @@
     <w:pPr>
       <w:spacing w:after="0" w:line="240" w:lineRule="auto"/>
     </w:pPr>
+    <w:rPr>
+      <w:rFonts w:ascii="Arial" w:eastAsia="Arial" w:hAnsi="Arial"/>
+      <w:sz w:val="24"/>
+    </w:rPr>
     <w:tblPr>
       <w:tblStyleRowBandSize w:val="1"/>
       <w:tblStyleColBandSize w:val="1"/>
@@ -5547,6 +5777,10 @@
     <w:pPr>
       <w:spacing w:after="0" w:line="240" w:lineRule="auto"/>
     </w:pPr>
+    <w:rPr>
+      <w:rFonts w:ascii="Arial" w:eastAsia="Arial" w:hAnsi="Arial"/>
+      <w:sz w:val="24"/>
+    </w:rPr>
     <w:tblPr>
       <w:tblStyleRowBandSize w:val="1"/>
       <w:tblStyleColBandSize w:val="1"/>
@@ -5632,6 +5866,10 @@
     <w:pPr>
       <w:spacing w:after="0" w:line="240" w:lineRule="auto"/>
     </w:pPr>
+    <w:rPr>
+      <w:rFonts w:ascii="Arial" w:eastAsia="Arial" w:hAnsi="Arial"/>
+      <w:sz w:val="24"/>
+    </w:rPr>
     <w:tblPr>
       <w:tblStyleRowBandSize w:val="1"/>
       <w:tblStyleColBandSize w:val="1"/>
@@ -5717,6 +5955,10 @@
     <w:pPr>
       <w:spacing w:after="0" w:line="240" w:lineRule="auto"/>
     </w:pPr>
+    <w:rPr>
+      <w:rFonts w:ascii="Arial" w:eastAsia="Arial" w:hAnsi="Arial"/>
+      <w:sz w:val="24"/>
+    </w:rPr>
     <w:tblPr>
       <w:tblStyleRowBandSize w:val="1"/>
       <w:tblStyleColBandSize w:val="1"/>
@@ -5802,6 +6044,10 @@
     <w:pPr>
       <w:spacing w:after="0" w:line="240" w:lineRule="auto"/>
     </w:pPr>
+    <w:rPr>
+      <w:rFonts w:ascii="Arial" w:eastAsia="Arial" w:hAnsi="Arial"/>
+      <w:sz w:val="24"/>
+    </w:rPr>
     <w:tblPr>
       <w:tblStyleRowBandSize w:val="1"/>
       <w:tblStyleColBandSize w:val="1"/>
@@ -5925,6 +6171,10 @@
     <w:pPr>
       <w:spacing w:after="0" w:line="240" w:lineRule="auto"/>
     </w:pPr>
+    <w:rPr>
+      <w:rFonts w:ascii="Arial" w:eastAsia="Arial" w:hAnsi="Arial"/>
+      <w:sz w:val="24"/>
+    </w:rPr>
     <w:tblPr>
       <w:tblStyleRowBandSize w:val="1"/>
       <w:tblStyleColBandSize w:val="1"/>
@@ -6048,6 +6298,10 @@
     <w:pPr>
       <w:spacing w:after="0" w:line="240" w:lineRule="auto"/>
     </w:pPr>
+    <w:rPr>
+      <w:rFonts w:ascii="Arial" w:eastAsia="Arial" w:hAnsi="Arial"/>
+      <w:sz w:val="24"/>
+    </w:rPr>
     <w:tblPr>
       <w:tblStyleRowBandSize w:val="1"/>
       <w:tblStyleColBandSize w:val="1"/>
@@ -6171,6 +6425,10 @@
     <w:pPr>
       <w:spacing w:after="0" w:line="240" w:lineRule="auto"/>
     </w:pPr>
+    <w:rPr>
+      <w:rFonts w:ascii="Arial" w:eastAsia="Arial" w:hAnsi="Arial"/>
+      <w:sz w:val="24"/>
+    </w:rPr>
     <w:tblPr>
       <w:tblStyleRowBandSize w:val="1"/>
       <w:tblStyleColBandSize w:val="1"/>
@@ -6294,6 +6552,10 @@
     <w:pPr>
       <w:spacing w:after="0" w:line="240" w:lineRule="auto"/>
     </w:pPr>
+    <w:rPr>
+      <w:rFonts w:ascii="Arial" w:eastAsia="Arial" w:hAnsi="Arial"/>
+      <w:sz w:val="24"/>
+    </w:rPr>
     <w:tblPr>
       <w:tblStyleRowBandSize w:val="1"/>
       <w:tblStyleColBandSize w:val="1"/>
@@ -6417,6 +6679,10 @@
     <w:pPr>
       <w:spacing w:after="0" w:line="240" w:lineRule="auto"/>
     </w:pPr>
+    <w:rPr>
+      <w:rFonts w:ascii="Arial" w:eastAsia="Arial" w:hAnsi="Arial"/>
+      <w:sz w:val="24"/>
+    </w:rPr>
     <w:tblPr>
       <w:tblStyleRowBandSize w:val="1"/>
       <w:tblStyleColBandSize w:val="1"/>
@@ -6540,6 +6806,10 @@
     <w:pPr>
       <w:spacing w:after="0" w:line="240" w:lineRule="auto"/>
     </w:pPr>
+    <w:rPr>
+      <w:rFonts w:ascii="Arial" w:eastAsia="Arial" w:hAnsi="Arial"/>
+      <w:sz w:val="24"/>
+    </w:rPr>
     <w:tblPr>
       <w:tblStyleRowBandSize w:val="1"/>
       <w:tblStyleColBandSize w:val="1"/>
@@ -6663,6 +6933,10 @@
     <w:pPr>
       <w:spacing w:after="0" w:line="240" w:lineRule="auto"/>
     </w:pPr>
+    <w:rPr>
+      <w:rFonts w:ascii="Arial" w:eastAsia="Arial" w:hAnsi="Arial"/>
+      <w:sz w:val="24"/>
+    </w:rPr>
     <w:tblPr>
       <w:tblStyleRowBandSize w:val="1"/>
       <w:tblStyleColBandSize w:val="1"/>
@@ -6762,6 +7036,10 @@
     <w:pPr>
       <w:spacing w:after="0" w:line="240" w:lineRule="auto"/>
     </w:pPr>
+    <w:rPr>
+      <w:rFonts w:ascii="Arial" w:eastAsia="Arial" w:hAnsi="Arial"/>
+      <w:sz w:val="24"/>
+    </w:rPr>
     <w:tblPr>
       <w:tblStyleRowBandSize w:val="1"/>
       <w:tblStyleColBandSize w:val="1"/>
@@ -6861,6 +7139,10 @@
     <w:pPr>
       <w:spacing w:after="0" w:line="240" w:lineRule="auto"/>
     </w:pPr>
+    <w:rPr>
+      <w:rFonts w:ascii="Arial" w:eastAsia="Arial" w:hAnsi="Arial"/>
+      <w:sz w:val="24"/>
+    </w:rPr>
     <w:tblPr>
       <w:tblStyleRowBandSize w:val="1"/>
       <w:tblStyleColBandSize w:val="1"/>
@@ -6960,6 +7242,10 @@
     <w:pPr>
       <w:spacing w:after="0" w:line="240" w:lineRule="auto"/>
     </w:pPr>
+    <w:rPr>
+      <w:rFonts w:ascii="Arial" w:eastAsia="Arial" w:hAnsi="Arial"/>
+      <w:sz w:val="24"/>
+    </w:rPr>
     <w:tblPr>
       <w:tblStyleRowBandSize w:val="1"/>
       <w:tblStyleColBandSize w:val="1"/>
@@ -7059,6 +7345,10 @@
     <w:pPr>
       <w:spacing w:after="0" w:line="240" w:lineRule="auto"/>
     </w:pPr>
+    <w:rPr>
+      <w:rFonts w:ascii="Arial" w:eastAsia="Arial" w:hAnsi="Arial"/>
+      <w:sz w:val="24"/>
+    </w:rPr>
     <w:tblPr>
       <w:tblStyleRowBandSize w:val="1"/>
       <w:tblStyleColBandSize w:val="1"/>
@@ -7158,6 +7448,10 @@
     <w:pPr>
       <w:spacing w:after="0" w:line="240" w:lineRule="auto"/>
     </w:pPr>
+    <w:rPr>
+      <w:rFonts w:ascii="Arial" w:eastAsia="Arial" w:hAnsi="Arial"/>
+      <w:sz w:val="24"/>
+    </w:rPr>
     <w:tblPr>
       <w:tblStyleRowBandSize w:val="1"/>
       <w:tblStyleColBandSize w:val="1"/>
@@ -7257,6 +7551,10 @@
     <w:pPr>
       <w:spacing w:after="0" w:line="240" w:lineRule="auto"/>
     </w:pPr>
+    <w:rPr>
+      <w:rFonts w:ascii="Arial" w:eastAsia="Arial" w:hAnsi="Arial"/>
+      <w:sz w:val="24"/>
+    </w:rPr>
     <w:tblPr>
       <w:tblStyleRowBandSize w:val="1"/>
       <w:tblStyleColBandSize w:val="1"/>
@@ -7356,6 +7654,10 @@
     <w:pPr>
       <w:spacing w:after="0" w:line="240" w:lineRule="auto"/>
     </w:pPr>
+    <w:rPr>
+      <w:rFonts w:ascii="Arial" w:eastAsia="Arial" w:hAnsi="Arial"/>
+      <w:sz w:val="24"/>
+    </w:rPr>
     <w:tblPr>
       <w:tblStyleRowBandSize w:val="1"/>
       <w:tblStyleColBandSize w:val="1"/>
@@ -7498,6 +7800,10 @@
     <w:pPr>
       <w:spacing w:after="0" w:line="240" w:lineRule="auto"/>
     </w:pPr>
+    <w:rPr>
+      <w:rFonts w:ascii="Arial" w:eastAsia="Arial" w:hAnsi="Arial"/>
+      <w:sz w:val="24"/>
+    </w:rPr>
     <w:tblPr>
       <w:tblStyleRowBandSize w:val="1"/>
       <w:tblStyleColBandSize w:val="1"/>
@@ -7640,6 +7946,10 @@
     <w:pPr>
       <w:spacing w:after="0" w:line="240" w:lineRule="auto"/>
     </w:pPr>
+    <w:rPr>
+      <w:rFonts w:ascii="Arial" w:eastAsia="Arial" w:hAnsi="Arial"/>
+      <w:sz w:val="24"/>
+    </w:rPr>
     <w:tblPr>
       <w:tblStyleRowBandSize w:val="1"/>
       <w:tblStyleColBandSize w:val="1"/>
@@ -7782,6 +8092,10 @@
     <w:pPr>
       <w:spacing w:after="0" w:line="240" w:lineRule="auto"/>
     </w:pPr>
+    <w:rPr>
+      <w:rFonts w:ascii="Arial" w:eastAsia="Arial" w:hAnsi="Arial"/>
+      <w:sz w:val="24"/>
+    </w:rPr>
     <w:tblPr>
       <w:tblStyleRowBandSize w:val="1"/>
       <w:tblStyleColBandSize w:val="1"/>
@@ -7924,6 +8238,10 @@
     <w:pPr>
       <w:spacing w:after="0" w:line="240" w:lineRule="auto"/>
     </w:pPr>
+    <w:rPr>
+      <w:rFonts w:ascii="Arial" w:eastAsia="Arial" w:hAnsi="Arial"/>
+      <w:sz w:val="24"/>
+    </w:rPr>
     <w:tblPr>
       <w:tblStyleRowBandSize w:val="1"/>
       <w:tblStyleColBandSize w:val="1"/>
@@ -8066,6 +8384,10 @@
     <w:pPr>
       <w:spacing w:after="0" w:line="240" w:lineRule="auto"/>
     </w:pPr>
+    <w:rPr>
+      <w:rFonts w:ascii="Arial" w:eastAsia="Arial" w:hAnsi="Arial"/>
+      <w:sz w:val="24"/>
+    </w:rPr>
     <w:tblPr>
       <w:tblStyleRowBandSize w:val="1"/>
       <w:tblStyleColBandSize w:val="1"/>
@@ -8208,6 +8530,10 @@
     <w:pPr>
       <w:spacing w:after="0" w:line="240" w:lineRule="auto"/>
     </w:pPr>
+    <w:rPr>
+      <w:rFonts w:ascii="Arial" w:eastAsia="Arial" w:hAnsi="Arial"/>
+      <w:sz w:val="24"/>
+    </w:rPr>
     <w:tblPr>
       <w:tblStyleRowBandSize w:val="1"/>
       <w:tblStyleColBandSize w:val="1"/>
@@ -8351,7 +8677,9 @@
       <w:spacing w:after="0" w:line="240" w:lineRule="auto"/>
     </w:pPr>
     <w:rPr>
+      <w:rFonts w:ascii="Arial" w:eastAsia="Arial" w:hAnsi="Arial"/>
       <w:color w:val="000000" w:themeColor="text1"/>
+      <w:sz w:val="24"/>
     </w:rPr>
     <w:tblPr>
       <w:tblStyleRowBandSize w:val="1"/>
@@ -8428,7 +8756,9 @@
       <w:spacing w:after="0" w:line="240" w:lineRule="auto"/>
     </w:pPr>
     <w:rPr>
+      <w:rFonts w:ascii="Arial" w:eastAsia="Arial" w:hAnsi="Arial"/>
       <w:color w:val="000000" w:themeColor="text1"/>
+      <w:sz w:val="24"/>
     </w:rPr>
     <w:tblPr>
       <w:tblStyleRowBandSize w:val="1"/>
@@ -8505,7 +8835,9 @@
       <w:spacing w:after="0" w:line="240" w:lineRule="auto"/>
     </w:pPr>
     <w:rPr>
+      <w:rFonts w:ascii="Arial" w:eastAsia="Arial" w:hAnsi="Arial"/>
       <w:color w:val="000000" w:themeColor="text1"/>
+      <w:sz w:val="24"/>
     </w:rPr>
     <w:tblPr>
       <w:tblStyleRowBandSize w:val="1"/>
@@ -8582,7 +8914,9 @@
       <w:spacing w:after="0" w:line="240" w:lineRule="auto"/>
     </w:pPr>
     <w:rPr>
+      <w:rFonts w:ascii="Arial" w:eastAsia="Arial" w:hAnsi="Arial"/>
       <w:color w:val="000000" w:themeColor="text1"/>
+      <w:sz w:val="24"/>
     </w:rPr>
     <w:tblPr>
       <w:tblStyleRowBandSize w:val="1"/>
@@ -8659,7 +8993,9 @@
       <w:spacing w:after="0" w:line="240" w:lineRule="auto"/>
     </w:pPr>
     <w:rPr>
+      <w:rFonts w:ascii="Arial" w:eastAsia="Arial" w:hAnsi="Arial"/>
       <w:color w:val="000000" w:themeColor="text1"/>
+      <w:sz w:val="24"/>
     </w:rPr>
     <w:tblPr>
       <w:tblStyleRowBandSize w:val="1"/>
@@ -8736,7 +9072,9 @@
       <w:spacing w:after="0" w:line="240" w:lineRule="auto"/>
     </w:pPr>
     <w:rPr>
+      <w:rFonts w:ascii="Arial" w:eastAsia="Arial" w:hAnsi="Arial"/>
       <w:color w:val="000000" w:themeColor="text1"/>
+      <w:sz w:val="24"/>
     </w:rPr>
     <w:tblPr>
       <w:tblStyleRowBandSize w:val="1"/>
@@ -8813,7 +9151,9 @@
       <w:spacing w:after="0" w:line="240" w:lineRule="auto"/>
     </w:pPr>
     <w:rPr>
+      <w:rFonts w:ascii="Arial" w:eastAsia="Arial" w:hAnsi="Arial"/>
       <w:color w:val="000000" w:themeColor="text1"/>
+      <w:sz w:val="24"/>
     </w:rPr>
     <w:tblPr>
       <w:tblStyleRowBandSize w:val="1"/>
@@ -8892,6 +9232,7 @@
     <w:rPr>
       <w:rFonts w:asciiTheme="majorHAnsi" w:eastAsiaTheme="majorEastAsia" w:hAnsiTheme="majorHAnsi" w:cstheme="majorBidi"/>
       <w:color w:val="000000" w:themeColor="text1"/>
+      <w:sz w:val="24"/>
     </w:rPr>
     <w:tblPr>
       <w:tblStyleRowBandSize w:val="1"/>
@@ -9013,6 +9354,7 @@
     <w:rPr>
       <w:rFonts w:asciiTheme="majorHAnsi" w:eastAsiaTheme="majorEastAsia" w:hAnsiTheme="majorHAnsi" w:cstheme="majorBidi"/>
       <w:color w:val="000000" w:themeColor="text1"/>
+      <w:sz w:val="24"/>
     </w:rPr>
     <w:tblPr>
       <w:tblStyleRowBandSize w:val="1"/>
@@ -9134,6 +9476,7 @@
     <w:rPr>
       <w:rFonts w:asciiTheme="majorHAnsi" w:eastAsiaTheme="majorEastAsia" w:hAnsiTheme="majorHAnsi" w:cstheme="majorBidi"/>
       <w:color w:val="000000" w:themeColor="text1"/>
+      <w:sz w:val="24"/>
     </w:rPr>
     <w:tblPr>
       <w:tblStyleRowBandSize w:val="1"/>
@@ -9255,6 +9598,7 @@
     <w:rPr>
       <w:rFonts w:asciiTheme="majorHAnsi" w:eastAsiaTheme="majorEastAsia" w:hAnsiTheme="majorHAnsi" w:cstheme="majorBidi"/>
       <w:color w:val="000000" w:themeColor="text1"/>
+      <w:sz w:val="24"/>
     </w:rPr>
     <w:tblPr>
       <w:tblStyleRowBandSize w:val="1"/>
@@ -9376,6 +9720,7 @@
     <w:rPr>
       <w:rFonts w:asciiTheme="majorHAnsi" w:eastAsiaTheme="majorEastAsia" w:hAnsiTheme="majorHAnsi" w:cstheme="majorBidi"/>
       <w:color w:val="000000" w:themeColor="text1"/>
+      <w:sz w:val="24"/>
     </w:rPr>
     <w:tblPr>
       <w:tblStyleRowBandSize w:val="1"/>
@@ -9497,6 +9842,7 @@
     <w:rPr>
       <w:rFonts w:asciiTheme="majorHAnsi" w:eastAsiaTheme="majorEastAsia" w:hAnsiTheme="majorHAnsi" w:cstheme="majorBidi"/>
       <w:color w:val="000000" w:themeColor="text1"/>
+      <w:sz w:val="24"/>
     </w:rPr>
     <w:tblPr>
       <w:tblStyleRowBandSize w:val="1"/>
@@ -9618,6 +9964,7 @@
     <w:rPr>
       <w:rFonts w:asciiTheme="majorHAnsi" w:eastAsiaTheme="majorEastAsia" w:hAnsiTheme="majorHAnsi" w:cstheme="majorBidi"/>
       <w:color w:val="000000" w:themeColor="text1"/>
+      <w:sz w:val="24"/>
     </w:rPr>
     <w:tblPr>
       <w:tblStyleRowBandSize w:val="1"/>
@@ -9736,6 +10083,10 @@
     <w:pPr>
       <w:spacing w:after="0" w:line="240" w:lineRule="auto"/>
     </w:pPr>
+    <w:rPr>
+      <w:rFonts w:ascii="Arial" w:eastAsia="Arial" w:hAnsi="Arial"/>
+      <w:sz w:val="24"/>
+    </w:rPr>
     <w:tblPr>
       <w:tblStyleRowBandSize w:val="1"/>
       <w:tblStyleColBandSize w:val="1"/>
@@ -9802,6 +10153,10 @@
     <w:pPr>
       <w:spacing w:after="0" w:line="240" w:lineRule="auto"/>
     </w:pPr>
+    <w:rPr>
+      <w:rFonts w:ascii="Arial" w:eastAsia="Arial" w:hAnsi="Arial"/>
+      <w:sz w:val="24"/>
+    </w:rPr>
     <w:tblPr>
       <w:tblStyleRowBandSize w:val="1"/>
       <w:tblStyleColBandSize w:val="1"/>
@@ -9868,6 +10223,10 @@
     <w:pPr>
       <w:spacing w:after="0" w:line="240" w:lineRule="auto"/>
     </w:pPr>
+    <w:rPr>
+      <w:rFonts w:ascii="Arial" w:eastAsia="Arial" w:hAnsi="Arial"/>
+      <w:sz w:val="24"/>
+    </w:rPr>
     <w:tblPr>
       <w:tblStyleRowBandSize w:val="1"/>
       <w:tblStyleColBandSize w:val="1"/>
@@ -9934,6 +10293,10 @@
     <w:pPr>
       <w:spacing w:after="0" w:line="240" w:lineRule="auto"/>
     </w:pPr>
+    <w:rPr>
+      <w:rFonts w:ascii="Arial" w:eastAsia="Arial" w:hAnsi="Arial"/>
+      <w:sz w:val="24"/>
+    </w:rPr>
     <w:tblPr>
       <w:tblStyleRowBandSize w:val="1"/>
       <w:tblStyleColBandSize w:val="1"/>
@@ -10000,6 +10363,10 @@
     <w:pPr>
       <w:spacing w:after="0" w:line="240" w:lineRule="auto"/>
     </w:pPr>
+    <w:rPr>
+      <w:rFonts w:ascii="Arial" w:eastAsia="Arial" w:hAnsi="Arial"/>
+      <w:sz w:val="24"/>
+    </w:rPr>
     <w:tblPr>
       <w:tblStyleRowBandSize w:val="1"/>
       <w:tblStyleColBandSize w:val="1"/>
@@ -10066,6 +10433,10 @@
     <w:pPr>
       <w:spacing w:after="0" w:line="240" w:lineRule="auto"/>
     </w:pPr>
+    <w:rPr>
+      <w:rFonts w:ascii="Arial" w:eastAsia="Arial" w:hAnsi="Arial"/>
+      <w:sz w:val="24"/>
+    </w:rPr>
     <w:tblPr>
       <w:tblStyleRowBandSize w:val="1"/>
       <w:tblStyleColBandSize w:val="1"/>
@@ -10132,6 +10503,10 @@
     <w:pPr>
       <w:spacing w:after="0" w:line="240" w:lineRule="auto"/>
     </w:pPr>
+    <w:rPr>
+      <w:rFonts w:ascii="Arial" w:eastAsia="Arial" w:hAnsi="Arial"/>
+      <w:sz w:val="24"/>
+    </w:rPr>
     <w:tblPr>
       <w:tblStyleRowBandSize w:val="1"/>
       <w:tblStyleColBandSize w:val="1"/>
@@ -10201,6 +10576,7 @@
     <w:rPr>
       <w:rFonts w:asciiTheme="majorHAnsi" w:eastAsiaTheme="majorEastAsia" w:hAnsiTheme="majorHAnsi" w:cstheme="majorBidi"/>
       <w:color w:val="000000" w:themeColor="text1"/>
+      <w:sz w:val="24"/>
     </w:rPr>
     <w:tblPr>
       <w:tblStyleRowBandSize w:val="1"/>
@@ -10319,6 +10695,7 @@
     <w:rPr>
       <w:rFonts w:asciiTheme="majorHAnsi" w:eastAsiaTheme="majorEastAsia" w:hAnsiTheme="majorHAnsi" w:cstheme="majorBidi"/>
       <w:color w:val="000000" w:themeColor="text1"/>
+      <w:sz w:val="24"/>
     </w:rPr>
     <w:tblPr>
       <w:tblStyleRowBandSize w:val="1"/>
@@ -10437,6 +10814,7 @@
     <w:rPr>
       <w:rFonts w:asciiTheme="majorHAnsi" w:eastAsiaTheme="majorEastAsia" w:hAnsiTheme="majorHAnsi" w:cstheme="majorBidi"/>
       <w:color w:val="000000" w:themeColor="text1"/>
+      <w:sz w:val="24"/>
     </w:rPr>
     <w:tblPr>
       <w:tblStyleRowBandSize w:val="1"/>
@@ -10555,6 +10933,7 @@
     <w:rPr>
       <w:rFonts w:asciiTheme="majorHAnsi" w:eastAsiaTheme="majorEastAsia" w:hAnsiTheme="majorHAnsi" w:cstheme="majorBidi"/>
       <w:color w:val="000000" w:themeColor="text1"/>
+      <w:sz w:val="24"/>
     </w:rPr>
     <w:tblPr>
       <w:tblStyleRowBandSize w:val="1"/>
@@ -10673,6 +11052,7 @@
     <w:rPr>
       <w:rFonts w:asciiTheme="majorHAnsi" w:eastAsiaTheme="majorEastAsia" w:hAnsiTheme="majorHAnsi" w:cstheme="majorBidi"/>
       <w:color w:val="000000" w:themeColor="text1"/>
+      <w:sz w:val="24"/>
     </w:rPr>
     <w:tblPr>
       <w:tblStyleRowBandSize w:val="1"/>
@@ -10791,6 +11171,7 @@
     <w:rPr>
       <w:rFonts w:asciiTheme="majorHAnsi" w:eastAsiaTheme="majorEastAsia" w:hAnsiTheme="majorHAnsi" w:cstheme="majorBidi"/>
       <w:color w:val="000000" w:themeColor="text1"/>
+      <w:sz w:val="24"/>
     </w:rPr>
     <w:tblPr>
       <w:tblStyleRowBandSize w:val="1"/>
@@ -10909,6 +11290,7 @@
     <w:rPr>
       <w:rFonts w:asciiTheme="majorHAnsi" w:eastAsiaTheme="majorEastAsia" w:hAnsiTheme="majorHAnsi" w:cstheme="majorBidi"/>
       <w:color w:val="000000" w:themeColor="text1"/>
+      <w:sz w:val="24"/>
     </w:rPr>
     <w:tblPr>
       <w:tblStyleRowBandSize w:val="1"/>
@@ -11024,6 +11406,10 @@
     <w:pPr>
       <w:spacing w:after="0" w:line="240" w:lineRule="auto"/>
     </w:pPr>
+    <w:rPr>
+      <w:rFonts w:ascii="Arial" w:eastAsia="Arial" w:hAnsi="Arial"/>
+      <w:sz w:val="24"/>
+    </w:rPr>
     <w:tblPr>
       <w:tblStyleRowBandSize w:val="1"/>
       <w:tblStyleColBandSize w:val="1"/>
@@ -11158,6 +11544,10 @@
     <w:pPr>
       <w:spacing w:after="0" w:line="240" w:lineRule="auto"/>
     </w:pPr>
+    <w:rPr>
+      <w:rFonts w:ascii="Arial" w:eastAsia="Arial" w:hAnsi="Arial"/>
+      <w:sz w:val="24"/>
+    </w:rPr>
     <w:tblPr>
       <w:tblStyleRowBandSize w:val="1"/>
       <w:tblStyleColBandSize w:val="1"/>
@@ -11292,6 +11682,10 @@
     <w:pPr>
       <w:spacing w:after="0" w:line="240" w:lineRule="auto"/>
     </w:pPr>
+    <w:rPr>
+      <w:rFonts w:ascii="Arial" w:eastAsia="Arial" w:hAnsi="Arial"/>
+      <w:sz w:val="24"/>
+    </w:rPr>
     <w:tblPr>
       <w:tblStyleRowBandSize w:val="1"/>
       <w:tblStyleColBandSize w:val="1"/>
@@ -11426,6 +11820,10 @@
     <w:pPr>
       <w:spacing w:after="0" w:line="240" w:lineRule="auto"/>
     </w:pPr>
+    <w:rPr>
+      <w:rFonts w:ascii="Arial" w:eastAsia="Arial" w:hAnsi="Arial"/>
+      <w:sz w:val="24"/>
+    </w:rPr>
     <w:tblPr>
       <w:tblStyleRowBandSize w:val="1"/>
       <w:tblStyleColBandSize w:val="1"/>
@@ -11560,6 +11958,10 @@
     <w:pPr>
       <w:spacing w:after="0" w:line="240" w:lineRule="auto"/>
     </w:pPr>
+    <w:rPr>
+      <w:rFonts w:ascii="Arial" w:eastAsia="Arial" w:hAnsi="Arial"/>
+      <w:sz w:val="24"/>
+    </w:rPr>
     <w:tblPr>
       <w:tblStyleRowBandSize w:val="1"/>
       <w:tblStyleColBandSize w:val="1"/>
@@ -11694,6 +12096,10 @@
     <w:pPr>
       <w:spacing w:after="0" w:line="240" w:lineRule="auto"/>
     </w:pPr>
+    <w:rPr>
+      <w:rFonts w:ascii="Arial" w:eastAsia="Arial" w:hAnsi="Arial"/>
+      <w:sz w:val="24"/>
+    </w:rPr>
     <w:tblPr>
       <w:tblStyleRowBandSize w:val="1"/>
       <w:tblStyleColBandSize w:val="1"/>
@@ -11828,6 +12234,10 @@
     <w:pPr>
       <w:spacing w:after="0" w:line="240" w:lineRule="auto"/>
     </w:pPr>
+    <w:rPr>
+      <w:rFonts w:ascii="Arial" w:eastAsia="Arial" w:hAnsi="Arial"/>
+      <w:sz w:val="24"/>
+    </w:rPr>
     <w:tblPr>
       <w:tblStyleRowBandSize w:val="1"/>
       <w:tblStyleColBandSize w:val="1"/>
@@ -11963,7 +12373,9 @@
       <w:spacing w:after="0" w:line="240" w:lineRule="auto"/>
     </w:pPr>
     <w:rPr>
+      <w:rFonts w:ascii="Arial" w:eastAsia="Arial" w:hAnsi="Arial"/>
       <w:color w:val="FFFFFF" w:themeColor="background1"/>
+      <w:sz w:val="24"/>
     </w:rPr>
     <w:tblPr>
       <w:tblStyleRowBandSize w:val="1"/>
@@ -12070,7 +12482,9 @@
       <w:spacing w:after="0" w:line="240" w:lineRule="auto"/>
     </w:pPr>
     <w:rPr>
+      <w:rFonts w:ascii="Arial" w:eastAsia="Arial" w:hAnsi="Arial"/>
       <w:color w:val="FFFFFF" w:themeColor="background1"/>
+      <w:sz w:val="24"/>
     </w:rPr>
     <w:tblPr>
       <w:tblStyleRowBandSize w:val="1"/>
@@ -12177,7 +12591,9 @@
       <w:spacing w:after="0" w:line="240" w:lineRule="auto"/>
     </w:pPr>
     <w:rPr>
+      <w:rFonts w:ascii="Arial" w:eastAsia="Arial" w:hAnsi="Arial"/>
       <w:color w:val="FFFFFF" w:themeColor="background1"/>
+      <w:sz w:val="24"/>
     </w:rPr>
     <w:tblPr>
       <w:tblStyleRowBandSize w:val="1"/>
@@ -12284,7 +12700,9 @@
       <w:spacing w:after="0" w:line="240" w:lineRule="auto"/>
     </w:pPr>
     <w:rPr>
+      <w:rFonts w:ascii="Arial" w:eastAsia="Arial" w:hAnsi="Arial"/>
       <w:color w:val="FFFFFF" w:themeColor="background1"/>
+      <w:sz w:val="24"/>
     </w:rPr>
     <w:tblPr>
       <w:tblStyleRowBandSize w:val="1"/>
@@ -12391,7 +12809,9 @@
       <w:spacing w:after="0" w:line="240" w:lineRule="auto"/>
     </w:pPr>
     <w:rPr>
+      <w:rFonts w:ascii="Arial" w:eastAsia="Arial" w:hAnsi="Arial"/>
       <w:color w:val="FFFFFF" w:themeColor="background1"/>
+      <w:sz w:val="24"/>
     </w:rPr>
     <w:tblPr>
       <w:tblStyleRowBandSize w:val="1"/>
@@ -12498,7 +12918,9 @@
       <w:spacing w:after="0" w:line="240" w:lineRule="auto"/>
     </w:pPr>
     <w:rPr>
+      <w:rFonts w:ascii="Arial" w:eastAsia="Arial" w:hAnsi="Arial"/>
       <w:color w:val="FFFFFF" w:themeColor="background1"/>
+      <w:sz w:val="24"/>
     </w:rPr>
     <w:tblPr>
       <w:tblStyleRowBandSize w:val="1"/>
@@ -12605,7 +13027,9 @@
       <w:spacing w:after="0" w:line="240" w:lineRule="auto"/>
     </w:pPr>
     <w:rPr>
+      <w:rFonts w:ascii="Arial" w:eastAsia="Arial" w:hAnsi="Arial"/>
       <w:color w:val="FFFFFF" w:themeColor="background1"/>
+      <w:sz w:val="24"/>
     </w:rPr>
     <w:tblPr>
       <w:tblStyleRowBandSize w:val="1"/>
@@ -12712,7 +13136,9 @@
       <w:spacing w:after="0" w:line="240" w:lineRule="auto"/>
     </w:pPr>
     <w:rPr>
+      <w:rFonts w:ascii="Arial" w:eastAsia="Arial" w:hAnsi="Arial"/>
       <w:color w:val="000000" w:themeColor="text1"/>
+      <w:sz w:val="24"/>
     </w:rPr>
     <w:tblPr>
       <w:tblStyleRowBandSize w:val="1"/>
@@ -12827,7 +13253,9 @@
       <w:spacing w:after="0" w:line="240" w:lineRule="auto"/>
     </w:pPr>
     <w:rPr>
+      <w:rFonts w:ascii="Arial" w:eastAsia="Arial" w:hAnsi="Arial"/>
       <w:color w:val="000000" w:themeColor="text1"/>
+      <w:sz w:val="24"/>
     </w:rPr>
     <w:tblPr>
       <w:tblStyleRowBandSize w:val="1"/>
@@ -12942,7 +13370,9 @@
       <w:spacing w:after="0" w:line="240" w:lineRule="auto"/>
     </w:pPr>
     <w:rPr>
+      <w:rFonts w:ascii="Arial" w:eastAsia="Arial" w:hAnsi="Arial"/>
       <w:color w:val="000000" w:themeColor="text1"/>
+      <w:sz w:val="24"/>
     </w:rPr>
     <w:tblPr>
       <w:tblStyleRowBandSize w:val="1"/>
@@ -13057,7 +13487,9 @@
       <w:spacing w:after="0" w:line="240" w:lineRule="auto"/>
     </w:pPr>
     <w:rPr>
+      <w:rFonts w:ascii="Arial" w:eastAsia="Arial" w:hAnsi="Arial"/>
       <w:color w:val="000000" w:themeColor="text1"/>
+      <w:sz w:val="24"/>
     </w:rPr>
     <w:tblPr>
       <w:tblStyleRowBandSize w:val="1"/>
@@ -13162,7 +13594,9 @@
       <w:spacing w:after="0" w:line="240" w:lineRule="auto"/>
     </w:pPr>
     <w:rPr>
+      <w:rFonts w:ascii="Arial" w:eastAsia="Arial" w:hAnsi="Arial"/>
       <w:color w:val="000000" w:themeColor="text1"/>
+      <w:sz w:val="24"/>
     </w:rPr>
     <w:tblPr>
       <w:tblStyleRowBandSize w:val="1"/>
@@ -13277,7 +13711,9 @@
       <w:spacing w:after="0" w:line="240" w:lineRule="auto"/>
     </w:pPr>
     <w:rPr>
+      <w:rFonts w:ascii="Arial" w:eastAsia="Arial" w:hAnsi="Arial"/>
       <w:color w:val="000000" w:themeColor="text1"/>
+      <w:sz w:val="24"/>
     </w:rPr>
     <w:tblPr>
       <w:tblStyleRowBandSize w:val="1"/>
@@ -13392,7 +13828,9 @@
       <w:spacing w:after="0" w:line="240" w:lineRule="auto"/>
     </w:pPr>
     <w:rPr>
+      <w:rFonts w:ascii="Arial" w:eastAsia="Arial" w:hAnsi="Arial"/>
       <w:color w:val="000000" w:themeColor="text1"/>
+      <w:sz w:val="24"/>
     </w:rPr>
     <w:tblPr>
       <w:tblStyleRowBandSize w:val="1"/>
@@ -13507,7 +13945,9 @@
       <w:spacing w:after="0" w:line="240" w:lineRule="auto"/>
     </w:pPr>
     <w:rPr>
+      <w:rFonts w:ascii="Arial" w:eastAsia="Arial" w:hAnsi="Arial"/>
       <w:color w:val="000000" w:themeColor="text1"/>
+      <w:sz w:val="24"/>
     </w:rPr>
     <w:tblPr>
       <w:tblStyleRowBandSize w:val="1"/>
@@ -13586,7 +14026,9 @@
       <w:spacing w:after="0" w:line="240" w:lineRule="auto"/>
     </w:pPr>
     <w:rPr>
+      <w:rFonts w:ascii="Arial" w:eastAsia="Arial" w:hAnsi="Arial"/>
       <w:color w:val="000000" w:themeColor="text1"/>
+      <w:sz w:val="24"/>
     </w:rPr>
     <w:tblPr>
       <w:tblStyleRowBandSize w:val="1"/>
@@ -13665,7 +14107,9 @@
       <w:spacing w:after="0" w:line="240" w:lineRule="auto"/>
     </w:pPr>
     <w:rPr>
+      <w:rFonts w:ascii="Arial" w:eastAsia="Arial" w:hAnsi="Arial"/>
       <w:color w:val="000000" w:themeColor="text1"/>
+      <w:sz w:val="24"/>
     </w:rPr>
     <w:tblPr>
       <w:tblStyleRowBandSize w:val="1"/>
@@ -13744,7 +14188,9 @@
       <w:spacing w:after="0" w:line="240" w:lineRule="auto"/>
     </w:pPr>
     <w:rPr>
+      <w:rFonts w:ascii="Arial" w:eastAsia="Arial" w:hAnsi="Arial"/>
       <w:color w:val="000000" w:themeColor="text1"/>
+      <w:sz w:val="24"/>
     </w:rPr>
     <w:tblPr>
       <w:tblStyleRowBandSize w:val="1"/>
@@ -13823,7 +14269,9 @@
       <w:spacing w:after="0" w:line="240" w:lineRule="auto"/>
     </w:pPr>
     <w:rPr>
+      <w:rFonts w:ascii="Arial" w:eastAsia="Arial" w:hAnsi="Arial"/>
       <w:color w:val="000000" w:themeColor="text1"/>
+      <w:sz w:val="24"/>
     </w:rPr>
     <w:tblPr>
       <w:tblStyleRowBandSize w:val="1"/>
@@ -13902,7 +14350,9 @@
       <w:spacing w:after="0" w:line="240" w:lineRule="auto"/>
     </w:pPr>
     <w:rPr>
+      <w:rFonts w:ascii="Arial" w:eastAsia="Arial" w:hAnsi="Arial"/>
       <w:color w:val="000000" w:themeColor="text1"/>
+      <w:sz w:val="24"/>
     </w:rPr>
     <w:tblPr>
       <w:tblStyleRowBandSize w:val="1"/>
@@ -13981,7 +14431,9 @@
       <w:spacing w:after="0" w:line="240" w:lineRule="auto"/>
     </w:pPr>
     <w:rPr>
+      <w:rFonts w:ascii="Arial" w:eastAsia="Arial" w:hAnsi="Arial"/>
       <w:color w:val="000000" w:themeColor="text1"/>
+      <w:sz w:val="24"/>
     </w:rPr>
     <w:tblPr>
       <w:tblStyleRowBandSize w:val="1"/>
@@ -14060,7 +14512,9 @@
       <w:spacing w:after="0" w:line="240" w:lineRule="auto"/>
     </w:pPr>
     <w:rPr>
+      <w:rFonts w:ascii="Arial" w:eastAsia="Arial" w:hAnsi="Arial"/>
       <w:color w:val="000000" w:themeColor="text1"/>
+      <w:sz w:val="24"/>
     </w:rPr>
     <w:tblPr>
       <w:tblStyleRowBandSize w:val="1"/>
@@ -14133,7 +14587,9 @@
       <w:spacing w:after="0" w:line="240" w:lineRule="auto"/>
     </w:pPr>
     <w:rPr>
+      <w:rFonts w:ascii="Arial" w:eastAsia="Arial" w:hAnsi="Arial"/>
       <w:color w:val="000000" w:themeColor="text1"/>
+      <w:sz w:val="24"/>
     </w:rPr>
     <w:tblPr>
       <w:tblStyleRowBandSize w:val="1"/>
@@ -14206,7 +14662,9 @@
       <w:spacing w:after="0" w:line="240" w:lineRule="auto"/>
     </w:pPr>
     <w:rPr>
+      <w:rFonts w:ascii="Arial" w:eastAsia="Arial" w:hAnsi="Arial"/>
       <w:color w:val="000000" w:themeColor="text1"/>
+      <w:sz w:val="24"/>
     </w:rPr>
     <w:tblPr>
       <w:tblStyleRowBandSize w:val="1"/>
@@ -14279,7 +14737,9 @@
       <w:spacing w:after="0" w:line="240" w:lineRule="auto"/>
     </w:pPr>
     <w:rPr>
+      <w:rFonts w:ascii="Arial" w:eastAsia="Arial" w:hAnsi="Arial"/>
       <w:color w:val="000000" w:themeColor="text1"/>
+      <w:sz w:val="24"/>
     </w:rPr>
     <w:tblPr>
       <w:tblStyleRowBandSize w:val="1"/>
@@ -14352,7 +14812,9 @@
       <w:spacing w:after="0" w:line="240" w:lineRule="auto"/>
     </w:pPr>
     <w:rPr>
+      <w:rFonts w:ascii="Arial" w:eastAsia="Arial" w:hAnsi="Arial"/>
       <w:color w:val="000000" w:themeColor="text1"/>
+      <w:sz w:val="24"/>
     </w:rPr>
     <w:tblPr>
       <w:tblStyleRowBandSize w:val="1"/>
@@ -14425,7 +14887,9 @@
       <w:spacing w:after="0" w:line="240" w:lineRule="auto"/>
     </w:pPr>
     <w:rPr>
+      <w:rFonts w:ascii="Arial" w:eastAsia="Arial" w:hAnsi="Arial"/>
       <w:color w:val="000000" w:themeColor="text1"/>
+      <w:sz w:val="24"/>
     </w:rPr>
     <w:tblPr>
       <w:tblStyleRowBandSize w:val="1"/>
@@ -14498,7 +14962,9 @@
       <w:spacing w:after="0" w:line="240" w:lineRule="auto"/>
     </w:pPr>
     <w:rPr>
+      <w:rFonts w:ascii="Arial" w:eastAsia="Arial" w:hAnsi="Arial"/>
       <w:color w:val="000000" w:themeColor="text1"/>
+      <w:sz w:val="24"/>
     </w:rPr>
     <w:tblPr>
       <w:tblStyleRowBandSize w:val="1"/>
@@ -14559,6 +15025,120 @@
       <w:tblPr/>
       <w:tcPr>
         <w:shd w:val="clear" w:color="auto" w:fill="FBCAA2" w:themeFill="accent6" w:themeFillTint="7F"/>
+      </w:tcPr>
+    </w:tblStylePr>
+  </w:style>
+  <w:style w:type="character" w:styleId="Hyperlink">
+    <w:name w:val="Hyperlink"/>
+    <w:basedOn w:val="DefaultParagraphFont"/>
+    <w:uiPriority w:val="99"/>
+    <w:unhideWhenUsed/>
+    <w:rsid w:val="0032043B"/>
+    <w:rPr>
+      <w:color w:val="0000FF" w:themeColor="hyperlink"/>
+      <w:u w:val="single"/>
+    </w:rPr>
+  </w:style>
+  <w:style w:type="character" w:styleId="UnresolvedMention">
+    <w:name w:val="Unresolved Mention"/>
+    <w:basedOn w:val="DefaultParagraphFont"/>
+    <w:uiPriority w:val="99"/>
+    <w:semiHidden/>
+    <w:unhideWhenUsed/>
+    <w:rsid w:val="0032043B"/>
+    <w:rPr>
+      <w:color w:val="605E5C"/>
+      <w:shd w:val="clear" w:color="auto" w:fill="E1DFDD"/>
+    </w:rPr>
+  </w:style>
+  <w:style w:type="character" w:styleId="FollowedHyperlink">
+    <w:name w:val="FollowedHyperlink"/>
+    <w:basedOn w:val="DefaultParagraphFont"/>
+    <w:uiPriority w:val="99"/>
+    <w:semiHidden/>
+    <w:unhideWhenUsed/>
+    <w:rsid w:val="0032043B"/>
+    <w:rPr>
+      <w:color w:val="800080" w:themeColor="followedHyperlink"/>
+      <w:u w:val="single"/>
+    </w:rPr>
+  </w:style>
+  <w:style w:type="paragraph" w:styleId="NormalWeb">
+    <w:name w:val="Normal (Web)"/>
+    <w:basedOn w:val="Normal"/>
+    <w:uiPriority w:val="99"/>
+    <w:semiHidden/>
+    <w:unhideWhenUsed/>
+    <w:rsid w:val="0032043B"/>
+    <w:pPr>
+      <w:spacing w:before="100" w:beforeAutospacing="1" w:after="100" w:afterAutospacing="1" w:line="240" w:lineRule="auto"/>
+    </w:pPr>
+    <w:rPr>
+      <w:rFonts w:ascii="Times New Roman" w:eastAsia="Times New Roman" w:hAnsi="Times New Roman" w:cs="Times New Roman"/>
+      <w:szCs w:val="24"/>
+      <w:lang w:val="en-MT" w:eastAsia="en-GB"/>
+    </w:rPr>
+  </w:style>
+  <w:style w:type="table" w:styleId="PlainTable1">
+    <w:name w:val="Plain Table 1"/>
+    <w:basedOn w:val="TableNormal"/>
+    <w:uiPriority w:val="99"/>
+    <w:rsid w:val="009E69F9"/>
+    <w:pPr>
+      <w:spacing w:after="0" w:line="240" w:lineRule="auto"/>
+    </w:pPr>
+    <w:tblPr>
+      <w:tblStyleRowBandSize w:val="1"/>
+      <w:tblStyleColBandSize w:val="1"/>
+      <w:tblBorders>
+        <w:top w:val="single" w:sz="4" w:space="0" w:color="BFBFBF" w:themeColor="background1" w:themeShade="BF"/>
+        <w:left w:val="single" w:sz="4" w:space="0" w:color="BFBFBF" w:themeColor="background1" w:themeShade="BF"/>
+        <w:bottom w:val="single" w:sz="4" w:space="0" w:color="BFBFBF" w:themeColor="background1" w:themeShade="BF"/>
+        <w:right w:val="single" w:sz="4" w:space="0" w:color="BFBFBF" w:themeColor="background1" w:themeShade="BF"/>
+        <w:insideH w:val="single" w:sz="4" w:space="0" w:color="BFBFBF" w:themeColor="background1" w:themeShade="BF"/>
+        <w:insideV w:val="single" w:sz="4" w:space="0" w:color="BFBFBF" w:themeColor="background1" w:themeShade="BF"/>
+      </w:tblBorders>
+    </w:tblPr>
+    <w:tblStylePr w:type="firstRow">
+      <w:rPr>
+        <w:b/>
+        <w:bCs/>
+      </w:rPr>
+    </w:tblStylePr>
+    <w:tblStylePr w:type="lastRow">
+      <w:rPr>
+        <w:b/>
+        <w:bCs/>
+      </w:rPr>
+      <w:tblPr/>
+      <w:tcPr>
+        <w:tcBorders>
+          <w:top w:val="double" w:sz="4" w:space="0" w:color="BFBFBF" w:themeColor="background1" w:themeShade="BF"/>
+        </w:tcBorders>
+      </w:tcPr>
+    </w:tblStylePr>
+    <w:tblStylePr w:type="firstCol">
+      <w:rPr>
+        <w:b/>
+        <w:bCs/>
+      </w:rPr>
+    </w:tblStylePr>
+    <w:tblStylePr w:type="lastCol">
+      <w:rPr>
+        <w:b/>
+        <w:bCs/>
+      </w:rPr>
+    </w:tblStylePr>
+    <w:tblStylePr w:type="band1Vert">
+      <w:tblPr/>
+      <w:tcPr>
+        <w:shd w:val="clear" w:color="auto" w:fill="F2F2F2" w:themeFill="background1" w:themeFillShade="F2"/>
+      </w:tcPr>
+    </w:tblStylePr>
+    <w:tblStylePr w:type="band1Horz">
+      <w:tblPr/>
+      <w:tcPr>
+        <w:shd w:val="clear" w:color="auto" w:fill="F2F2F2" w:themeFill="background1" w:themeFillShade="F2"/>
       </w:tcPr>
     </w:tblStylePr>
   </w:style>

</xml_diff>

<commit_message>
Update Unit 12 portfolio download
</commit_message>
<xml_diff>
--- a/Module 5 Intelligent Agent Unit 12 - Individual e-Portfolio Submission.docx
+++ b/Module 5 Intelligent Agent Unit 12 - Individual e-Portfolio Submission.docx
@@ -1,6 +1,6 @@
 
 <file path=word/document.xml><?xml version="1.0" encoding="utf-8"?>
-<w:document xmlns:wpc="http://schemas.microsoft.com/office/word/2010/wordprocessingCanvas" xmlns:cx="http://schemas.microsoft.com/office/drawing/2014/chartex" xmlns:cx1="http://schemas.microsoft.com/office/drawing/2015/9/8/chartex" xmlns:cx2="http://schemas.microsoft.com/office/drawing/2015/10/21/chartex" xmlns:cx3="http://schemas.microsoft.com/office/drawing/2016/5/9/chartex" xmlns:cx4="http://schemas.microsoft.com/office/drawing/2016/5/10/chartex" xmlns:cx5="http://schemas.microsoft.com/office/drawing/2016/5/11/chartex" xmlns:cx6="http://schemas.microsoft.com/office/drawing/2016/5/12/chartex" xmlns:cx7="http://schemas.microsoft.com/office/drawing/2016/5/13/chartex" xmlns:cx8="http://schemas.microsoft.com/office/drawing/2016/5/14/chartex" xmlns:mc="http://schemas.openxmlformats.org/markup-compatibility/2006" xmlns:m="http://schemas.openxmlformats.org/officeDocument/2006/math" xmlns:aink="http://schemas.microsoft.com/office/drawing/2016/ink" xmlns:am3d="http://schemas.microsoft.com/office/drawing/2017/model3d" xmlns:oel="http://schemas.microsoft.com/office/2019/extlst" xmlns:r="http://schemas.openxmlformats.org/officeDocument/2006/relationships" xmlns:wp14="http://schemas.microsoft.com/office/word/2010/wordprocessingDrawing" xmlns:wp="http://schemas.openxmlformats.org/drawingml/2006/wordprocessingDrawing" xmlns:wpg="http://schemas.microsoft.com/office/word/2010/wordprocessingGroup" xmlns:wpi="http://schemas.microsoft.com/office/word/2010/wordprocessingInk" xmlns:wps="http://schemas.microsoft.com/office/word/2010/wordprocessingShape" xmlns:o="urn:schemas-microsoft-com:office:office" xmlns:v="urn:schemas-microsoft-com:vml" xmlns:w10="urn:schemas-microsoft-com:office:word" xmlns:w="http://schemas.openxmlformats.org/wordprocessingml/2006/main" xmlns:w14="http://schemas.microsoft.com/office/word/2010/wordml" xmlns:w15="http://schemas.microsoft.com/office/word/2012/wordml" xmlns:w16cex="http://schemas.microsoft.com/office/word/2018/wordml/cex" xmlns:w16cid="http://schemas.microsoft.com/office/word/2016/wordml/cid" xmlns:w16="http://schemas.microsoft.com/office/word/2018/wordml" xmlns:w16sdtdh="http://schemas.microsoft.com/office/word/2020/wordml/sdtdatahash" xmlns:w16sdtfl="http://schemas.microsoft.com/office/word/2024/wordml/sdtformatlock" xmlns:w16se="http://schemas.microsoft.com/office/word/2015/wordml/symex" xmlns:w16du="http://schemas.microsoft.com/office/word/2023/wordml/word16du" xmlns:wne="http://schemas.microsoft.com/office/word/2006/wordml" mc:Ignorable="w14 w15 w16se w16cid w16 w16cex w16sdtdh w16sdtfl w16du wp14">
+<w:document xmlns:wpc="http://schemas.microsoft.com/office/word/2010/wordprocessingCanvas" xmlns:cx="http://schemas.microsoft.com/office/drawing/2014/chartex" xmlns:cx1="http://schemas.microsoft.com/office/drawing/2015/9/8/chartex" xmlns:cx2="http://schemas.microsoft.com/office/drawing/2015/10/21/chartex" xmlns:cx3="http://schemas.microsoft.com/office/drawing/2016/5/9/chartex" xmlns:cx4="http://schemas.microsoft.com/office/drawing/2016/5/10/chartex" xmlns:cx5="http://schemas.microsoft.com/office/drawing/2016/5/11/chartex" xmlns:cx6="http://schemas.microsoft.com/office/drawing/2016/5/12/chartex" xmlns:cx7="http://schemas.microsoft.com/office/drawing/2016/5/13/chartex" xmlns:cx8="http://schemas.microsoft.com/office/drawing/2016/5/14/chartex" xmlns:mc="http://schemas.openxmlformats.org/markup-compatibility/2006" xmlns:aink="http://schemas.microsoft.com/office/drawing/2016/ink" xmlns:am3d="http://schemas.microsoft.com/office/drawing/2017/model3d" xmlns:o="urn:schemas-microsoft-com:office:office" xmlns:oel="http://schemas.microsoft.com/office/2019/extlst" xmlns:r="http://schemas.openxmlformats.org/officeDocument/2006/relationships" xmlns:m="http://schemas.openxmlformats.org/officeDocument/2006/math" xmlns:v="urn:schemas-microsoft-com:vml" xmlns:wp14="http://schemas.microsoft.com/office/word/2010/wordprocessingDrawing" xmlns:wp="http://schemas.openxmlformats.org/drawingml/2006/wordprocessingDrawing" xmlns:w10="urn:schemas-microsoft-com:office:word" xmlns:w="http://schemas.openxmlformats.org/wordprocessingml/2006/main" xmlns:w14="http://schemas.microsoft.com/office/word/2010/wordml" xmlns:w15="http://schemas.microsoft.com/office/word/2012/wordml" xmlns:w16cex="http://schemas.microsoft.com/office/word/2018/wordml/cex" xmlns:w16cid="http://schemas.microsoft.com/office/word/2016/wordml/cid" xmlns:w16="http://schemas.microsoft.com/office/word/2018/wordml" xmlns:w16du="http://schemas.microsoft.com/office/word/2023/wordml/word16du" xmlns:w16sdtdh="http://schemas.microsoft.com/office/word/2020/wordml/sdtdatahash" xmlns:w16sdtfl="http://schemas.microsoft.com/office/word/2024/wordml/sdtformatlock" xmlns:w16se="http://schemas.microsoft.com/office/word/2015/wordml/symex" xmlns:wpg="http://schemas.microsoft.com/office/word/2010/wordprocessingGroup" xmlns:wpi="http://schemas.microsoft.com/office/word/2010/wordprocessingInk" xmlns:wne="http://schemas.microsoft.com/office/word/2006/wordml" xmlns:wps="http://schemas.microsoft.com/office/word/2010/wordprocessingShape" mc:Ignorable="w14 w15 w16se w16cid w16 w16cex w16sdtdh w16sdtfl w16du wp14">
   <w:body>
     <w:p>
       <w:pPr>
@@ -303,6 +303,7 @@
           <w:bCs/>
           <w:color w:val="000000" w:themeColor="text1"/>
           <w:szCs w:val="24"/>
+          <w:lang w:val="it-IT"/>
         </w:rPr>
       </w:pPr>
       <w:r>
@@ -312,6 +313,7 @@
           <w:bCs/>
           <w:color w:val="000000" w:themeColor="text1"/>
           <w:szCs w:val="24"/>
+          <w:lang w:val="it-IT"/>
         </w:rPr>
         <w:t xml:space="preserve">e-Portfolio URL: </w:t>
       </w:r>
@@ -324,11 +326,15 @@
             <w:color w:val="000000" w:themeColor="text1"/>
             <w:szCs w:val="24"/>
             <w:u w:val="single"/>
+            <w:lang w:val="it-IT"/>
           </w:rPr>
           <w:t>https://ie25073.github.io/</w:t>
         </w:r>
       </w:hyperlink>
       <w:r>
+        <w:rPr>
+          <w:lang w:val="it-IT"/>
+        </w:rPr>
         <w:t xml:space="preserve"> </w:t>
       </w:r>
       <w:r>
@@ -338,6 +344,7 @@
           <w:bCs/>
           <w:color w:val="000000" w:themeColor="text1"/>
           <w:szCs w:val="24"/>
+          <w:lang w:val="it-IT"/>
         </w:rPr>
         <w:t xml:space="preserve"> </w:t>
       </w:r>
@@ -348,6 +355,7 @@
           <w:rFonts w:cs="Arial"/>
           <w:color w:val="000000" w:themeColor="text1"/>
           <w:szCs w:val="24"/>
+          <w:lang w:val="it-IT"/>
         </w:rPr>
       </w:pPr>
       <w:r>
@@ -355,6 +363,7 @@
           <w:rFonts w:cs="Arial"/>
           <w:color w:val="000000" w:themeColor="text1"/>
           <w:szCs w:val="24"/>
+          <w:lang w:val="it-IT"/>
         </w:rPr>
         <w:br w:type="page"/>
       </w:r>
@@ -362,7 +371,7 @@
     <w:p>
       <w:pPr>
         <w:pStyle w:val="Heading1"/>
-        <w:spacing w:before="0"/>
+        <w:spacing w:before="100" w:beforeAutospacing="1" w:after="100" w:afterAutospacing="1"/>
         <w:rPr>
           <w:rFonts w:ascii="Arial" w:hAnsi="Arial" w:cs="Arial"/>
           <w:color w:val="000000" w:themeColor="text1"/>
@@ -382,7 +391,7 @@
     <w:p>
       <w:pPr>
         <w:pStyle w:val="Heading2"/>
-        <w:spacing w:before="0"/>
+        <w:spacing w:before="100" w:beforeAutospacing="1" w:after="100" w:afterAutospacing="1"/>
         <w:rPr>
           <w:rFonts w:ascii="Arial" w:hAnsi="Arial" w:cs="Arial"/>
           <w:color w:val="000000" w:themeColor="text1"/>
@@ -413,7 +422,31 @@
           <w:color w:val="000000" w:themeColor="text1"/>
           <w:szCs w:val="24"/>
         </w:rPr>
-        <w:t>This portfolio records my progression from analysing autonomous agents to designing, implementing and evaluating an academic research agent. In Units 1–3, the first collaborative discussion established that autonomy is not an isolated technical property. My initial emphasis on delegation developed through peer exchanges into a risk-based view: routine, reversible actions may be delegated, but consequential decisions require monitoring, approval and override. The summary connects autonomy with reactivity, proactivity, social ability and the possibility of emergent behaviour (Wooldridge and Jennings, 1995; Jennings, 2000). It provides evidence for learning outcomes 1 and 4 because it compares agent properties while showing how discussion changed my position on organisational responsibility.</w:t>
+        <w:t>This portfolio records my progression from analysing autonomous agents to designing, implementing and evaluating an academic research agent. In Units 1</w:t>
+      </w:r>
+      <w:r>
+        <w:rPr>
+          <w:rFonts w:cs="Arial"/>
+          <w:color w:val="000000" w:themeColor="text1"/>
+          <w:szCs w:val="24"/>
+        </w:rPr>
+        <w:t xml:space="preserve"> – 3, </w:t>
+      </w:r>
+      <w:r>
+        <w:rPr>
+          <w:rFonts w:cs="Arial"/>
+          <w:color w:val="000000" w:themeColor="text1"/>
+          <w:szCs w:val="24"/>
+        </w:rPr>
+        <w:t>the</w:t>
+      </w:r>
+      <w:r>
+        <w:rPr>
+          <w:rFonts w:cs="Arial"/>
+          <w:color w:val="000000" w:themeColor="text1"/>
+          <w:szCs w:val="24"/>
+        </w:rPr>
+        <w:t xml:space="preserve"> first collaborative discussion established that autonomy is not an isolated technical property. My initial emphasis on delegation developed through peer exchanges into a risk-based view: routine, reversible actions may be delegated, but consequential decisions require monitoring, approval and override. The summary connects autonomy with reactivity, proactivity, social ability and the possibility of emergent behaviour (Wooldridge and Jennings, 1995; Jennings, 2000). It provides evidence for learning outcomes 1 and 4 because it compares agent properties while showing how discussion changed my position on organisational responsibility.</w:t>
       </w:r>
     </w:p>
     <w:p>
@@ -450,35 +483,33 @@
           <w:color w:val="000000" w:themeColor="text1"/>
           <w:szCs w:val="24"/>
         </w:rPr>
-        <w:t>The Unit 8 constituency exercise strengthened my understanding of representation. Two parse trees for “The man saw the dog with the telescope” encode different prepositional-</w:t>
+        <w:lastRenderedPageBreak/>
+        <w:t>The Unit 8 constituency exercise strengthened my understanding of representation. Two parse trees for “The man saw the dog with the telescope” encode different prepositional-phrase attachments. An agent selecting one interpretation from syntax alone may act on the wrong meaning; semantic and contextual evidence is required. This small task connects directly to the final project, where a plausible title or abstract is not automatically relevant evidence.</w:t>
       </w:r>
-      <w:r>
+    </w:p>
+    <w:p>
+      <w:pPr>
+        <w:jc w:val="both"/>
         <w:rPr>
           <w:rFonts w:cs="Arial"/>
           <w:color w:val="000000" w:themeColor="text1"/>
           <w:szCs w:val="24"/>
         </w:rPr>
-        <w:lastRenderedPageBreak/>
-        <w:t>phrase attachments. An agent selecting one interpretation from syntax alone may act on the wrong meaning; semantic and contextual evidence is required. This small task connects directly to the final project, where a plausible title or abstract is not automatically relevant evidence.</w:t>
+      </w:pPr>
+      <w:r>
+        <w:t>Units 9</w:t>
+      </w:r>
+      <w:r>
+        <w:t xml:space="preserve"> – 11 </w:t>
+      </w:r>
+      <w:r>
+        <w:t>focused on deep learning, ethics and deployment. My discussion traced risks including confabulation, bias, privacy, intellectual property and over-reliance. Peer responses broadened my initial output-focused view into a lifecycle perspective involving representative evaluation, provenance, human review and continuing monitoring (National Institute of Standards and Technology (NIST), 2024). The additional activity applied this directly to fabricated academic citations, defining publication-identity and claim-support checks rather than relying on fluent output.</w:t>
       </w:r>
     </w:p>
     <w:p>
       <w:pPr>
-        <w:jc w:val="both"/>
-        <w:rPr>
-          <w:rFonts w:cs="Arial"/>
-          <w:color w:val="000000" w:themeColor="text1"/>
-          <w:szCs w:val="24"/>
-        </w:rPr>
-      </w:pPr>
-      <w:r>
-        <w:t>Units 9–11 focused on deep learning, ethics and deployment. My discussion traced risks including confabulation, bias, privacy, intellectual property and over-reliance. Peer responses broadened my initial output-focused view into a lifecycle perspective involving representative evaluation, provenance, human review and continuing monitoring (National Institute of Standards and Technology (NIST), 2024). The additional activity applied this directly to fabricated academic citations, defining publication-identity and claim-support checks rather than relying on fluent output.</w:t>
-      </w:r>
-    </w:p>
-    <w:p>
-      <w:pPr>
         <w:pStyle w:val="Heading2"/>
-        <w:spacing w:before="0"/>
+        <w:spacing w:before="100" w:beforeAutospacing="1" w:after="100" w:afterAutospacing="1"/>
         <w:rPr>
           <w:rFonts w:ascii="Arial" w:hAnsi="Arial" w:cs="Arial"/>
           <w:color w:val="000000" w:themeColor="text1"/>
@@ -504,17 +535,17 @@
         </w:rPr>
       </w:pPr>
       <w:r>
-        <w:t xml:space="preserve">My Group C contribution focused on development methodology and the selection of frameworks, APIs and models. I initially proposed Agile prototyping, SQLite and named development tools. Team discussion challenged whether those choices belonged in the architecture and whether they were proportionate to a lightweight academic prototype. I revised my contribution to an architecture-first design, supported replacing SQLite with JSON, removed tooling from the architectural requirements and helped make the LLM layer provider-agnostic. This shows individual contribution through revision rather than ownership of a fixed idea. The supporting team-discussion reflection, peer-evaluation record and methodology/tools contribution in the e-portfolio provide an auditable record of participation. The experience also exposed a weakness in my original approach: I had treated familiar technologies as if they were requirements. The collaborative review forced me to separate the problem, architectural responsibilities and implementation </w:t>
+        <w:t xml:space="preserve">My Group C contribution focused on development methodology and the selection of frameworks, APIs and models. I initially proposed Agile prototyping, SQLite and named development tools. Team discussion challenged whether those choices belonged in the architecture and whether they were proportionate to a lightweight academic prototype. I revised my contribution to an architecture-first design, supported replacing SQLite with JSON, removed tooling from the architectural requirements and helped make the LLM layer provider-agnostic. This shows individual contribution through revision rather than ownership of a fixed idea. The supporting team-discussion reflection, peer-evaluation record and methodology/tools contribution in the e-portfolio provide an auditable record </w:t>
       </w:r>
       <w:r>
         <w:lastRenderedPageBreak/>
-        <w:t>choices, which made later individual implementation more disciplined and easier to test (see Appendix B).</w:t>
+        <w:t>of participation. The experience also exposed a weakness in my original approach: I had treated familiar technologies as if they were requirements. The collaborative review forced me to separate the problem, architectural responsibilities and implementation choices, which made later individual implementation more disciplined and easier to test (see Appendix B).</w:t>
       </w:r>
     </w:p>
     <w:p>
       <w:pPr>
         <w:pStyle w:val="Heading2"/>
-        <w:spacing w:before="0"/>
+        <w:spacing w:before="100" w:beforeAutospacing="1" w:after="100" w:afterAutospacing="1"/>
         <w:rPr>
           <w:rFonts w:ascii="Arial" w:hAnsi="Arial" w:cs="Arial"/>
           <w:color w:val="000000" w:themeColor="text1"/>
@@ -540,7 +571,13 @@
         </w:rPr>
       </w:pPr>
       <w:r>
-        <w:t>The Week 7 design proposed four specialist responsibilities—planning, retrieval, processing and storage</w:t>
+        <w:t>The Week 7 design proposed four specialist responsibilities</w:t>
+      </w:r>
+      <w:r>
+        <w:t xml:space="preserve">; </w:t>
+      </w:r>
+      <w:r>
+        <w:t>planning, retrieval, processing and storage</w:t>
       </w:r>
       <w:r>
         <w:t xml:space="preserve"> </w:t>
@@ -580,7 +617,32 @@
           <w:color w:val="000000" w:themeColor="text1"/>
           <w:szCs w:val="24"/>
         </w:rPr>
-        <w:t>This was not a simple implementation of every Week 7 technology. Removing LangGraph, Pydantic, HTTPX and Tenacity reduced installation complexity and made the assessed behaviour easier to reproduce, but it also meant losing richer orchestration, asynchronous networking and built-in retry mechanisms that would matter in a production system. Similarly, implementing only OpenAlex reduced source breadth compared with the proposed arXiv/OpenAlex/CORE design. I therefore regard the Week 11 solution as architecturally faithful but technologically narrower. This comparison changed my view of architectural fidelity: preserving responsibilities, interfaces and evaluable behaviour mattered more than reproducing every proposed tool.</w:t>
+        <w:t xml:space="preserve">This was not a simple implementation of every Week </w:t>
+      </w:r>
+      <w:r>
+        <w:rPr>
+          <w:rFonts w:cs="Arial"/>
+          <w:color w:val="000000" w:themeColor="text1"/>
+          <w:szCs w:val="24"/>
+        </w:rPr>
+        <w:t>7</w:t>
+      </w:r>
+      <w:r>
+        <w:rPr>
+          <w:rFonts w:cs="Arial"/>
+          <w:color w:val="000000" w:themeColor="text1"/>
+          <w:szCs w:val="24"/>
+        </w:rPr>
+        <w:t xml:space="preserve"> technology. Removing LangGraph, Pydantic, HTTPX and Tenacity reduced installation complexity and made the assessed behaviour easier to reproduce, but it also meant losing richer orchestration, asynchronous networking and built-in retry mechanisms that would matter in a production system. Similarly, implementing only OpenAlex reduced source breadth compared with the proposed arXiv/OpenAlex/CORE design. I therefore regard the Week 11 solution as architecturally faithful but technologically narrower. This comparison </w:t>
+      </w:r>
+      <w:r>
+        <w:rPr>
+          <w:rFonts w:cs="Arial"/>
+          <w:color w:val="000000" w:themeColor="text1"/>
+          <w:szCs w:val="24"/>
+        </w:rPr>
+        <w:lastRenderedPageBreak/>
+        <w:t>changed my view of architectural fidelity: preserving responsibilities, interfaces and evaluable behaviour mattered more than reproducing every proposed tool.</w:t>
       </w:r>
     </w:p>
     <w:p>
@@ -593,17 +655,13 @@
         </w:rPr>
       </w:pPr>
       <w:r>
-        <w:t xml:space="preserve">The Unit 11 implementation therefore demonstrates bounded workflow autonomy rather than unrestricted independent agents. A planning component converts a goal into two to </w:t>
-      </w:r>
-      <w:r>
-        <w:lastRenderedPageBreak/>
-        <w:t>five validated search tasks; retrieval queries OpenAlex or an offline fixture; processing normalises, deduplicates and ranks evidence; and storage writes Markdown, JSON and an execution trace. If evidence is insufficient, later cycles refine the existing searches and repeat retrieval within a maximum of three cycles. The reproducible demonstration retained three evidence records and generated the expected outputs. These results demonstrate software behaviour and resilience, not the scholarly quality of a real literature review (see Appendix C).</w:t>
+        <w:t>The Unit 11 implementation therefore demonstrates bounded workflow autonomy rather than unrestricted independent agents. A planning component converts a goal into two to five validated search tasks; retrieval queries OpenAlex or an offline fixture; processing normalises, deduplicates and ranks evidence; and storage writes Markdown, JSON and an execution trace. If evidence is insufficient, later cycles refine the existing searches and repeat retrieval within a maximum of three cycles. The reproducible demonstration retained three evidence records and generated the expected outputs. These results demonstrate software behaviour and resilience, not the scholarly quality of a real literature review (see Appendix C).</w:t>
       </w:r>
     </w:p>
     <w:p>
       <w:pPr>
         <w:pStyle w:val="Heading2"/>
-        <w:spacing w:before="0"/>
+        <w:spacing w:before="100" w:beforeAutospacing="1" w:after="100" w:afterAutospacing="1"/>
         <w:rPr>
           <w:rFonts w:ascii="Arial" w:hAnsi="Arial" w:cs="Arial"/>
           <w:color w:val="000000" w:themeColor="text1"/>
@@ -729,23 +787,8 @@
     </w:p>
     <w:p>
       <w:pPr>
-        <w:pStyle w:val="ListNumber"/>
-        <w:numPr>
-          <w:ilvl w:val="0"/>
-          <w:numId w:val="0"/>
-        </w:numPr>
-        <w:ind w:left="360"/>
-        <w:rPr>
-          <w:rFonts w:cs="Arial"/>
-          <w:color w:val="000000" w:themeColor="text1"/>
-          <w:szCs w:val="24"/>
-        </w:rPr>
-      </w:pPr>
-    </w:p>
-    <w:p>
-      <w:pPr>
         <w:pStyle w:val="Heading2"/>
-        <w:spacing w:before="0"/>
+        <w:spacing w:before="100" w:beforeAutospacing="1" w:after="100" w:afterAutospacing="1"/>
         <w:rPr>
           <w:rFonts w:ascii="Arial" w:hAnsi="Arial" w:cs="Arial"/>
           <w:color w:val="000000" w:themeColor="text1"/>
@@ -765,7 +808,7 @@
     <w:p>
       <w:pPr>
         <w:pStyle w:val="Heading3"/>
-        <w:spacing w:before="0"/>
+        <w:spacing w:before="100" w:beforeAutospacing="1" w:after="100" w:afterAutospacing="1"/>
         <w:rPr>
           <w:rFonts w:ascii="Arial" w:hAnsi="Arial" w:cs="Arial"/>
           <w:color w:val="000000" w:themeColor="text1"/>
@@ -818,7 +861,14 @@
         </w:rPr>
       </w:pPr>
       <w:r>
-        <w:t>So what? A deterministic score is not neutral merely because it is explainable. Ranking affects which evidence a researcher sees first and can reproduce structural inequalities in scholarly visibility. OpenAlex coverage and missing abstracts can introduce source-selection bias. This challenged my earlier tendency to equate reproducibility with fairness.</w:t>
+        <w:rPr>
+          <w:b/>
+          <w:bCs/>
+        </w:rPr>
+        <w:t>So what?</w:t>
+      </w:r>
+      <w:r>
+        <w:t xml:space="preserve"> A deterministic score is not neutral merely because it is explainable. Ranking affects which evidence a researcher sees first and can reproduce structural inequalities in scholarly visibility. OpenAlex coverage and missing abstracts can introduce source-selection bias. This challenged my earlier tendency to equate reproducibility with fairness.</w:t>
       </w:r>
     </w:p>
     <w:p>
@@ -851,7 +901,7 @@
     <w:p>
       <w:pPr>
         <w:pStyle w:val="Heading3"/>
-        <w:spacing w:before="0"/>
+        <w:spacing w:before="100" w:beforeAutospacing="1" w:after="100" w:afterAutospacing="1"/>
         <w:rPr>
           <w:rFonts w:ascii="Arial" w:hAnsi="Arial" w:cs="Arial"/>
           <w:color w:val="000000" w:themeColor="text1"/>
@@ -911,7 +961,7 @@
           <w:color w:val="000000" w:themeColor="text1"/>
           <w:szCs w:val="24"/>
         </w:rPr>
-        <w:t xml:space="preserve">Unit 1 discussions had framed overrides abstractly; implementation made the issue operational. A loop without a stop condition can waste resources, amplify weak queries or repeatedly contact an external service. Safe failure is therefore part of correct </w:t>
+        <w:t xml:space="preserve">Unit 1 discussions had framed overrides abstractly; implementation made the issue operational. A loop without a stop condition can waste resources, amplify weak </w:t>
       </w:r>
       <w:r>
         <w:rPr>
@@ -920,7 +970,7 @@
           <w:szCs w:val="24"/>
         </w:rPr>
         <w:lastRenderedPageBreak/>
-        <w:t>behaviour, not an optional restriction. The test that forces insufficient evidence and confirms the cycle limit provides direct evidence.</w:t>
+        <w:t>queries or repeatedly contact an external service. Safe failure is therefore part of correct behaviour, not an optional restriction. The test that forces insufficient evidence and confirms the cycle limit provides direct evidence.</w:t>
       </w:r>
     </w:p>
     <w:p>
@@ -953,7 +1003,7 @@
     <w:p>
       <w:pPr>
         <w:pStyle w:val="Heading3"/>
-        <w:spacing w:before="0"/>
+        <w:spacing w:before="100" w:beforeAutospacing="1" w:after="100" w:afterAutospacing="1"/>
         <w:rPr>
           <w:rFonts w:ascii="Arial" w:hAnsi="Arial" w:cs="Arial"/>
           <w:color w:val="000000" w:themeColor="text1"/>
@@ -1026,20 +1076,32 @@
     <w:p>
       <w:pPr>
         <w:jc w:val="both"/>
+      </w:pPr>
+      <w:r>
+        <w:rPr>
+          <w:b/>
+          <w:bCs/>
+        </w:rPr>
+        <w:t xml:space="preserve">Now what? </w:t>
+      </w:r>
+      <w:r>
+        <w:t>I would add DOI-resolution checks and sentence-level links between claims and source passages. A manually assessed claim-support benchmark and a measure of appropriate abstention would test whether explanation corresponds to evidence. Human verification would remain mandatory before academic use.</w:t>
+      </w:r>
+    </w:p>
+    <w:p>
+      <w:pPr>
+        <w:jc w:val="both"/>
         <w:rPr>
           <w:rFonts w:cs="Arial"/>
           <w:color w:val="000000" w:themeColor="text1"/>
           <w:szCs w:val="24"/>
         </w:rPr>
       </w:pPr>
-      <w:r>
-        <w:t>Now what? I would add DOI-resolution checks and sentence-level links between claims and source passages. A manually assessed claim-support benchmark and a measure of appropriate abstention would test whether explanation corresponds to evidence. Human verification would remain mandatory before academic use.</w:t>
-      </w:r>
     </w:p>
     <w:p>
       <w:pPr>
         <w:pStyle w:val="Heading2"/>
-        <w:spacing w:before="0"/>
+        <w:spacing w:before="100" w:beforeAutospacing="1" w:after="100" w:afterAutospacing="1"/>
         <w:rPr>
           <w:rFonts w:ascii="Arial" w:hAnsi="Arial" w:cs="Arial"/>
           <w:color w:val="000000" w:themeColor="text1"/>
@@ -1052,6 +1114,7 @@
           <w:color w:val="000000" w:themeColor="text1"/>
           <w:szCs w:val="24"/>
         </w:rPr>
+        <w:lastRenderedPageBreak/>
         <w:t>Professional skills matrix and action plan</w:t>
       </w:r>
     </w:p>
@@ -1062,10 +1125,10 @@
         <w:tblLook w:val="04A0" w:firstRow="1" w:lastRow="0" w:firstColumn="1" w:lastColumn="0" w:noHBand="0" w:noVBand="1"/>
       </w:tblPr>
       <w:tblGrid>
-        <w:gridCol w:w="2419"/>
-        <w:gridCol w:w="2385"/>
-        <w:gridCol w:w="2409"/>
-        <w:gridCol w:w="2407"/>
+        <w:gridCol w:w="2030"/>
+        <w:gridCol w:w="3431"/>
+        <w:gridCol w:w="1884"/>
+        <w:gridCol w:w="2275"/>
       </w:tblGrid>
       <w:tr>
         <w:trPr>
@@ -1074,7 +1137,7 @@
         <w:tc>
           <w:tcPr>
             <w:cnfStyle w:val="001000000000" w:firstRow="0" w:lastRow="0" w:firstColumn="1" w:lastColumn="0" w:oddVBand="0" w:evenVBand="0" w:oddHBand="0" w:evenHBand="0" w:firstRowFirstColumn="0" w:firstRowLastColumn="0" w:lastRowFirstColumn="0" w:lastRowLastColumn="0"/>
-            <w:tcW w:w="2448" w:type="dxa"/>
+            <w:tcW w:w="2030" w:type="dxa"/>
           </w:tcPr>
           <w:p>
             <w:pPr>
@@ -1096,7 +1159,7 @@
         </w:tc>
         <w:tc>
           <w:tcPr>
-            <w:tcW w:w="2448" w:type="dxa"/>
+            <w:tcW w:w="3465" w:type="dxa"/>
           </w:tcPr>
           <w:p>
             <w:pPr>
@@ -1113,13 +1176,29 @@
                 <w:color w:val="000000" w:themeColor="text1"/>
                 <w:szCs w:val="24"/>
               </w:rPr>
-              <w:t>Evidence developed</w:t>
+              <w:t>Evidence</w:t>
+            </w:r>
+            <w:r>
+              <w:rPr>
+                <w:rFonts w:cs="Arial"/>
+                <w:color w:val="000000" w:themeColor="text1"/>
+                <w:szCs w:val="24"/>
+              </w:rPr>
+              <w:t xml:space="preserve"> </w:t>
+            </w:r>
+            <w:r>
+              <w:rPr>
+                <w:rFonts w:cs="Arial"/>
+                <w:color w:val="000000" w:themeColor="text1"/>
+                <w:szCs w:val="24"/>
+              </w:rPr>
+              <w:t>developed</w:t>
             </w:r>
           </w:p>
         </w:tc>
         <w:tc>
           <w:tcPr>
-            <w:tcW w:w="2448" w:type="dxa"/>
+            <w:tcW w:w="1843" w:type="dxa"/>
           </w:tcPr>
           <w:p>
             <w:pPr>
@@ -1142,7 +1221,7 @@
         </w:tc>
         <w:tc>
           <w:tcPr>
-            <w:tcW w:w="2448" w:type="dxa"/>
+            <w:tcW w:w="2282" w:type="dxa"/>
           </w:tcPr>
           <w:p>
             <w:pPr>
@@ -1171,7 +1250,7 @@
         <w:tc>
           <w:tcPr>
             <w:cnfStyle w:val="001000000000" w:firstRow="0" w:lastRow="0" w:firstColumn="1" w:lastColumn="0" w:oddVBand="0" w:evenVBand="0" w:oddHBand="0" w:evenHBand="0" w:firstRowFirstColumn="0" w:firstRowLastColumn="0" w:lastRowFirstColumn="0" w:lastRowLastColumn="0"/>
-            <w:tcW w:w="2448" w:type="dxa"/>
+            <w:tcW w:w="2030" w:type="dxa"/>
           </w:tcPr>
           <w:p>
             <w:pPr>
@@ -1193,7 +1272,7 @@
         </w:tc>
         <w:tc>
           <w:tcPr>
-            <w:tcW w:w="2448" w:type="dxa"/>
+            <w:tcW w:w="3465" w:type="dxa"/>
           </w:tcPr>
           <w:p>
             <w:pPr>
@@ -1210,7 +1289,7 @@
                 <w:color w:val="000000" w:themeColor="text1"/>
                 <w:szCs w:val="24"/>
               </w:rPr>
-              <w:t xml:space="preserve">Three discussion summaries and </w:t>
+              <w:t>Three discussion summaries and design critique</w:t>
             </w:r>
             <w:r>
               <w:rPr>
@@ -1218,14 +1297,13 @@
                 <w:color w:val="000000" w:themeColor="text1"/>
                 <w:szCs w:val="24"/>
               </w:rPr>
-              <w:lastRenderedPageBreak/>
-              <w:t>design critique</w:t>
+              <w:t>.</w:t>
             </w:r>
           </w:p>
         </w:tc>
         <w:tc>
           <w:tcPr>
-            <w:tcW w:w="2448" w:type="dxa"/>
+            <w:tcW w:w="1843" w:type="dxa"/>
           </w:tcPr>
           <w:p>
             <w:pPr>
@@ -1242,8 +1320,7 @@
                 <w:color w:val="000000" w:themeColor="text1"/>
                 <w:szCs w:val="24"/>
               </w:rPr>
-              <w:lastRenderedPageBreak/>
-              <w:t>Stronger at comparing trade-</w:t>
+              <w:t>Stronger at comparing trade-offs than at the module start</w:t>
             </w:r>
             <w:r>
               <w:rPr>
@@ -1251,14 +1328,13 @@
                 <w:color w:val="000000" w:themeColor="text1"/>
                 <w:szCs w:val="24"/>
               </w:rPr>
-              <w:lastRenderedPageBreak/>
-              <w:t>offs than at the module start</w:t>
+              <w:t>.</w:t>
             </w:r>
           </w:p>
         </w:tc>
         <w:tc>
           <w:tcPr>
-            <w:tcW w:w="2448" w:type="dxa"/>
+            <w:tcW w:w="2282" w:type="dxa"/>
           </w:tcPr>
           <w:p>
             <w:pPr>
@@ -1275,8 +1351,7 @@
                 <w:color w:val="000000" w:themeColor="text1"/>
                 <w:szCs w:val="24"/>
               </w:rPr>
-              <w:lastRenderedPageBreak/>
-              <w:t xml:space="preserve">Quantify comparisons with </w:t>
+              <w:t>Quantify comparisons with explicit evaluation criteria</w:t>
             </w:r>
             <w:r>
               <w:rPr>
@@ -1284,8 +1359,7 @@
                 <w:color w:val="000000" w:themeColor="text1"/>
                 <w:szCs w:val="24"/>
               </w:rPr>
-              <w:lastRenderedPageBreak/>
-              <w:t>explicit evaluation criteria</w:t>
+              <w:t>.</w:t>
             </w:r>
           </w:p>
         </w:tc>
@@ -1294,7 +1368,7 @@
         <w:tc>
           <w:tcPr>
             <w:cnfStyle w:val="001000000000" w:firstRow="0" w:lastRow="0" w:firstColumn="1" w:lastColumn="0" w:oddVBand="0" w:evenVBand="0" w:oddHBand="0" w:evenHBand="0" w:firstRowFirstColumn="0" w:firstRowLastColumn="0" w:lastRowFirstColumn="0" w:lastRowLastColumn="0"/>
-            <w:tcW w:w="2448" w:type="dxa"/>
+            <w:tcW w:w="2030" w:type="dxa"/>
           </w:tcPr>
           <w:p>
             <w:pPr>
@@ -1310,14 +1384,13 @@
                 <w:color w:val="000000" w:themeColor="text1"/>
                 <w:szCs w:val="24"/>
               </w:rPr>
-              <w:lastRenderedPageBreak/>
               <w:t>Software engineering</w:t>
             </w:r>
           </w:p>
         </w:tc>
         <w:tc>
           <w:tcPr>
-            <w:tcW w:w="2448" w:type="dxa"/>
+            <w:tcW w:w="3465" w:type="dxa"/>
           </w:tcPr>
           <w:p>
             <w:pPr>
@@ -1336,11 +1409,19 @@
               </w:rPr>
               <w:t>Modular Python, typed models, CLI and eight tests</w:t>
             </w:r>
+            <w:r>
+              <w:rPr>
+                <w:rFonts w:cs="Arial"/>
+                <w:color w:val="000000" w:themeColor="text1"/>
+                <w:szCs w:val="24"/>
+              </w:rPr>
+              <w:t>.</w:t>
+            </w:r>
           </w:p>
         </w:tc>
         <w:tc>
           <w:tcPr>
-            <w:tcW w:w="2448" w:type="dxa"/>
+            <w:tcW w:w="1843" w:type="dxa"/>
           </w:tcPr>
           <w:p>
             <w:pPr>
@@ -1359,11 +1440,19 @@
               </w:rPr>
               <w:t>Reproducible core with clear boundaries</w:t>
             </w:r>
+            <w:r>
+              <w:rPr>
+                <w:rFonts w:cs="Arial"/>
+                <w:color w:val="000000" w:themeColor="text1"/>
+                <w:szCs w:val="24"/>
+              </w:rPr>
+              <w:t>.</w:t>
+            </w:r>
           </w:p>
         </w:tc>
         <w:tc>
           <w:tcPr>
-            <w:tcW w:w="2448" w:type="dxa"/>
+            <w:tcW w:w="2282" w:type="dxa"/>
           </w:tcPr>
           <w:p>
             <w:pPr>
@@ -1382,6 +1471,14 @@
               </w:rPr>
               <w:t>Add integration tests for live API failure modes</w:t>
             </w:r>
+            <w:r>
+              <w:rPr>
+                <w:rFonts w:cs="Arial"/>
+                <w:color w:val="000000" w:themeColor="text1"/>
+                <w:szCs w:val="24"/>
+              </w:rPr>
+              <w:t>.</w:t>
+            </w:r>
           </w:p>
         </w:tc>
       </w:tr>
@@ -1392,7 +1489,7 @@
         <w:tc>
           <w:tcPr>
             <w:cnfStyle w:val="001000000000" w:firstRow="0" w:lastRow="0" w:firstColumn="1" w:lastColumn="0" w:oddVBand="0" w:evenVBand="0" w:oddHBand="0" w:evenHBand="0" w:firstRowFirstColumn="0" w:firstRowLastColumn="0" w:lastRowFirstColumn="0" w:lastRowLastColumn="0"/>
-            <w:tcW w:w="2448" w:type="dxa"/>
+            <w:tcW w:w="2030" w:type="dxa"/>
           </w:tcPr>
           <w:p>
             <w:pPr>
@@ -1414,7 +1511,7 @@
         </w:tc>
         <w:tc>
           <w:tcPr>
-            <w:tcW w:w="2448" w:type="dxa"/>
+            <w:tcW w:w="3465" w:type="dxa"/>
           </w:tcPr>
           <w:p>
             <w:pPr>
@@ -1433,11 +1530,19 @@
               </w:rPr>
               <w:t>Reading summaries, scholarly APIs and referenced discussions</w:t>
             </w:r>
+            <w:r>
+              <w:rPr>
+                <w:rFonts w:cs="Arial"/>
+                <w:color w:val="000000" w:themeColor="text1"/>
+                <w:szCs w:val="24"/>
+              </w:rPr>
+              <w:t>.</w:t>
+            </w:r>
           </w:p>
         </w:tc>
         <w:tc>
           <w:tcPr>
-            <w:tcW w:w="2448" w:type="dxa"/>
+            <w:tcW w:w="1843" w:type="dxa"/>
           </w:tcPr>
           <w:p>
             <w:pPr>
@@ -1456,11 +1561,19 @@
               </w:rPr>
               <w:t>Improved provenance awareness</w:t>
             </w:r>
+            <w:r>
+              <w:rPr>
+                <w:rFonts w:cs="Arial"/>
+                <w:color w:val="000000" w:themeColor="text1"/>
+                <w:szCs w:val="24"/>
+              </w:rPr>
+              <w:t>.</w:t>
+            </w:r>
           </w:p>
         </w:tc>
         <w:tc>
           <w:tcPr>
-            <w:tcW w:w="2448" w:type="dxa"/>
+            <w:tcW w:w="2282" w:type="dxa"/>
           </w:tcPr>
           <w:p>
             <w:pPr>
@@ -1479,6 +1592,14 @@
               </w:rPr>
               <w:t>Build a manually labelled relevance dataset</w:t>
             </w:r>
+            <w:r>
+              <w:rPr>
+                <w:rFonts w:cs="Arial"/>
+                <w:color w:val="000000" w:themeColor="text1"/>
+                <w:szCs w:val="24"/>
+              </w:rPr>
+              <w:t>.</w:t>
+            </w:r>
           </w:p>
         </w:tc>
       </w:tr>
@@ -1486,7 +1607,7 @@
         <w:tc>
           <w:tcPr>
             <w:cnfStyle w:val="001000000000" w:firstRow="0" w:lastRow="0" w:firstColumn="1" w:lastColumn="0" w:oddVBand="0" w:evenVBand="0" w:oddHBand="0" w:evenHBand="0" w:firstRowFirstColumn="0" w:firstRowLastColumn="0" w:lastRowFirstColumn="0" w:lastRowLastColumn="0"/>
-            <w:tcW w:w="2448" w:type="dxa"/>
+            <w:tcW w:w="2030" w:type="dxa"/>
           </w:tcPr>
           <w:p>
             <w:pPr>
@@ -1508,7 +1629,7 @@
         </w:tc>
         <w:tc>
           <w:tcPr>
-            <w:tcW w:w="2448" w:type="dxa"/>
+            <w:tcW w:w="3465" w:type="dxa"/>
           </w:tcPr>
           <w:p>
             <w:pPr>
@@ -1527,11 +1648,19 @@
               </w:rPr>
               <w:t>Peer responses and revision of Group C contribution</w:t>
             </w:r>
+            <w:r>
+              <w:rPr>
+                <w:rFonts w:cs="Arial"/>
+                <w:color w:val="000000" w:themeColor="text1"/>
+                <w:szCs w:val="24"/>
+              </w:rPr>
+              <w:t>.</w:t>
+            </w:r>
           </w:p>
         </w:tc>
         <w:tc>
           <w:tcPr>
-            <w:tcW w:w="2448" w:type="dxa"/>
+            <w:tcW w:w="1843" w:type="dxa"/>
           </w:tcPr>
           <w:p>
             <w:pPr>
@@ -1550,11 +1679,19 @@
               </w:rPr>
               <w:t>Demonstrated responsiveness to criticism</w:t>
             </w:r>
+            <w:r>
+              <w:rPr>
+                <w:rFonts w:cs="Arial"/>
+                <w:color w:val="000000" w:themeColor="text1"/>
+                <w:szCs w:val="24"/>
+              </w:rPr>
+              <w:t>.</w:t>
+            </w:r>
           </w:p>
         </w:tc>
         <w:tc>
           <w:tcPr>
-            <w:tcW w:w="2448" w:type="dxa"/>
+            <w:tcW w:w="2282" w:type="dxa"/>
           </w:tcPr>
           <w:p>
             <w:pPr>
@@ -1573,6 +1710,14 @@
               </w:rPr>
               <w:t>Record decisions and ownership during future meetings</w:t>
             </w:r>
+            <w:r>
+              <w:rPr>
+                <w:rFonts w:cs="Arial"/>
+                <w:color w:val="000000" w:themeColor="text1"/>
+                <w:szCs w:val="24"/>
+              </w:rPr>
+              <w:t>.</w:t>
+            </w:r>
           </w:p>
         </w:tc>
       </w:tr>
@@ -1583,7 +1728,7 @@
         <w:tc>
           <w:tcPr>
             <w:cnfStyle w:val="001000000000" w:firstRow="0" w:lastRow="0" w:firstColumn="1" w:lastColumn="0" w:oddVBand="0" w:evenVBand="0" w:oddHBand="0" w:evenHBand="0" w:firstRowFirstColumn="0" w:firstRowLastColumn="0" w:lastRowFirstColumn="0" w:lastRowLastColumn="0"/>
-            <w:tcW w:w="2448" w:type="dxa"/>
+            <w:tcW w:w="2030" w:type="dxa"/>
           </w:tcPr>
           <w:p>
             <w:pPr>
@@ -1605,7 +1750,7 @@
         </w:tc>
         <w:tc>
           <w:tcPr>
-            <w:tcW w:w="2448" w:type="dxa"/>
+            <w:tcW w:w="3465" w:type="dxa"/>
           </w:tcPr>
           <w:p>
             <w:pPr>
@@ -1624,11 +1769,19 @@
               </w:rPr>
               <w:t>Risk discussion, three case studies and safety controls</w:t>
             </w:r>
+            <w:r>
+              <w:rPr>
+                <w:rFonts w:cs="Arial"/>
+                <w:color w:val="000000" w:themeColor="text1"/>
+                <w:szCs w:val="24"/>
+              </w:rPr>
+              <w:t>.</w:t>
+            </w:r>
           </w:p>
         </w:tc>
         <w:tc>
           <w:tcPr>
-            <w:tcW w:w="2448" w:type="dxa"/>
+            <w:tcW w:w="1843" w:type="dxa"/>
           </w:tcPr>
           <w:p>
             <w:pPr>
@@ -1647,11 +1800,19 @@
               </w:rPr>
               <w:t>Able to translate principles into controls</w:t>
             </w:r>
+            <w:r>
+              <w:rPr>
+                <w:rFonts w:cs="Arial"/>
+                <w:color w:val="000000" w:themeColor="text1"/>
+                <w:szCs w:val="24"/>
+              </w:rPr>
+              <w:t>.</w:t>
+            </w:r>
           </w:p>
         </w:tc>
         <w:tc>
           <w:tcPr>
-            <w:tcW w:w="2448" w:type="dxa"/>
+            <w:tcW w:w="2282" w:type="dxa"/>
           </w:tcPr>
           <w:p>
             <w:pPr>
@@ -1670,6 +1831,14 @@
               </w:rPr>
               <w:t>Add bias, privacy and prompt-injection checks before deployment</w:t>
             </w:r>
+            <w:r>
+              <w:rPr>
+                <w:rFonts w:cs="Arial"/>
+                <w:color w:val="000000" w:themeColor="text1"/>
+                <w:szCs w:val="24"/>
+              </w:rPr>
+              <w:t>.</w:t>
+            </w:r>
           </w:p>
         </w:tc>
       </w:tr>
@@ -1677,7 +1846,7 @@
         <w:tc>
           <w:tcPr>
             <w:cnfStyle w:val="001000000000" w:firstRow="0" w:lastRow="0" w:firstColumn="1" w:lastColumn="0" w:oddVBand="0" w:evenVBand="0" w:oddHBand="0" w:evenHBand="0" w:firstRowFirstColumn="0" w:firstRowLastColumn="0" w:lastRowFirstColumn="0" w:lastRowLastColumn="0"/>
-            <w:tcW w:w="2448" w:type="dxa"/>
+            <w:tcW w:w="2030" w:type="dxa"/>
           </w:tcPr>
           <w:p>
             <w:pPr>
@@ -1693,13 +1862,14 @@
                 <w:color w:val="000000" w:themeColor="text1"/>
                 <w:szCs w:val="24"/>
               </w:rPr>
+              <w:lastRenderedPageBreak/>
               <w:t>Communication</w:t>
             </w:r>
           </w:p>
         </w:tc>
         <w:tc>
           <w:tcPr>
-            <w:tcW w:w="2448" w:type="dxa"/>
+            <w:tcW w:w="3465" w:type="dxa"/>
           </w:tcPr>
           <w:p>
             <w:pPr>
@@ -1718,11 +1888,19 @@
               </w:rPr>
               <w:t>KQML exercise, reports, README and presentation</w:t>
             </w:r>
+            <w:r>
+              <w:rPr>
+                <w:rFonts w:cs="Arial"/>
+                <w:color w:val="000000" w:themeColor="text1"/>
+                <w:szCs w:val="24"/>
+              </w:rPr>
+              <w:t>.</w:t>
+            </w:r>
           </w:p>
         </w:tc>
         <w:tc>
           <w:tcPr>
-            <w:tcW w:w="2448" w:type="dxa"/>
+            <w:tcW w:w="1843" w:type="dxa"/>
           </w:tcPr>
           <w:p>
             <w:pPr>
@@ -1741,11 +1919,19 @@
               </w:rPr>
               <w:t>Technical ideas expressed for different audiences</w:t>
             </w:r>
+            <w:r>
+              <w:rPr>
+                <w:rFonts w:cs="Arial"/>
+                <w:color w:val="000000" w:themeColor="text1"/>
+                <w:szCs w:val="24"/>
+              </w:rPr>
+              <w:t>.</w:t>
+            </w:r>
           </w:p>
         </w:tc>
         <w:tc>
           <w:tcPr>
-            <w:tcW w:w="2448" w:type="dxa"/>
+            <w:tcW w:w="2282" w:type="dxa"/>
           </w:tcPr>
           <w:p>
             <w:pPr>
@@ -1764,6 +1950,14 @@
               </w:rPr>
               <w:t>Practise shorter evidence-led demonstrations</w:t>
             </w:r>
+            <w:r>
+              <w:rPr>
+                <w:rFonts w:cs="Arial"/>
+                <w:color w:val="000000" w:themeColor="text1"/>
+                <w:szCs w:val="24"/>
+              </w:rPr>
+              <w:t>.</w:t>
+            </w:r>
           </w:p>
         </w:tc>
       </w:tr>
@@ -1788,7 +1982,7 @@
     <w:p>
       <w:pPr>
         <w:pStyle w:val="Heading1"/>
-        <w:spacing w:before="0"/>
+        <w:spacing w:before="100" w:beforeAutospacing="1" w:after="100" w:afterAutospacing="1"/>
         <w:rPr>
           <w:rFonts w:ascii="Arial" w:hAnsi="Arial" w:cs="Arial"/>
           <w:color w:val="000000" w:themeColor="text1"/>
@@ -1826,7 +2020,7 @@
     <w:p>
       <w:pPr>
         <w:pStyle w:val="Heading2"/>
-        <w:spacing w:before="0"/>
+        <w:spacing w:before="100" w:beforeAutospacing="1" w:after="100" w:afterAutospacing="1"/>
         <w:rPr>
           <w:rFonts w:ascii="Arial" w:hAnsi="Arial" w:cs="Arial"/>
           <w:color w:val="000000" w:themeColor="text1"/>
@@ -1888,7 +2082,7 @@
           <w:color w:val="000000" w:themeColor="text1"/>
           <w:szCs w:val="24"/>
         </w:rPr>
-        <w:t xml:space="preserve">My individual Group C contribution focused on development methodology and technology selection. I began with Agile prototyping and suggestions including SQLite and named development tools. Peer discussion challenged whether these decisions belonged in the architecture and whether they were proportionate to a lightweight prototype. I changed the proposal to an architecture-first method, accepted JSON storage and removed avoidable provider and tooling dependencies. That change </w:t>
+        <w:t xml:space="preserve">My individual Group C contribution focused on development methodology and technology selection. I began with Agile prototyping and suggestions including SQLite and named development tools. Peer discussion challenged whether these decisions belonged in the architecture and whether they were proportionate to a lightweight </w:t>
       </w:r>
       <w:r>
         <w:rPr>
@@ -1897,13 +2091,13 @@
           <w:szCs w:val="24"/>
         </w:rPr>
         <w:lastRenderedPageBreak/>
-        <w:t>became important during implementation because explicit component interfaces made the final system testable without requiring every external service.</w:t>
+        <w:t>prototype. I changed the proposal to an architecture-first method, accepted JSON storage and removed avoidable provider and tooling dependencies. That change became important during implementation because explicit component interfaces made the final system testable without requiring every external service.</w:t>
       </w:r>
     </w:p>
     <w:p>
       <w:pPr>
         <w:pStyle w:val="Heading2"/>
-        <w:spacing w:before="0"/>
+        <w:spacing w:before="100" w:beforeAutospacing="1" w:after="100" w:afterAutospacing="1"/>
         <w:rPr>
           <w:rFonts w:ascii="Arial" w:hAnsi="Arial" w:cs="Arial"/>
           <w:color w:val="000000" w:themeColor="text1"/>
@@ -1970,7 +2164,7 @@
           <w:color w:val="000000" w:themeColor="text1"/>
           <w:szCs w:val="24"/>
         </w:rPr>
-        <w:t xml:space="preserve">Communication work produced a related insight. KQML can communicate intention, but shared syntax does not ensure shared semantics. Likewise, a pipeline can successfully pass a record between components even when that record is irrelevant or misleading. The Unit 8 ambiguous parse reinforced this distinction between valid structure and justified meaning. In the research agent, typed records support structural consistency, </w:t>
+        <w:t xml:space="preserve">Communication work produced a related insight. KQML can communicate intention, but shared syntax does not ensure shared semantics. Likewise, a pipeline can successfully pass a record between components even when that record is irrelevant or misleading. </w:t>
       </w:r>
       <w:r>
         <w:rPr>
@@ -1979,7 +2173,7 @@
           <w:szCs w:val="24"/>
         </w:rPr>
         <w:lastRenderedPageBreak/>
-        <w:t>while provenance and human review address meaning and evidence quality. Neither substitutes for the other.</w:t>
+        <w:t>The Unit 8 ambiguous parse reinforced this distinction between valid structure and justified meaning. In the research agent, typed records support structural consistency, while provenance and human review address meaning and evidence quality. Neither substitutes for the other.</w:t>
       </w:r>
     </w:p>
     <w:p>
@@ -2023,7 +2217,11 @@
         </w:rPr>
       </w:pPr>
       <w:r>
-        <w:t>Final verification revealed another important lesson. An earlier stored test record did not match clean test discovery, so I reconciled the suite and evidence until the final run reported 11 tests and eight subtests passing. I also corrected the retrieval-evaluation outputs so synthetic fixture identifiers were no longer presented as resolvable scholarly DOI links. These checks showed that documentation can drift from executable reality. I now regard a fresh, repeatable validation run as part of the deliverable rather than a final administrative check.</w:t>
+        <w:t xml:space="preserve">Final verification revealed another important lesson. An earlier stored test record did not match clean test discovery, so I reconciled the suite and evidence until the final run reported 11 tests and eight subtests passing. I also corrected the retrieval-evaluation outputs so synthetic fixture identifiers were no longer presented as resolvable scholarly DOI links. These checks showed that documentation can drift from executable reality. I </w:t>
+      </w:r>
+      <w:r>
+        <w:lastRenderedPageBreak/>
+        <w:t>now regard a fresh, repeatable validation run as part of the deliverable rather than a final administrative check.</w:t>
       </w:r>
     </w:p>
     <w:p>
@@ -2041,14 +2239,13 @@
           <w:color w:val="000000" w:themeColor="text1"/>
           <w:szCs w:val="24"/>
         </w:rPr>
-        <w:lastRenderedPageBreak/>
         <w:t>Team participation also altered my working practice. My peer responses across the discussions introduced coordination risk, ontology alignment, representative testing, privacy and provenance into my conclusions. In Group C, simplifying storage and decoupling providers resulted from collaborative review. I learned that effective virtual teamwork requires visible reasoning and willingness to update decisions. In future, I would maintain a decision log recording options, evidence, owners and acceptance criteria so contribution and accountability are easier to evaluate.</w:t>
       </w:r>
     </w:p>
     <w:p>
       <w:pPr>
         <w:pStyle w:val="Heading2"/>
-        <w:spacing w:before="0"/>
+        <w:spacing w:before="100" w:beforeAutospacing="1" w:after="100" w:afterAutospacing="1"/>
         <w:rPr>
           <w:rFonts w:ascii="Arial" w:hAnsi="Arial" w:cs="Arial"/>
           <w:color w:val="000000" w:themeColor="text1"/>
@@ -2097,7 +2294,16 @@
           <w:color w:val="000000" w:themeColor="text1"/>
           <w:szCs w:val="24"/>
         </w:rPr>
-        <w:t>Professionally, I will begin future intelligent-agent projects with three questions: what behaviour is required, what evidence demonstrates it, and what boundary limits harm when assumptions fail? I will separate architectural requirements from preferred tools, make uncertainty visible and preserve human approval for consequential actions. The module has therefore changed my conception of a successful agent from one that completes a task to one whose actions, limitations and responsibilities can be examined and governed.</w:t>
+        <w:t xml:space="preserve">Professionally, I will begin future intelligent-agent projects with three questions: what behaviour is required, what evidence demonstrates it, and what boundary limits harm when assumptions fail? I will separate architectural requirements from preferred tools, make uncertainty visible and preserve human approval for consequential actions. The module has therefore changed my conception of a successful agent from one that </w:t>
+      </w:r>
+      <w:r>
+        <w:rPr>
+          <w:rFonts w:cs="Arial"/>
+          <w:color w:val="000000" w:themeColor="text1"/>
+          <w:szCs w:val="24"/>
+        </w:rPr>
+        <w:lastRenderedPageBreak/>
+        <w:t>completes a task to one whose actions, limitations and responsibilities can be examined and governed.</w:t>
       </w:r>
     </w:p>
     <w:p>
@@ -2120,7 +2326,7 @@
     <w:p>
       <w:pPr>
         <w:pStyle w:val="Heading1"/>
-        <w:spacing w:before="120" w:after="120"/>
+        <w:spacing w:before="100" w:beforeAutospacing="1" w:after="100" w:afterAutospacing="1"/>
         <w:jc w:val="both"/>
         <w:rPr>
           <w:rFonts w:ascii="Arial" w:eastAsia="Arial" w:hAnsi="Arial" w:cs="Arial"/>
@@ -2461,7 +2667,7 @@
       <w:pPr>
         <w:pStyle w:val="Heading1"/>
         <w:pageBreakBefore/>
-        <w:spacing w:before="0"/>
+        <w:spacing w:before="100" w:beforeAutospacing="1" w:after="100" w:afterAutospacing="1"/>
         <w:rPr>
           <w:rFonts w:ascii="Arial" w:hAnsi="Arial" w:cs="Arial"/>
           <w:color w:val="000000" w:themeColor="text1"/>
@@ -2578,22 +2784,49 @@
     <w:p>
       <w:pPr>
         <w:pStyle w:val="ListBullet"/>
+        <w:rPr>
+          <w:lang w:val="pt-PT"/>
+        </w:rPr>
       </w:pPr>
       <w:r>
-        <w:t>E-Portfolio home:</w:t>
+        <w:rPr>
+          <w:lang w:val="pt-PT"/>
+        </w:rPr>
+        <w:t xml:space="preserve">E-Portfolio </w:t>
+      </w:r>
+      <w:proofErr w:type="spellStart"/>
+      <w:r>
+        <w:rPr>
+          <w:lang w:val="pt-PT"/>
+        </w:rPr>
+        <w:t>home</w:t>
+      </w:r>
+      <w:proofErr w:type="spellEnd"/>
+      <w:r>
+        <w:rPr>
+          <w:lang w:val="pt-PT"/>
+        </w:rPr>
+        <w:t>:</w:t>
       </w:r>
       <w:r>
+        <w:rPr>
+          <w:lang w:val="pt-PT"/>
+        </w:rPr>
         <w:t xml:space="preserve"> </w:t>
       </w:r>
       <w:hyperlink r:id="rId20" w:history="1">
         <w:r>
           <w:rPr>
             <w:rStyle w:val="Hyperlink"/>
+            <w:lang w:val="pt-PT"/>
           </w:rPr>
           <w:t>https://ie25073.github.io/</w:t>
         </w:r>
       </w:hyperlink>
       <w:r>
+        <w:rPr>
+          <w:lang w:val="pt-PT"/>
+        </w:rPr>
         <w:t xml:space="preserve"> </w:t>
       </w:r>
     </w:p>
@@ -2601,6 +2834,7 @@
       <w:pPr>
         <w:pStyle w:val="Heading1"/>
         <w:pageBreakBefore/>
+        <w:spacing w:before="100" w:beforeAutospacing="1" w:after="100" w:afterAutospacing="1"/>
         <w:rPr>
           <w:color w:val="000000" w:themeColor="text1"/>
         </w:rPr>
@@ -2860,6 +3094,7 @@
       <w:pPr>
         <w:pStyle w:val="Heading1"/>
         <w:pageBreakBefore/>
+        <w:spacing w:before="100" w:beforeAutospacing="1" w:after="100" w:afterAutospacing="1"/>
         <w:rPr>
           <w:color w:val="000000" w:themeColor="text1"/>
         </w:rPr>
@@ -3014,7 +3249,7 @@
 </file>
 
 <file path=word/endnotes.xml><?xml version="1.0" encoding="utf-8"?>
-<w:endnotes xmlns:wpc="http://schemas.microsoft.com/office/word/2010/wordprocessingCanvas" xmlns:cx="http://schemas.microsoft.com/office/drawing/2014/chartex" xmlns:cx1="http://schemas.microsoft.com/office/drawing/2015/9/8/chartex" xmlns:cx2="http://schemas.microsoft.com/office/drawing/2015/10/21/chartex" xmlns:cx3="http://schemas.microsoft.com/office/drawing/2016/5/9/chartex" xmlns:cx4="http://schemas.microsoft.com/office/drawing/2016/5/10/chartex" xmlns:cx5="http://schemas.microsoft.com/office/drawing/2016/5/11/chartex" xmlns:cx6="http://schemas.microsoft.com/office/drawing/2016/5/12/chartex" xmlns:cx7="http://schemas.microsoft.com/office/drawing/2016/5/13/chartex" xmlns:cx8="http://schemas.microsoft.com/office/drawing/2016/5/14/chartex" xmlns:mc="http://schemas.openxmlformats.org/markup-compatibility/2006" xmlns:m="http://schemas.openxmlformats.org/officeDocument/2006/math" xmlns:aink="http://schemas.microsoft.com/office/drawing/2016/ink" xmlns:am3d="http://schemas.microsoft.com/office/drawing/2017/model3d" xmlns:oel="http://schemas.microsoft.com/office/2019/extlst" xmlns:r="http://schemas.openxmlformats.org/officeDocument/2006/relationships" xmlns:wp14="http://schemas.microsoft.com/office/word/2010/wordprocessingDrawing" xmlns:wp="http://schemas.openxmlformats.org/drawingml/2006/wordprocessingDrawing" xmlns:wpg="http://schemas.microsoft.com/office/word/2010/wordprocessingGroup" xmlns:wpi="http://schemas.microsoft.com/office/word/2010/wordprocessingInk" xmlns:wps="http://schemas.microsoft.com/office/word/2010/wordprocessingShape" xmlns:o="urn:schemas-microsoft-com:office:office" xmlns:v="urn:schemas-microsoft-com:vml" xmlns:w10="urn:schemas-microsoft-com:office:word" xmlns:w="http://schemas.openxmlformats.org/wordprocessingml/2006/main" xmlns:w14="http://schemas.microsoft.com/office/word/2010/wordml" xmlns:w15="http://schemas.microsoft.com/office/word/2012/wordml" xmlns:w16cex="http://schemas.microsoft.com/office/word/2018/wordml/cex" xmlns:w16cid="http://schemas.microsoft.com/office/word/2016/wordml/cid" xmlns:w16="http://schemas.microsoft.com/office/word/2018/wordml" xmlns:w16sdtdh="http://schemas.microsoft.com/office/word/2020/wordml/sdtdatahash" xmlns:w16sdtfl="http://schemas.microsoft.com/office/word/2024/wordml/sdtformatlock" xmlns:w16se="http://schemas.microsoft.com/office/word/2015/wordml/symex" xmlns:w16du="http://schemas.microsoft.com/office/word/2023/wordml/word16du" xmlns:wne="http://schemas.microsoft.com/office/word/2006/wordml" mc:Ignorable="w14 w15 w16se w16cid w16 w16cex w16sdtdh w16sdtfl w16du wp14">
+<w:endnotes xmlns:wpc="http://schemas.microsoft.com/office/word/2010/wordprocessingCanvas" xmlns:cx="http://schemas.microsoft.com/office/drawing/2014/chartex" xmlns:cx1="http://schemas.microsoft.com/office/drawing/2015/9/8/chartex" xmlns:cx2="http://schemas.microsoft.com/office/drawing/2015/10/21/chartex" xmlns:cx3="http://schemas.microsoft.com/office/drawing/2016/5/9/chartex" xmlns:cx4="http://schemas.microsoft.com/office/drawing/2016/5/10/chartex" xmlns:cx5="http://schemas.microsoft.com/office/drawing/2016/5/11/chartex" xmlns:cx6="http://schemas.microsoft.com/office/drawing/2016/5/12/chartex" xmlns:cx7="http://schemas.microsoft.com/office/drawing/2016/5/13/chartex" xmlns:cx8="http://schemas.microsoft.com/office/drawing/2016/5/14/chartex" xmlns:mc="http://schemas.openxmlformats.org/markup-compatibility/2006" xmlns:aink="http://schemas.microsoft.com/office/drawing/2016/ink" xmlns:am3d="http://schemas.microsoft.com/office/drawing/2017/model3d" xmlns:o="urn:schemas-microsoft-com:office:office" xmlns:oel="http://schemas.microsoft.com/office/2019/extlst" xmlns:r="http://schemas.openxmlformats.org/officeDocument/2006/relationships" xmlns:m="http://schemas.openxmlformats.org/officeDocument/2006/math" xmlns:v="urn:schemas-microsoft-com:vml" xmlns:wp14="http://schemas.microsoft.com/office/word/2010/wordprocessingDrawing" xmlns:wp="http://schemas.openxmlformats.org/drawingml/2006/wordprocessingDrawing" xmlns:w10="urn:schemas-microsoft-com:office:word" xmlns:w="http://schemas.openxmlformats.org/wordprocessingml/2006/main" xmlns:w14="http://schemas.microsoft.com/office/word/2010/wordml" xmlns:w15="http://schemas.microsoft.com/office/word/2012/wordml" xmlns:w16cex="http://schemas.microsoft.com/office/word/2018/wordml/cex" xmlns:w16cid="http://schemas.microsoft.com/office/word/2016/wordml/cid" xmlns:w16="http://schemas.microsoft.com/office/word/2018/wordml" xmlns:w16du="http://schemas.microsoft.com/office/word/2023/wordml/word16du" xmlns:w16sdtdh="http://schemas.microsoft.com/office/word/2020/wordml/sdtdatahash" xmlns:w16sdtfl="http://schemas.microsoft.com/office/word/2024/wordml/sdtformatlock" xmlns:w16se="http://schemas.microsoft.com/office/word/2015/wordml/symex" xmlns:wpg="http://schemas.microsoft.com/office/word/2010/wordprocessingGroup" xmlns:wpi="http://schemas.microsoft.com/office/word/2010/wordprocessingInk" xmlns:wne="http://schemas.microsoft.com/office/word/2006/wordml" xmlns:wps="http://schemas.microsoft.com/office/word/2010/wordprocessingShape" mc:Ignorable="w14 w15 w16se w16cid w16 w16cex w16sdtdh w16sdtfl w16du wp14">
   <w:endnote w:type="separator" w:id="-1">
     <w:p>
       <w:pPr>
@@ -3039,7 +3274,7 @@
 </file>
 
 <file path=word/footer1.xml><?xml version="1.0" encoding="utf-8"?>
-<w:ftr xmlns:wpc="http://schemas.microsoft.com/office/word/2010/wordprocessingCanvas" xmlns:cx="http://schemas.microsoft.com/office/drawing/2014/chartex" xmlns:cx1="http://schemas.microsoft.com/office/drawing/2015/9/8/chartex" xmlns:cx2="http://schemas.microsoft.com/office/drawing/2015/10/21/chartex" xmlns:cx3="http://schemas.microsoft.com/office/drawing/2016/5/9/chartex" xmlns:cx4="http://schemas.microsoft.com/office/drawing/2016/5/10/chartex" xmlns:cx5="http://schemas.microsoft.com/office/drawing/2016/5/11/chartex" xmlns:cx6="http://schemas.microsoft.com/office/drawing/2016/5/12/chartex" xmlns:cx7="http://schemas.microsoft.com/office/drawing/2016/5/13/chartex" xmlns:cx8="http://schemas.microsoft.com/office/drawing/2016/5/14/chartex" xmlns:mc="http://schemas.openxmlformats.org/markup-compatibility/2006" xmlns:m="http://schemas.openxmlformats.org/officeDocument/2006/math" xmlns:aink="http://schemas.microsoft.com/office/drawing/2016/ink" xmlns:am3d="http://schemas.microsoft.com/office/drawing/2017/model3d" xmlns:oel="http://schemas.microsoft.com/office/2019/extlst" xmlns:r="http://schemas.openxmlformats.org/officeDocument/2006/relationships" xmlns:wp14="http://schemas.microsoft.com/office/word/2010/wordprocessingDrawing" xmlns:wp="http://schemas.openxmlformats.org/drawingml/2006/wordprocessingDrawing" xmlns:wpg="http://schemas.microsoft.com/office/word/2010/wordprocessingGroup" xmlns:wpi="http://schemas.microsoft.com/office/word/2010/wordprocessingInk" xmlns:wps="http://schemas.microsoft.com/office/word/2010/wordprocessingShape" xmlns:o="urn:schemas-microsoft-com:office:office" xmlns:v="urn:schemas-microsoft-com:vml" xmlns:w10="urn:schemas-microsoft-com:office:word" xmlns:w="http://schemas.openxmlformats.org/wordprocessingml/2006/main" xmlns:w14="http://schemas.microsoft.com/office/word/2010/wordml" xmlns:w15="http://schemas.microsoft.com/office/word/2012/wordml" xmlns:w16cex="http://schemas.microsoft.com/office/word/2018/wordml/cex" xmlns:w16cid="http://schemas.microsoft.com/office/word/2016/wordml/cid" xmlns:w16="http://schemas.microsoft.com/office/word/2018/wordml" xmlns:w16sdtdh="http://schemas.microsoft.com/office/word/2020/wordml/sdtdatahash" xmlns:w16sdtfl="http://schemas.microsoft.com/office/word/2024/wordml/sdtformatlock" xmlns:w16se="http://schemas.microsoft.com/office/word/2015/wordml/symex" xmlns:w16du="http://schemas.microsoft.com/office/word/2023/wordml/word16du" xmlns:wne="http://schemas.microsoft.com/office/word/2006/wordml" mc:Ignorable="w14 w15 w16se w16cid w16 w16cex w16sdtdh w16sdtfl w16du wp14">
+<w:ftr xmlns:wpc="http://schemas.microsoft.com/office/word/2010/wordprocessingCanvas" xmlns:cx="http://schemas.microsoft.com/office/drawing/2014/chartex" xmlns:cx1="http://schemas.microsoft.com/office/drawing/2015/9/8/chartex" xmlns:cx2="http://schemas.microsoft.com/office/drawing/2015/10/21/chartex" xmlns:cx3="http://schemas.microsoft.com/office/drawing/2016/5/9/chartex" xmlns:cx4="http://schemas.microsoft.com/office/drawing/2016/5/10/chartex" xmlns:cx5="http://schemas.microsoft.com/office/drawing/2016/5/11/chartex" xmlns:cx6="http://schemas.microsoft.com/office/drawing/2016/5/12/chartex" xmlns:cx7="http://schemas.microsoft.com/office/drawing/2016/5/13/chartex" xmlns:cx8="http://schemas.microsoft.com/office/drawing/2016/5/14/chartex" xmlns:mc="http://schemas.openxmlformats.org/markup-compatibility/2006" xmlns:aink="http://schemas.microsoft.com/office/drawing/2016/ink" xmlns:am3d="http://schemas.microsoft.com/office/drawing/2017/model3d" xmlns:o="urn:schemas-microsoft-com:office:office" xmlns:oel="http://schemas.microsoft.com/office/2019/extlst" xmlns:r="http://schemas.openxmlformats.org/officeDocument/2006/relationships" xmlns:m="http://schemas.openxmlformats.org/officeDocument/2006/math" xmlns:v="urn:schemas-microsoft-com:vml" xmlns:wp14="http://schemas.microsoft.com/office/word/2010/wordprocessingDrawing" xmlns:wp="http://schemas.openxmlformats.org/drawingml/2006/wordprocessingDrawing" xmlns:w10="urn:schemas-microsoft-com:office:word" xmlns:w="http://schemas.openxmlformats.org/wordprocessingml/2006/main" xmlns:w14="http://schemas.microsoft.com/office/word/2010/wordml" xmlns:w15="http://schemas.microsoft.com/office/word/2012/wordml" xmlns:w16cex="http://schemas.microsoft.com/office/word/2018/wordml/cex" xmlns:w16cid="http://schemas.microsoft.com/office/word/2016/wordml/cid" xmlns:w16="http://schemas.microsoft.com/office/word/2018/wordml" xmlns:w16du="http://schemas.microsoft.com/office/word/2023/wordml/word16du" xmlns:w16sdtdh="http://schemas.microsoft.com/office/word/2020/wordml/sdtdatahash" xmlns:w16sdtfl="http://schemas.microsoft.com/office/word/2024/wordml/sdtformatlock" xmlns:w16se="http://schemas.microsoft.com/office/word/2015/wordml/symex" xmlns:wpg="http://schemas.microsoft.com/office/word/2010/wordprocessingGroup" xmlns:wpi="http://schemas.microsoft.com/office/word/2010/wordprocessingInk" xmlns:wne="http://schemas.microsoft.com/office/word/2006/wordml" xmlns:wps="http://schemas.microsoft.com/office/word/2010/wordprocessingShape" mc:Ignorable="w14 w15 w16se w16cid w16 w16cex w16sdtdh w16sdtfl w16du wp14">
   <w:p>
     <w:pPr>
       <w:pStyle w:val="Footer"/>
@@ -3093,7 +3328,7 @@
 </file>
 
 <file path=word/footnotes.xml><?xml version="1.0" encoding="utf-8"?>
-<w:footnotes xmlns:wpc="http://schemas.microsoft.com/office/word/2010/wordprocessingCanvas" xmlns:cx="http://schemas.microsoft.com/office/drawing/2014/chartex" xmlns:cx1="http://schemas.microsoft.com/office/drawing/2015/9/8/chartex" xmlns:cx2="http://schemas.microsoft.com/office/drawing/2015/10/21/chartex" xmlns:cx3="http://schemas.microsoft.com/office/drawing/2016/5/9/chartex" xmlns:cx4="http://schemas.microsoft.com/office/drawing/2016/5/10/chartex" xmlns:cx5="http://schemas.microsoft.com/office/drawing/2016/5/11/chartex" xmlns:cx6="http://schemas.microsoft.com/office/drawing/2016/5/12/chartex" xmlns:cx7="http://schemas.microsoft.com/office/drawing/2016/5/13/chartex" xmlns:cx8="http://schemas.microsoft.com/office/drawing/2016/5/14/chartex" xmlns:mc="http://schemas.openxmlformats.org/markup-compatibility/2006" xmlns:m="http://schemas.openxmlformats.org/officeDocument/2006/math" xmlns:aink="http://schemas.microsoft.com/office/drawing/2016/ink" xmlns:am3d="http://schemas.microsoft.com/office/drawing/2017/model3d" xmlns:oel="http://schemas.microsoft.com/office/2019/extlst" xmlns:r="http://schemas.openxmlformats.org/officeDocument/2006/relationships" xmlns:wp14="http://schemas.microsoft.com/office/word/2010/wordprocessingDrawing" xmlns:wp="http://schemas.openxmlformats.org/drawingml/2006/wordprocessingDrawing" xmlns:wpg="http://schemas.microsoft.com/office/word/2010/wordprocessingGroup" xmlns:wpi="http://schemas.microsoft.com/office/word/2010/wordprocessingInk" xmlns:wps="http://schemas.microsoft.com/office/word/2010/wordprocessingShape" xmlns:o="urn:schemas-microsoft-com:office:office" xmlns:v="urn:schemas-microsoft-com:vml" xmlns:w10="urn:schemas-microsoft-com:office:word" xmlns:w="http://schemas.openxmlformats.org/wordprocessingml/2006/main" xmlns:w14="http://schemas.microsoft.com/office/word/2010/wordml" xmlns:w15="http://schemas.microsoft.com/office/word/2012/wordml" xmlns:w16cex="http://schemas.microsoft.com/office/word/2018/wordml/cex" xmlns:w16cid="http://schemas.microsoft.com/office/word/2016/wordml/cid" xmlns:w16="http://schemas.microsoft.com/office/word/2018/wordml" xmlns:w16sdtdh="http://schemas.microsoft.com/office/word/2020/wordml/sdtdatahash" xmlns:w16sdtfl="http://schemas.microsoft.com/office/word/2024/wordml/sdtformatlock" xmlns:w16se="http://schemas.microsoft.com/office/word/2015/wordml/symex" xmlns:w16du="http://schemas.microsoft.com/office/word/2023/wordml/word16du" xmlns:wne="http://schemas.microsoft.com/office/word/2006/wordml" mc:Ignorable="w14 w15 w16se w16cid w16 w16cex w16sdtdh w16sdtfl w16du wp14">
+<w:footnotes xmlns:wpc="http://schemas.microsoft.com/office/word/2010/wordprocessingCanvas" xmlns:cx="http://schemas.microsoft.com/office/drawing/2014/chartex" xmlns:cx1="http://schemas.microsoft.com/office/drawing/2015/9/8/chartex" xmlns:cx2="http://schemas.microsoft.com/office/drawing/2015/10/21/chartex" xmlns:cx3="http://schemas.microsoft.com/office/drawing/2016/5/9/chartex" xmlns:cx4="http://schemas.microsoft.com/office/drawing/2016/5/10/chartex" xmlns:cx5="http://schemas.microsoft.com/office/drawing/2016/5/11/chartex" xmlns:cx6="http://schemas.microsoft.com/office/drawing/2016/5/12/chartex" xmlns:cx7="http://schemas.microsoft.com/office/drawing/2016/5/13/chartex" xmlns:cx8="http://schemas.microsoft.com/office/drawing/2016/5/14/chartex" xmlns:mc="http://schemas.openxmlformats.org/markup-compatibility/2006" xmlns:aink="http://schemas.microsoft.com/office/drawing/2016/ink" xmlns:am3d="http://schemas.microsoft.com/office/drawing/2017/model3d" xmlns:o="urn:schemas-microsoft-com:office:office" xmlns:oel="http://schemas.microsoft.com/office/2019/extlst" xmlns:r="http://schemas.openxmlformats.org/officeDocument/2006/relationships" xmlns:m="http://schemas.openxmlformats.org/officeDocument/2006/math" xmlns:v="urn:schemas-microsoft-com:vml" xmlns:wp14="http://schemas.microsoft.com/office/word/2010/wordprocessingDrawing" xmlns:wp="http://schemas.openxmlformats.org/drawingml/2006/wordprocessingDrawing" xmlns:w10="urn:schemas-microsoft-com:office:word" xmlns:w="http://schemas.openxmlformats.org/wordprocessingml/2006/main" xmlns:w14="http://schemas.microsoft.com/office/word/2010/wordml" xmlns:w15="http://schemas.microsoft.com/office/word/2012/wordml" xmlns:w16cex="http://schemas.microsoft.com/office/word/2018/wordml/cex" xmlns:w16cid="http://schemas.microsoft.com/office/word/2016/wordml/cid" xmlns:w16="http://schemas.microsoft.com/office/word/2018/wordml" xmlns:w16du="http://schemas.microsoft.com/office/word/2023/wordml/word16du" xmlns:w16sdtdh="http://schemas.microsoft.com/office/word/2020/wordml/sdtdatahash" xmlns:w16sdtfl="http://schemas.microsoft.com/office/word/2024/wordml/sdtformatlock" xmlns:w16se="http://schemas.microsoft.com/office/word/2015/wordml/symex" xmlns:wpg="http://schemas.microsoft.com/office/word/2010/wordprocessingGroup" xmlns:wpi="http://schemas.microsoft.com/office/word/2010/wordprocessingInk" xmlns:wne="http://schemas.microsoft.com/office/word/2006/wordml" xmlns:wps="http://schemas.microsoft.com/office/word/2010/wordprocessingShape" mc:Ignorable="w14 w15 w16se w16cid w16 w16cex w16sdtdh w16sdtfl w16du wp14">
   <w:footnote w:type="separator" w:id="-1">
     <w:p>
       <w:pPr>
@@ -3118,7 +3353,7 @@
 </file>
 
 <file path=word/header1.xml><?xml version="1.0" encoding="utf-8"?>
-<w:hdr xmlns:wpc="http://schemas.microsoft.com/office/word/2010/wordprocessingCanvas" xmlns:cx="http://schemas.microsoft.com/office/drawing/2014/chartex" xmlns:cx1="http://schemas.microsoft.com/office/drawing/2015/9/8/chartex" xmlns:cx2="http://schemas.microsoft.com/office/drawing/2015/10/21/chartex" xmlns:cx3="http://schemas.microsoft.com/office/drawing/2016/5/9/chartex" xmlns:cx4="http://schemas.microsoft.com/office/drawing/2016/5/10/chartex" xmlns:cx5="http://schemas.microsoft.com/office/drawing/2016/5/11/chartex" xmlns:cx6="http://schemas.microsoft.com/office/drawing/2016/5/12/chartex" xmlns:cx7="http://schemas.microsoft.com/office/drawing/2016/5/13/chartex" xmlns:cx8="http://schemas.microsoft.com/office/drawing/2016/5/14/chartex" xmlns:mc="http://schemas.openxmlformats.org/markup-compatibility/2006" xmlns:m="http://schemas.openxmlformats.org/officeDocument/2006/math" xmlns:aink="http://schemas.microsoft.com/office/drawing/2016/ink" xmlns:am3d="http://schemas.microsoft.com/office/drawing/2017/model3d" xmlns:oel="http://schemas.microsoft.com/office/2019/extlst" xmlns:r="http://schemas.openxmlformats.org/officeDocument/2006/relationships" xmlns:wp14="http://schemas.microsoft.com/office/word/2010/wordprocessingDrawing" xmlns:wp="http://schemas.openxmlformats.org/drawingml/2006/wordprocessingDrawing" xmlns:wpg="http://schemas.microsoft.com/office/word/2010/wordprocessingGroup" xmlns:wpi="http://schemas.microsoft.com/office/word/2010/wordprocessingInk" xmlns:wps="http://schemas.microsoft.com/office/word/2010/wordprocessingShape" xmlns:o="urn:schemas-microsoft-com:office:office" xmlns:v="urn:schemas-microsoft-com:vml" xmlns:w10="urn:schemas-microsoft-com:office:word" xmlns:w="http://schemas.openxmlformats.org/wordprocessingml/2006/main" xmlns:w14="http://schemas.microsoft.com/office/word/2010/wordml" xmlns:w15="http://schemas.microsoft.com/office/word/2012/wordml" xmlns:w16cex="http://schemas.microsoft.com/office/word/2018/wordml/cex" xmlns:w16cid="http://schemas.microsoft.com/office/word/2016/wordml/cid" xmlns:w16="http://schemas.microsoft.com/office/word/2018/wordml" xmlns:w16sdtdh="http://schemas.microsoft.com/office/word/2020/wordml/sdtdatahash" xmlns:w16sdtfl="http://schemas.microsoft.com/office/word/2024/wordml/sdtformatlock" xmlns:w16se="http://schemas.microsoft.com/office/word/2015/wordml/symex" xmlns:w16du="http://schemas.microsoft.com/office/word/2023/wordml/word16du" xmlns:wne="http://schemas.microsoft.com/office/word/2006/wordml" mc:Ignorable="w14 w15 w16se w16cid w16 w16cex w16sdtdh w16sdtfl w16du wp14">
+<w:hdr xmlns:wpc="http://schemas.microsoft.com/office/word/2010/wordprocessingCanvas" xmlns:cx="http://schemas.microsoft.com/office/drawing/2014/chartex" xmlns:cx1="http://schemas.microsoft.com/office/drawing/2015/9/8/chartex" xmlns:cx2="http://schemas.microsoft.com/office/drawing/2015/10/21/chartex" xmlns:cx3="http://schemas.microsoft.com/office/drawing/2016/5/9/chartex" xmlns:cx4="http://schemas.microsoft.com/office/drawing/2016/5/10/chartex" xmlns:cx5="http://schemas.microsoft.com/office/drawing/2016/5/11/chartex" xmlns:cx6="http://schemas.microsoft.com/office/drawing/2016/5/12/chartex" xmlns:cx7="http://schemas.microsoft.com/office/drawing/2016/5/13/chartex" xmlns:cx8="http://schemas.microsoft.com/office/drawing/2016/5/14/chartex" xmlns:mc="http://schemas.openxmlformats.org/markup-compatibility/2006" xmlns:aink="http://schemas.microsoft.com/office/drawing/2016/ink" xmlns:am3d="http://schemas.microsoft.com/office/drawing/2017/model3d" xmlns:o="urn:schemas-microsoft-com:office:office" xmlns:oel="http://schemas.microsoft.com/office/2019/extlst" xmlns:r="http://schemas.openxmlformats.org/officeDocument/2006/relationships" xmlns:m="http://schemas.openxmlformats.org/officeDocument/2006/math" xmlns:v="urn:schemas-microsoft-com:vml" xmlns:wp14="http://schemas.microsoft.com/office/word/2010/wordprocessingDrawing" xmlns:wp="http://schemas.openxmlformats.org/drawingml/2006/wordprocessingDrawing" xmlns:w10="urn:schemas-microsoft-com:office:word" xmlns:w="http://schemas.openxmlformats.org/wordprocessingml/2006/main" xmlns:w14="http://schemas.microsoft.com/office/word/2010/wordml" xmlns:w15="http://schemas.microsoft.com/office/word/2012/wordml" xmlns:w16cex="http://schemas.microsoft.com/office/word/2018/wordml/cex" xmlns:w16cid="http://schemas.microsoft.com/office/word/2016/wordml/cid" xmlns:w16="http://schemas.microsoft.com/office/word/2018/wordml" xmlns:w16du="http://schemas.microsoft.com/office/word/2023/wordml/word16du" xmlns:w16sdtdh="http://schemas.microsoft.com/office/word/2020/wordml/sdtdatahash" xmlns:w16sdtfl="http://schemas.microsoft.com/office/word/2024/wordml/sdtformatlock" xmlns:w16se="http://schemas.microsoft.com/office/word/2015/wordml/symex" xmlns:wpg="http://schemas.microsoft.com/office/word/2010/wordprocessingGroup" xmlns:wpi="http://schemas.microsoft.com/office/word/2010/wordprocessingInk" xmlns:wne="http://schemas.microsoft.com/office/word/2006/wordml" xmlns:wps="http://schemas.microsoft.com/office/word/2010/wordprocessingShape" mc:Ignorable="w14 w15 w16se w16cid w16 w16cex w16sdtdh w16sdtfl w16du wp14">
   <w:p>
     <w:pPr>
       <w:pStyle w:val="Header"/>
@@ -3129,7 +3364,7 @@
 </file>
 
 <file path=word/numbering.xml><?xml version="1.0" encoding="utf-8"?>
-<w:numbering xmlns:wpc="http://schemas.microsoft.com/office/word/2010/wordprocessingCanvas" xmlns:cx="http://schemas.microsoft.com/office/drawing/2014/chartex" xmlns:cx1="http://schemas.microsoft.com/office/drawing/2015/9/8/chartex" xmlns:cx2="http://schemas.microsoft.com/office/drawing/2015/10/21/chartex" xmlns:cx3="http://schemas.microsoft.com/office/drawing/2016/5/9/chartex" xmlns:cx4="http://schemas.microsoft.com/office/drawing/2016/5/10/chartex" xmlns:cx5="http://schemas.microsoft.com/office/drawing/2016/5/11/chartex" xmlns:cx6="http://schemas.microsoft.com/office/drawing/2016/5/12/chartex" xmlns:cx7="http://schemas.microsoft.com/office/drawing/2016/5/13/chartex" xmlns:cx8="http://schemas.microsoft.com/office/drawing/2016/5/14/chartex" xmlns:mc="http://schemas.openxmlformats.org/markup-compatibility/2006" xmlns:m="http://schemas.openxmlformats.org/officeDocument/2006/math" xmlns:aink="http://schemas.microsoft.com/office/drawing/2016/ink" xmlns:am3d="http://schemas.microsoft.com/office/drawing/2017/model3d" xmlns:oel="http://schemas.microsoft.com/office/2019/extlst" xmlns:r="http://schemas.openxmlformats.org/officeDocument/2006/relationships" xmlns:wp14="http://schemas.microsoft.com/office/word/2010/wordprocessingDrawing" xmlns:wp="http://schemas.openxmlformats.org/drawingml/2006/wordprocessingDrawing" xmlns:wpg="http://schemas.microsoft.com/office/word/2010/wordprocessingGroup" xmlns:wpi="http://schemas.microsoft.com/office/word/2010/wordprocessingInk" xmlns:wps="http://schemas.microsoft.com/office/word/2010/wordprocessingShape" xmlns:o="urn:schemas-microsoft-com:office:office" xmlns:v="urn:schemas-microsoft-com:vml" xmlns:w10="urn:schemas-microsoft-com:office:word" xmlns:w="http://schemas.openxmlformats.org/wordprocessingml/2006/main" xmlns:w14="http://schemas.microsoft.com/office/word/2010/wordml" xmlns:w15="http://schemas.microsoft.com/office/word/2012/wordml" xmlns:w16cex="http://schemas.microsoft.com/office/word/2018/wordml/cex" xmlns:w16cid="http://schemas.microsoft.com/office/word/2016/wordml/cid" xmlns:w16="http://schemas.microsoft.com/office/word/2018/wordml" xmlns:w16sdtdh="http://schemas.microsoft.com/office/word/2020/wordml/sdtdatahash" xmlns:w16sdtfl="http://schemas.microsoft.com/office/word/2024/wordml/sdtformatlock" xmlns:w16se="http://schemas.microsoft.com/office/word/2015/wordml/symex" xmlns:w16du="http://schemas.microsoft.com/office/word/2023/wordml/word16du" xmlns:wne="http://schemas.microsoft.com/office/word/2006/wordml" mc:Ignorable="w14 w15 w16se w16cid w16 w16cex w16sdtdh w16sdtfl w16du wp14">
+<w:numbering xmlns:wpc="http://schemas.microsoft.com/office/word/2010/wordprocessingCanvas" xmlns:cx="http://schemas.microsoft.com/office/drawing/2014/chartex" xmlns:cx1="http://schemas.microsoft.com/office/drawing/2015/9/8/chartex" xmlns:cx2="http://schemas.microsoft.com/office/drawing/2015/10/21/chartex" xmlns:cx3="http://schemas.microsoft.com/office/drawing/2016/5/9/chartex" xmlns:cx4="http://schemas.microsoft.com/office/drawing/2016/5/10/chartex" xmlns:cx5="http://schemas.microsoft.com/office/drawing/2016/5/11/chartex" xmlns:cx6="http://schemas.microsoft.com/office/drawing/2016/5/12/chartex" xmlns:cx7="http://schemas.microsoft.com/office/drawing/2016/5/13/chartex" xmlns:cx8="http://schemas.microsoft.com/office/drawing/2016/5/14/chartex" xmlns:mc="http://schemas.openxmlformats.org/markup-compatibility/2006" xmlns:aink="http://schemas.microsoft.com/office/drawing/2016/ink" xmlns:am3d="http://schemas.microsoft.com/office/drawing/2017/model3d" xmlns:o="urn:schemas-microsoft-com:office:office" xmlns:oel="http://schemas.microsoft.com/office/2019/extlst" xmlns:r="http://schemas.openxmlformats.org/officeDocument/2006/relationships" xmlns:m="http://schemas.openxmlformats.org/officeDocument/2006/math" xmlns:v="urn:schemas-microsoft-com:vml" xmlns:wp14="http://schemas.microsoft.com/office/word/2010/wordprocessingDrawing" xmlns:wp="http://schemas.openxmlformats.org/drawingml/2006/wordprocessingDrawing" xmlns:w10="urn:schemas-microsoft-com:office:word" xmlns:w="http://schemas.openxmlformats.org/wordprocessingml/2006/main" xmlns:w14="http://schemas.microsoft.com/office/word/2010/wordml" xmlns:w15="http://schemas.microsoft.com/office/word/2012/wordml" xmlns:w16cex="http://schemas.microsoft.com/office/word/2018/wordml/cex" xmlns:w16cid="http://schemas.microsoft.com/office/word/2016/wordml/cid" xmlns:w16="http://schemas.microsoft.com/office/word/2018/wordml" xmlns:w16du="http://schemas.microsoft.com/office/word/2023/wordml/word16du" xmlns:w16sdtdh="http://schemas.microsoft.com/office/word/2020/wordml/sdtdatahash" xmlns:w16sdtfl="http://schemas.microsoft.com/office/word/2024/wordml/sdtformatlock" xmlns:w16se="http://schemas.microsoft.com/office/word/2015/wordml/symex" xmlns:wpg="http://schemas.microsoft.com/office/word/2010/wordprocessingGroup" xmlns:wpi="http://schemas.microsoft.com/office/word/2010/wordprocessingInk" xmlns:wne="http://schemas.microsoft.com/office/word/2006/wordml" xmlns:wps="http://schemas.microsoft.com/office/word/2010/wordprocessingShape" mc:Ignorable="w14 w15 w16se w16cid w16 w16cex w16sdtdh w16sdtfl w16du wp14">
   <w:abstractNum w:abstractNumId="0" w15:restartNumberingAfterBreak="0">
     <w:nsid w:val="FFFFFF7C"/>
     <w:multiLevelType w:val="singleLevel"/>
@@ -3332,7 +3567,7 @@
 </file>
 
 <file path=word/styles.xml><?xml version="1.0" encoding="utf-8"?>
-<w:styles xmlns:mc="http://schemas.openxmlformats.org/markup-compatibility/2006" xmlns:r="http://schemas.openxmlformats.org/officeDocument/2006/relationships" xmlns:w="http://schemas.openxmlformats.org/wordprocessingml/2006/main" xmlns:w14="http://schemas.microsoft.com/office/word/2010/wordml" xmlns:w15="http://schemas.microsoft.com/office/word/2012/wordml" xmlns:w16cex="http://schemas.microsoft.com/office/word/2018/wordml/cex" xmlns:w16cid="http://schemas.microsoft.com/office/word/2016/wordml/cid" xmlns:w16="http://schemas.microsoft.com/office/word/2018/wordml" xmlns:w16sdtdh="http://schemas.microsoft.com/office/word/2020/wordml/sdtdatahash" xmlns:w16sdtfl="http://schemas.microsoft.com/office/word/2024/wordml/sdtformatlock" xmlns:w16se="http://schemas.microsoft.com/office/word/2015/wordml/symex" xmlns:w16du="http://schemas.microsoft.com/office/word/2023/wordml/word16du" mc:Ignorable="w14 w15 w16se w16cid w16 w16cex w16sdtdh w16sdtfl w16du">
+<w:styles xmlns:mc="http://schemas.openxmlformats.org/markup-compatibility/2006" xmlns:r="http://schemas.openxmlformats.org/officeDocument/2006/relationships" xmlns:w="http://schemas.openxmlformats.org/wordprocessingml/2006/main" xmlns:w14="http://schemas.microsoft.com/office/word/2010/wordml" xmlns:w15="http://schemas.microsoft.com/office/word/2012/wordml" xmlns:w16cex="http://schemas.microsoft.com/office/word/2018/wordml/cex" xmlns:w16cid="http://schemas.microsoft.com/office/word/2016/wordml/cid" xmlns:w16="http://schemas.microsoft.com/office/word/2018/wordml" xmlns:w16du="http://schemas.microsoft.com/office/word/2023/wordml/word16du" xmlns:w16sdtdh="http://schemas.microsoft.com/office/word/2020/wordml/sdtdatahash" xmlns:w16sdtfl="http://schemas.microsoft.com/office/word/2024/wordml/sdtformatlock" xmlns:w16se="http://schemas.microsoft.com/office/word/2015/wordml/symex" mc:Ignorable="w14 w15 w16se w16cid w16 w16cex w16sdtdh w16sdtfl w16du">
   <w:docDefaults>
     <w:rPrDefault>
       <w:rPr>
@@ -15076,7 +15311,7 @@
     <w:rPr>
       <w:rFonts w:ascii="Times New Roman" w:eastAsia="Times New Roman" w:hAnsi="Times New Roman" w:cs="Times New Roman"/>
       <w:szCs w:val="24"/>
-      <w:lang w:val="en-MT" w:eastAsia="en-GB"/>
+      <w:lang w:eastAsia="en-GB"/>
     </w:rPr>
   </w:style>
   <w:style w:type="table" w:styleId="PlainTable1">
@@ -15475,4 +15710,10 @@
     <ds:schemaRef ds:uri="http://schemas.openxmlformats.org/officeDocument/2006/bibliography"/>
   </ds:schemaRefs>
 </ds:datastoreItem>
+</file>
+
+<file path=docMetadata/LabelInfo.xml><?xml version="1.0" encoding="utf-8"?>
+<clbl:labelList xmlns:clbl="http://schemas.microsoft.com/office/2020/mipLabelMetadata">
+  <clbl:label id="{95653b52-df9b-47d2-8549-8de78ac04e21}" enabled="1" method="Standard" siteId="{deff24bb-2089-4400-8c8e-f71e680378b2}" contentBits="0" removed="0"/>
+</clbl:labelList>
 </file>
</xml_diff>